<commit_message>
docs(contexto): añade guía para el uso de Claude Code en el repositorio
</commit_message>
<xml_diff>
--- a/Fase 1/Evidencias Grupales/1.4_APT122_FormativaFase1.docx
+++ b/Fase 1/Evidencias Grupales/1.4_APT122_FormativaFase1.docx
@@ -6563,14 +6563,16 @@
             </w:pPr>
             <w:r>
               <w:rPr>
-                <w:rFonts w:eastAsiaTheme="minorEastAsia"/>
+                <w:rFonts w:eastAsiaTheme="minorEastAsia" w:ascii="Calibri" w:hAnsi="Calibri" w:eastAsia="Calibri" w:cs="Calibri"/>
+                <w:sz w:val="24"/>
                 <w:lang w:val="es-CL" w:eastAsia="es-CL"/>
               </w:rPr>
               <w:t>DUOC UC</w:t>
             </w:r>
             <w:r>
               <w:rPr>
-                <w:rFonts w:eastAsiaTheme="minorEastAsia"/>
+                <w:rFonts w:eastAsiaTheme="minorEastAsia" w:ascii="Calibri" w:hAnsi="Calibri" w:eastAsia="Calibri" w:cs="Calibri"/>
+                <w:sz w:val="24"/>
                 <w:lang w:val="es-CL" w:eastAsia="es-CL"/>
               </w:rPr>
               <w:br/>
@@ -6578,7 +6580,8 @@
             </w:r>
             <w:r>
               <w:rPr>
-                <w:rFonts w:eastAsiaTheme="minorEastAsia"/>
+                <w:rFonts w:eastAsiaTheme="minorEastAsia" w:ascii="Calibri" w:hAnsi="Calibri" w:eastAsia="Calibri" w:cs="Calibri"/>
+                <w:sz w:val="24"/>
                 <w:lang w:val="es-CL" w:eastAsia="es-CL"/>
               </w:rPr>
               <w:br/>
@@ -6594,29 +6597,32 @@
             </w:pPr>
             <w:r>
               <w:rPr>
+                <w:rFonts w:eastAsiaTheme="minorEastAsia" w:ascii="Calibri" w:hAnsi="Calibri" w:eastAsia="Calibri" w:cs="Calibri"/>
+                <w:sz w:val="24"/>
+                <w:lang w:val="es-CL" w:eastAsia="es-CL"/>
+              </w:rPr>
+              <w:t>ALLOXENTRIC REAL TIME AGENT</w:t>
+            </w:r>
+          </w:p>
+          <w:p>
+            <w:pPr>
+              <w:rPr>
                 <w:rFonts w:eastAsiaTheme="minorEastAsia"/>
                 <w:lang w:val="es-CL" w:eastAsia="es-CL"/>
               </w:rPr>
-              <w:t>ALLOXENTRIC REAL TIME AGENT</w:t>
-            </w:r>
-          </w:p>
-          <w:p>
-            <w:pPr>
-              <w:rPr>
-                <w:rFonts w:eastAsiaTheme="minorEastAsia"/>
-                <w:lang w:val="es-CL" w:eastAsia="es-CL"/>
-              </w:rPr>
-            </w:pPr>
-            <w:r>
-              <w:rPr>
-                <w:rFonts w:eastAsiaTheme="minorEastAsia"/>
+            </w:pPr>
+            <w:r>
+              <w:rPr>
+                <w:rFonts w:eastAsiaTheme="minorEastAsia" w:ascii="Calibri" w:hAnsi="Calibri" w:eastAsia="Calibri" w:cs="Calibri"/>
+                <w:sz w:val="24"/>
                 <w:lang w:val="es-CL" w:eastAsia="es-CL"/>
               </w:rPr>
               <w:t>Informe de definición del Proyecto APT</w:t>
             </w:r>
             <w:r>
               <w:rPr>
-                <w:rFonts w:eastAsiaTheme="minorEastAsia"/>
+                <w:rFonts w:eastAsiaTheme="minorEastAsia" w:ascii="Calibri" w:hAnsi="Calibri" w:eastAsia="Calibri" w:cs="Calibri"/>
+                <w:sz w:val="24"/>
                 <w:lang w:val="es-CL" w:eastAsia="es-CL"/>
               </w:rPr>
               <w:br/>
@@ -6632,7 +6638,8 @@
             </w:pPr>
             <w:r>
               <w:rPr>
-                <w:rFonts w:eastAsiaTheme="minorEastAsia"/>
+                <w:rFonts w:eastAsiaTheme="minorEastAsia" w:ascii="Calibri" w:hAnsi="Calibri" w:eastAsia="Calibri" w:cs="Calibri"/>
+                <w:sz w:val="24"/>
                 <w:lang w:val="es-CL" w:eastAsia="es-CL"/>
               </w:rPr>
               <w:t xml:space="preserve">Asignatura: </w:t>
@@ -6640,7 +6647,8 @@
             <w:proofErr w:type="spellStart"/>
             <w:r>
               <w:rPr>
-                <w:rFonts w:eastAsiaTheme="minorEastAsia"/>
+                <w:rFonts w:eastAsiaTheme="minorEastAsia" w:ascii="Calibri" w:hAnsi="Calibri" w:eastAsia="Calibri" w:cs="Calibri"/>
+                <w:sz w:val="24"/>
                 <w:lang w:val="es-CL" w:eastAsia="es-CL"/>
               </w:rPr>
               <w:t>Capstone</w:t>
@@ -6648,7 +6656,8 @@
             <w:proofErr w:type="spellEnd"/>
             <w:r>
               <w:rPr>
-                <w:rFonts w:eastAsiaTheme="minorEastAsia"/>
+                <w:rFonts w:eastAsiaTheme="minorEastAsia" w:ascii="Calibri" w:hAnsi="Calibri" w:eastAsia="Calibri" w:cs="Calibri"/>
+                <w:sz w:val="24"/>
                 <w:lang w:val="es-CL" w:eastAsia="es-CL"/>
               </w:rPr>
               <w:br/>
@@ -6656,29 +6665,32 @@
             </w:r>
             <w:r>
               <w:rPr>
+                <w:rFonts w:eastAsiaTheme="minorEastAsia" w:ascii="Calibri" w:hAnsi="Calibri" w:eastAsia="Calibri" w:cs="Calibri"/>
+                <w:sz w:val="24"/>
+                <w:lang w:val="es-CL" w:eastAsia="es-CL"/>
+              </w:rPr>
+              <w:t>001V</w:t>
+            </w:r>
+          </w:p>
+          <w:p>
+            <w:pPr>
+              <w:rPr>
                 <w:rFonts w:eastAsiaTheme="minorEastAsia"/>
                 <w:lang w:val="es-CL" w:eastAsia="es-CL"/>
               </w:rPr>
-              <w:t>001V</w:t>
-            </w:r>
-          </w:p>
-          <w:p>
-            <w:pPr>
-              <w:rPr>
-                <w:rFonts w:eastAsiaTheme="minorEastAsia"/>
-                <w:lang w:val="es-CL" w:eastAsia="es-CL"/>
-              </w:rPr>
-            </w:pPr>
-            <w:r>
-              <w:rPr>
-                <w:rFonts w:eastAsiaTheme="minorEastAsia"/>
+            </w:pPr>
+            <w:r>
+              <w:rPr>
+                <w:rFonts w:eastAsiaTheme="minorEastAsia" w:ascii="Calibri" w:hAnsi="Calibri" w:eastAsia="Calibri" w:cs="Calibri"/>
+                <w:sz w:val="24"/>
                 <w:lang w:val="es-CL" w:eastAsia="es-CL"/>
               </w:rPr>
               <w:t>Integrantes:</w:t>
             </w:r>
             <w:r>
               <w:rPr>
-                <w:rFonts w:eastAsiaTheme="minorEastAsia"/>
+                <w:rFonts w:eastAsiaTheme="minorEastAsia" w:ascii="Calibri" w:hAnsi="Calibri" w:eastAsia="Calibri" w:cs="Calibri"/>
+                <w:sz w:val="24"/>
                 <w:lang w:val="es-CL" w:eastAsia="es-CL"/>
               </w:rPr>
               <w:br/>
@@ -6686,7 +6698,8 @@
             </w:r>
             <w:r>
               <w:rPr>
-                <w:rFonts w:eastAsiaTheme="minorEastAsia"/>
+                <w:rFonts w:eastAsiaTheme="minorEastAsia" w:ascii="Calibri" w:hAnsi="Calibri" w:eastAsia="Calibri" w:cs="Calibri"/>
+                <w:sz w:val="24"/>
                 <w:lang w:val="es-CL" w:eastAsia="es-CL"/>
               </w:rPr>
               <w:br/>
@@ -6694,7 +6707,8 @@
             </w:r>
             <w:r>
               <w:rPr>
-                <w:rFonts w:eastAsiaTheme="minorEastAsia"/>
+                <w:rFonts w:eastAsiaTheme="minorEastAsia" w:ascii="Calibri" w:hAnsi="Calibri" w:eastAsia="Calibri" w:cs="Calibri"/>
+                <w:sz w:val="24"/>
                 <w:lang w:val="es-CL" w:eastAsia="es-CL"/>
               </w:rPr>
               <w:br/>
@@ -6710,22 +6724,24 @@
             </w:pPr>
             <w:r>
               <w:rPr>
+                <w:rFonts w:eastAsiaTheme="minorEastAsia" w:ascii="Calibri" w:hAnsi="Calibri" w:eastAsia="Calibri" w:cs="Calibri"/>
+                <w:sz w:val="24"/>
+                <w:lang w:val="es-CL" w:eastAsia="es-CL"/>
+              </w:rPr>
+              <w:t>Docente: Luis Bravo Yáñez</w:t>
+            </w:r>
+          </w:p>
+          <w:p>
+            <w:pPr>
+              <w:rPr>
                 <w:rFonts w:eastAsiaTheme="minorEastAsia"/>
                 <w:lang w:val="es-CL" w:eastAsia="es-CL"/>
               </w:rPr>
-              <w:t>Docente: Luis Bravo Yáñez</w:t>
-            </w:r>
-          </w:p>
-          <w:p>
-            <w:pPr>
-              <w:rPr>
-                <w:rFonts w:eastAsiaTheme="minorEastAsia"/>
-                <w:lang w:val="es-CL" w:eastAsia="es-CL"/>
-              </w:rPr>
-            </w:pPr>
-            <w:r>
-              <w:rPr>
-                <w:rFonts w:eastAsiaTheme="minorEastAsia"/>
+            </w:pPr>
+            <w:r>
+              <w:rPr>
+                <w:rFonts w:eastAsiaTheme="minorEastAsia" w:ascii="Calibri" w:hAnsi="Calibri" w:eastAsia="Calibri" w:cs="Calibri"/>
+                <w:sz w:val="24"/>
                 <w:lang w:val="es-CL" w:eastAsia="es-CL"/>
               </w:rPr>
               <w:t>12 de septiembre de 2026</w:t>
@@ -6772,7 +6788,8 @@
             </w:pPr>
             <w:r>
               <w:rPr>
-                <w:rFonts w:asciiTheme="minorHAnsi" w:eastAsiaTheme="minorEastAsia" w:hAnsiTheme="minorHAnsi" w:cstheme="minorBidi"/>
+                <w:rFonts w:asciiTheme="minorHAnsi" w:eastAsiaTheme="minorEastAsia" w:hAnsiTheme="minorHAnsi" w:cstheme="minorBidi" w:ascii="Calibri" w:hAnsi="Calibri" w:eastAsia="Calibri" w:cs="Calibri"/>
+                <w:sz w:val="24"/>
                 <w:lang w:val="es-CL" w:eastAsia="es-CL"/>
               </w:rPr>
               <w:t>ÍNDICE</w:t>
@@ -6791,7 +6808,8 @@
             </w:pPr>
             <w:r>
               <w:rPr>
-                <w:rFonts w:asciiTheme="minorHAnsi" w:eastAsiaTheme="minorEastAsia" w:hAnsiTheme="minorHAnsi" w:cstheme="minorBidi"/>
+                <w:rFonts w:asciiTheme="minorHAnsi" w:eastAsiaTheme="minorEastAsia" w:hAnsiTheme="minorHAnsi" w:cstheme="minorBidi" w:ascii="Calibri" w:hAnsi="Calibri" w:eastAsia="Calibri" w:cs="Calibri"/>
+                <w:sz w:val="24"/>
                 <w:lang w:val="es-CL" w:eastAsia="es-CL"/>
               </w:rPr>
               <w:t>Resumen del proyecto</w:t>
@@ -6810,7 +6828,8 @@
             </w:pPr>
             <w:r>
               <w:rPr>
-                <w:rFonts w:asciiTheme="minorHAnsi" w:eastAsiaTheme="minorEastAsia" w:hAnsiTheme="minorHAnsi" w:cstheme="minorBidi"/>
+                <w:rFonts w:asciiTheme="minorHAnsi" w:eastAsiaTheme="minorEastAsia" w:hAnsiTheme="minorHAnsi" w:cstheme="minorBidi" w:ascii="Calibri" w:hAnsi="Calibri" w:eastAsia="Calibri" w:cs="Calibri"/>
+                <w:sz w:val="24"/>
                 <w:lang w:val="es-CL" w:eastAsia="es-CL"/>
               </w:rPr>
               <w:t>Descripción del proyecto y justificación de su relevancia</w:t>
@@ -6829,7 +6848,8 @@
             </w:pPr>
             <w:r>
               <w:rPr>
-                <w:rFonts w:asciiTheme="minorHAnsi" w:eastAsiaTheme="minorEastAsia" w:hAnsiTheme="minorHAnsi" w:cstheme="minorBidi"/>
+                <w:rFonts w:asciiTheme="minorHAnsi" w:eastAsiaTheme="minorEastAsia" w:hAnsiTheme="minorHAnsi" w:cstheme="minorBidi" w:ascii="Calibri" w:hAnsi="Calibri" w:eastAsia="Calibri" w:cs="Calibri"/>
+                <w:sz w:val="24"/>
                 <w:lang w:val="es-CL" w:eastAsia="es-CL"/>
               </w:rPr>
               <w:t>Relación con las competencias del perfil de egreso</w:t>
@@ -6848,7 +6868,8 @@
             </w:pPr>
             <w:r>
               <w:rPr>
-                <w:rFonts w:asciiTheme="minorHAnsi" w:eastAsiaTheme="minorEastAsia" w:hAnsiTheme="minorHAnsi" w:cstheme="minorBidi"/>
+                <w:rFonts w:asciiTheme="minorHAnsi" w:eastAsiaTheme="minorEastAsia" w:hAnsiTheme="minorHAnsi" w:cstheme="minorBidi" w:ascii="Calibri" w:hAnsi="Calibri" w:eastAsia="Calibri" w:cs="Calibri"/>
+                <w:sz w:val="24"/>
                 <w:lang w:val="es-CL" w:eastAsia="es-CL"/>
               </w:rPr>
               <w:t>Relación con los intereses profesionales del equipo</w:t>
@@ -6867,7 +6888,8 @@
             </w:pPr>
             <w:r>
               <w:rPr>
-                <w:rFonts w:asciiTheme="minorHAnsi" w:eastAsiaTheme="minorEastAsia" w:hAnsiTheme="minorHAnsi" w:cstheme="minorBidi"/>
+                <w:rFonts w:asciiTheme="minorHAnsi" w:eastAsiaTheme="minorEastAsia" w:hAnsiTheme="minorHAnsi" w:cstheme="minorBidi" w:ascii="Calibri" w:hAnsi="Calibri" w:eastAsia="Calibri" w:cs="Calibri"/>
+                <w:sz w:val="24"/>
                 <w:lang w:val="es-CL" w:eastAsia="es-CL"/>
               </w:rPr>
               <w:t>Factibilidad de desarrollo</w:t>
@@ -6886,7 +6908,8 @@
             </w:pPr>
             <w:r>
               <w:rPr>
-                <w:rFonts w:asciiTheme="minorHAnsi" w:eastAsiaTheme="minorEastAsia" w:hAnsiTheme="minorHAnsi" w:cstheme="minorBidi"/>
+                <w:rFonts w:asciiTheme="minorHAnsi" w:eastAsiaTheme="minorEastAsia" w:hAnsiTheme="minorHAnsi" w:cstheme="minorBidi" w:ascii="Calibri" w:hAnsi="Calibri" w:eastAsia="Calibri" w:cs="Calibri"/>
+                <w:sz w:val="24"/>
                 <w:lang w:val="es-CL" w:eastAsia="es-CL"/>
               </w:rPr>
               <w:t>Indicadores de calidad y evidencias previstas</w:t>
@@ -6905,7 +6928,8 @@
             </w:pPr>
             <w:r>
               <w:rPr>
-                <w:rFonts w:asciiTheme="minorHAnsi" w:eastAsiaTheme="minorEastAsia" w:hAnsiTheme="minorHAnsi" w:cstheme="minorBidi"/>
+                <w:rFonts w:asciiTheme="minorHAnsi" w:eastAsiaTheme="minorEastAsia" w:hAnsiTheme="minorHAnsi" w:cstheme="minorBidi" w:ascii="Calibri" w:hAnsi="Calibri" w:eastAsia="Calibri" w:cs="Calibri"/>
+                <w:sz w:val="24"/>
                 <w:lang w:val="es-CL" w:eastAsia="es-CL"/>
               </w:rPr>
               <w:t>Conclusiones individuales</w:t>
@@ -6924,7 +6948,8 @@
             </w:pPr>
             <w:r>
               <w:rPr>
-                <w:rFonts w:asciiTheme="minorHAnsi" w:eastAsiaTheme="minorEastAsia" w:hAnsiTheme="minorHAnsi" w:cstheme="minorBidi"/>
+                <w:rFonts w:asciiTheme="minorHAnsi" w:eastAsiaTheme="minorEastAsia" w:hAnsiTheme="minorHAnsi" w:cstheme="minorBidi" w:ascii="Calibri" w:hAnsi="Calibri" w:eastAsia="Calibri" w:cs="Calibri"/>
+                <w:sz w:val="24"/>
                 <w:lang w:val="es-CL" w:eastAsia="es-CL"/>
               </w:rPr>
               <w:t>Reflexiones individuales</w:t>
@@ -6943,7 +6968,8 @@
             </w:pPr>
             <w:r>
               <w:rPr>
-                <w:rFonts w:asciiTheme="minorHAnsi" w:eastAsiaTheme="minorEastAsia" w:hAnsiTheme="minorHAnsi" w:cstheme="minorBidi"/>
+                <w:rFonts w:asciiTheme="minorHAnsi" w:eastAsiaTheme="minorEastAsia" w:hAnsiTheme="minorHAnsi" w:cstheme="minorBidi" w:ascii="Calibri" w:hAnsi="Calibri" w:eastAsia="Calibri" w:cs="Calibri"/>
+                <w:sz w:val="24"/>
                 <w:lang w:val="es-CL" w:eastAsia="es-CL"/>
               </w:rPr>
               <w:t>Referencias</w:t>
@@ -7042,7 +7068,8 @@
             </w:pPr>
             <w:r>
               <w:rPr>
-                <w:rFonts w:asciiTheme="minorHAnsi" w:eastAsiaTheme="minorEastAsia" w:hAnsiTheme="minorHAnsi" w:cstheme="minorBidi"/>
+                <w:rFonts w:asciiTheme="minorHAnsi" w:eastAsiaTheme="minorEastAsia" w:hAnsiTheme="minorHAnsi" w:cstheme="minorBidi" w:ascii="Calibri" w:hAnsi="Calibri" w:eastAsia="Calibri" w:cs="Calibri"/>
+                <w:sz w:val="24"/>
                 <w:lang w:val="es-CL" w:eastAsia="es-CL"/>
               </w:rPr>
               <w:t>Resumen del proyecto</w:t>
@@ -7057,7 +7084,8 @@
             </w:pPr>
             <w:r>
               <w:rPr>
-                <w:rFonts w:asciiTheme="minorHAnsi" w:eastAsiaTheme="minorEastAsia" w:hAnsiTheme="minorHAnsi" w:cstheme="minorBidi"/>
+                <w:rFonts w:asciiTheme="minorHAnsi" w:eastAsiaTheme="minorEastAsia" w:hAnsiTheme="minorHAnsi" w:cstheme="minorBidi" w:ascii="Calibri" w:hAnsi="Calibri" w:eastAsia="Calibri" w:cs="Calibri"/>
+                <w:sz w:val="24"/>
                 <w:lang w:val="es-CL" w:eastAsia="es-CL"/>
               </w:rPr>
               <w:t xml:space="preserve">Alloxentric Real Time Agent es un proyecto de </w:t>
@@ -7065,7 +7093,8 @@
             <w:proofErr w:type="spellStart"/>
             <w:r>
               <w:rPr>
-                <w:rFonts w:asciiTheme="minorHAnsi" w:eastAsiaTheme="minorEastAsia" w:hAnsiTheme="minorHAnsi" w:cstheme="minorBidi"/>
+                <w:rFonts w:asciiTheme="minorHAnsi" w:eastAsiaTheme="minorEastAsia" w:hAnsiTheme="minorHAnsi" w:cstheme="minorBidi" w:ascii="Calibri" w:hAnsi="Calibri" w:eastAsia="Calibri" w:cs="Calibri"/>
+                <w:sz w:val="24"/>
                 <w:lang w:val="es-CL" w:eastAsia="es-CL"/>
               </w:rPr>
               <w:t>Capstone</w:t>
@@ -7073,7 +7102,8 @@
             <w:proofErr w:type="spellEnd"/>
             <w:r>
               <w:rPr>
-                <w:rFonts w:asciiTheme="minorHAnsi" w:eastAsiaTheme="minorEastAsia" w:hAnsiTheme="minorHAnsi" w:cstheme="minorBidi"/>
+                <w:rFonts w:asciiTheme="minorHAnsi" w:eastAsiaTheme="minorEastAsia" w:hAnsiTheme="minorHAnsi" w:cstheme="minorBidi" w:ascii="Calibri" w:hAnsi="Calibri" w:eastAsia="Calibri" w:cs="Calibri"/>
+                <w:sz w:val="24"/>
                 <w:lang w:val="es-CL" w:eastAsia="es-CL"/>
               </w:rPr>
               <w:t xml:space="preserve"> de Ingeniería en Informática de Duoc UC, sede Plaza Oeste, desarrollado por Juan Díaz, Fernando Olguea y David Sepúlveda. Su propósito es construir y evaluar un prototipo de </w:t>
@@ -7081,7 +7111,8 @@
             <w:proofErr w:type="spellStart"/>
             <w:r>
               <w:rPr>
-                <w:rFonts w:asciiTheme="minorHAnsi" w:eastAsiaTheme="minorEastAsia" w:hAnsiTheme="minorHAnsi" w:cstheme="minorBidi"/>
+                <w:rFonts w:asciiTheme="minorHAnsi" w:eastAsiaTheme="minorEastAsia" w:hAnsiTheme="minorHAnsi" w:cstheme="minorBidi" w:ascii="Calibri" w:hAnsi="Calibri" w:eastAsia="Calibri" w:cs="Calibri"/>
+                <w:sz w:val="24"/>
                 <w:lang w:val="es-CL" w:eastAsia="es-CL"/>
               </w:rPr>
               <w:t>bot</w:t>
@@ -7089,7 +7120,8 @@
             <w:proofErr w:type="spellEnd"/>
             <w:r>
               <w:rPr>
-                <w:rFonts w:asciiTheme="minorHAnsi" w:eastAsiaTheme="minorEastAsia" w:hAnsiTheme="minorHAnsi" w:cstheme="minorBidi"/>
+                <w:rFonts w:asciiTheme="minorHAnsi" w:eastAsiaTheme="minorEastAsia" w:hAnsiTheme="minorHAnsi" w:cstheme="minorBidi" w:ascii="Calibri" w:hAnsi="Calibri" w:eastAsia="Calibri" w:cs="Calibri"/>
+                <w:sz w:val="24"/>
                 <w:lang w:val="es-CL" w:eastAsia="es-CL"/>
               </w:rPr>
               <w:t xml:space="preserve"> de cobranza por voz para comparar su costo y efectividad por llamada con la solución actual de Alloxentric.</w:t>
@@ -7104,7 +7136,8 @@
             </w:pPr>
             <w:r>
               <w:rPr>
-                <w:rFonts w:asciiTheme="minorHAnsi" w:eastAsiaTheme="minorEastAsia" w:hAnsiTheme="minorHAnsi" w:cstheme="minorBidi"/>
+                <w:rFonts w:asciiTheme="minorHAnsi" w:eastAsiaTheme="minorEastAsia" w:hAnsiTheme="minorHAnsi" w:cstheme="minorBidi" w:ascii="Calibri" w:hAnsi="Calibri" w:eastAsia="Calibri" w:cs="Calibri"/>
+                <w:sz w:val="24"/>
                 <w:lang w:val="es-CL" w:eastAsia="es-CL"/>
               </w:rPr>
               <w:t>[CONFIRMADO] Según las indicaciones de Max Kreimerman, dueño de Alloxentric, en la reunión inicial del 2 de septiembre de 2026, la infraestructura actual está optimizada para operar a gran escala, pero presenta poca elasticidad de costos cuando disminuye el volumen de llamadas. La empresa busca evaluar una alternativa que permita atender escenarios de menor demanda manteniendo una calidad de interacción aceptable.</w:t>
@@ -7119,7 +7152,8 @@
             </w:pPr>
             <w:r>
               <w:rPr>
-                <w:rFonts w:asciiTheme="minorHAnsi" w:eastAsiaTheme="minorEastAsia" w:hAnsiTheme="minorHAnsi" w:cstheme="minorBidi"/>
+                <w:rFonts w:asciiTheme="minorHAnsi" w:eastAsiaTheme="minorEastAsia" w:hAnsiTheme="minorHAnsi" w:cstheme="minorBidi" w:ascii="Calibri" w:hAnsi="Calibri" w:eastAsia="Calibri" w:cs="Calibri"/>
+                <w:sz w:val="24"/>
                 <w:lang w:val="es-CL" w:eastAsia="es-CL"/>
               </w:rPr>
               <w:t xml:space="preserve">El prototipo utilizará </w:t>
@@ -7127,7 +7161,8 @@
             <w:proofErr w:type="spellStart"/>
             <w:r>
               <w:rPr>
-                <w:rFonts w:asciiTheme="minorHAnsi" w:eastAsiaTheme="minorEastAsia" w:hAnsiTheme="minorHAnsi" w:cstheme="minorBidi"/>
+                <w:rFonts w:asciiTheme="minorHAnsi" w:eastAsiaTheme="minorEastAsia" w:hAnsiTheme="minorHAnsi" w:cstheme="minorBidi" w:ascii="Calibri" w:hAnsi="Calibri" w:eastAsia="Calibri" w:cs="Calibri"/>
+                <w:sz w:val="24"/>
                 <w:lang w:val="es-CL" w:eastAsia="es-CL"/>
               </w:rPr>
               <w:t>LiveKit</w:t>
@@ -7135,7 +7170,8 @@
             <w:proofErr w:type="spellEnd"/>
             <w:r>
               <w:rPr>
-                <w:rFonts w:asciiTheme="minorHAnsi" w:eastAsiaTheme="minorEastAsia" w:hAnsiTheme="minorHAnsi" w:cstheme="minorBidi"/>
+                <w:rFonts w:asciiTheme="minorHAnsi" w:eastAsiaTheme="minorEastAsia" w:hAnsiTheme="minorHAnsi" w:cstheme="minorBidi" w:ascii="Calibri" w:hAnsi="Calibri" w:eastAsia="Calibri" w:cs="Calibri"/>
+                <w:sz w:val="24"/>
                 <w:lang w:val="es-CL" w:eastAsia="es-CL"/>
               </w:rPr>
               <w:t xml:space="preserve">, </w:t>
@@ -7143,7 +7179,8 @@
             <w:proofErr w:type="spellStart"/>
             <w:r>
               <w:rPr>
-                <w:rFonts w:asciiTheme="minorHAnsi" w:eastAsiaTheme="minorEastAsia" w:hAnsiTheme="minorHAnsi" w:cstheme="minorBidi"/>
+                <w:rFonts w:asciiTheme="minorHAnsi" w:eastAsiaTheme="minorEastAsia" w:hAnsiTheme="minorHAnsi" w:cstheme="minorBidi" w:ascii="Calibri" w:hAnsi="Calibri" w:eastAsia="Calibri" w:cs="Calibri"/>
+                <w:sz w:val="24"/>
                 <w:lang w:val="es-CL" w:eastAsia="es-CL"/>
               </w:rPr>
               <w:t>Speechmatics</w:t>
@@ -7151,7 +7188,8 @@
             <w:proofErr w:type="spellEnd"/>
             <w:r>
               <w:rPr>
-                <w:rFonts w:asciiTheme="minorHAnsi" w:eastAsiaTheme="minorEastAsia" w:hAnsiTheme="minorHAnsi" w:cstheme="minorBidi"/>
+                <w:rFonts w:asciiTheme="minorHAnsi" w:eastAsiaTheme="minorEastAsia" w:hAnsiTheme="minorHAnsi" w:cstheme="minorBidi" w:ascii="Calibri" w:hAnsi="Calibri" w:eastAsia="Calibri" w:cs="Calibri"/>
+                <w:sz w:val="24"/>
                 <w:lang w:val="es-CL" w:eastAsia="es-CL"/>
               </w:rPr>
               <w:t xml:space="preserve"> para transcripción de voz a texto, </w:t>
@@ -7159,7 +7197,8 @@
             <w:proofErr w:type="spellStart"/>
             <w:r>
               <w:rPr>
-                <w:rFonts w:asciiTheme="minorHAnsi" w:eastAsiaTheme="minorEastAsia" w:hAnsiTheme="minorHAnsi" w:cstheme="minorBidi"/>
+                <w:rFonts w:asciiTheme="minorHAnsi" w:eastAsiaTheme="minorEastAsia" w:hAnsiTheme="minorHAnsi" w:cstheme="minorBidi" w:ascii="Calibri" w:hAnsi="Calibri" w:eastAsia="Calibri" w:cs="Calibri"/>
+                <w:sz w:val="24"/>
                 <w:lang w:val="es-CL" w:eastAsia="es-CL"/>
               </w:rPr>
               <w:t>ElevenLabs</w:t>
@@ -7167,7 +7206,8 @@
             <w:proofErr w:type="spellEnd"/>
             <w:r>
               <w:rPr>
-                <w:rFonts w:asciiTheme="minorHAnsi" w:eastAsiaTheme="minorEastAsia" w:hAnsiTheme="minorHAnsi" w:cstheme="minorBidi"/>
+                <w:rFonts w:asciiTheme="minorHAnsi" w:eastAsiaTheme="minorEastAsia" w:hAnsiTheme="minorHAnsi" w:cstheme="minorBidi" w:ascii="Calibri" w:hAnsi="Calibri" w:eastAsia="Calibri" w:cs="Calibri"/>
+                <w:sz w:val="24"/>
                 <w:lang w:val="es-CL" w:eastAsia="es-CL"/>
               </w:rPr>
               <w:t xml:space="preserve"> para síntesis de voz y la telefonía Asterisk de Alloxentric. Su comportamiento se basará inicialmente en un guion de cobranza y reconocimiento de intenciones, sin incorporar un LLM para interpretar respuestas, salvo que las pruebas justifiquen su necesidad y se acuerde con la empresa. Se evaluará una voz apropiada para el contexto chileno y el requisito de respuesta de no más de un segundo señalado por Max.</w:t>
@@ -7182,7 +7222,8 @@
             </w:pPr>
             <w:r>
               <w:rPr>
-                <w:rFonts w:asciiTheme="minorHAnsi" w:eastAsiaTheme="minorEastAsia" w:hAnsiTheme="minorHAnsi" w:cstheme="minorBidi"/>
+                <w:rFonts w:asciiTheme="minorHAnsi" w:eastAsiaTheme="minorEastAsia" w:hAnsiTheme="minorHAnsi" w:cstheme="minorBidi" w:ascii="Calibri" w:hAnsi="Calibri" w:eastAsia="Calibri" w:cs="Calibri"/>
+                <w:sz w:val="24"/>
                 <w:lang w:val="es-CL" w:eastAsia="es-CL"/>
               </w:rPr>
               <w:t xml:space="preserve">El equipo utilizará Scrum durante las 18 semanas del periodo académico. Juan Díaz será </w:t>
@@ -7190,7 +7231,8 @@
             <w:proofErr w:type="spellStart"/>
             <w:r>
               <w:rPr>
-                <w:rFonts w:asciiTheme="minorHAnsi" w:eastAsiaTheme="minorEastAsia" w:hAnsiTheme="minorHAnsi" w:cstheme="minorBidi"/>
+                <w:rFonts w:asciiTheme="minorHAnsi" w:eastAsiaTheme="minorEastAsia" w:hAnsiTheme="minorHAnsi" w:cstheme="minorBidi" w:ascii="Calibri" w:hAnsi="Calibri" w:eastAsia="Calibri" w:cs="Calibri"/>
+                <w:sz w:val="24"/>
                 <w:lang w:val="es-CL" w:eastAsia="es-CL"/>
               </w:rPr>
               <w:t>Product</w:t>
@@ -7198,7 +7240,8 @@
             <w:proofErr w:type="spellEnd"/>
             <w:r>
               <w:rPr>
-                <w:rFonts w:asciiTheme="minorHAnsi" w:eastAsiaTheme="minorEastAsia" w:hAnsiTheme="minorHAnsi" w:cstheme="minorBidi"/>
+                <w:rFonts w:asciiTheme="minorHAnsi" w:eastAsiaTheme="minorEastAsia" w:hAnsiTheme="minorHAnsi" w:cstheme="minorBidi" w:ascii="Calibri" w:hAnsi="Calibri" w:eastAsia="Calibri" w:cs="Calibri"/>
+                <w:sz w:val="24"/>
                 <w:lang w:val="es-CL" w:eastAsia="es-CL"/>
               </w:rPr>
               <w:t xml:space="preserve"> Owner y desarrollador; Fernando Olguea será líder de proyecto y desarrollador; y David Sepúlveda será Scrum Master y desarrollador. El trabajo comprenderá análisis de requerimientos, diseño, implementación, integración, pruebas y evaluación comparativa.</w:t>
@@ -7213,7 +7256,8 @@
             </w:pPr>
             <w:r>
               <w:rPr>
-                <w:rFonts w:asciiTheme="minorHAnsi" w:eastAsiaTheme="minorEastAsia" w:hAnsiTheme="minorHAnsi" w:cstheme="minorBidi"/>
+                <w:rFonts w:asciiTheme="minorHAnsi" w:eastAsiaTheme="minorEastAsia" w:hAnsiTheme="minorHAnsi" w:cstheme="minorBidi" w:ascii="Calibri" w:hAnsi="Calibri" w:eastAsia="Calibri" w:cs="Calibri"/>
+                <w:sz w:val="24"/>
                 <w:lang w:val="es-CL" w:eastAsia="es-CL"/>
               </w:rPr>
               <w:t>Alloxentric se comprometió a proporcionar el guion, claves de acceso a los proveedores y recursos para las pruebas telefónicas. [PENDIENTE] Confirmar su entrega y condiciones de uso, así como la definición de efectividad, los conceptos de costo, los datos de referencia y el procedimiento de medición de latencia.</w:t>
@@ -7228,7 +7272,8 @@
             </w:pPr>
             <w:r>
               <w:rPr>
-                <w:rFonts w:asciiTheme="minorHAnsi" w:eastAsiaTheme="minorEastAsia" w:hAnsiTheme="minorHAnsi" w:cstheme="minorBidi"/>
+                <w:rFonts w:asciiTheme="minorHAnsi" w:eastAsiaTheme="minorEastAsia" w:hAnsiTheme="minorHAnsi" w:cstheme="minorBidi" w:ascii="Calibri" w:hAnsi="Calibri" w:eastAsia="Calibri" w:cs="Calibri"/>
+                <w:sz w:val="24"/>
                 <w:lang w:val="es-CL" w:eastAsia="es-CL"/>
               </w:rPr>
               <w:t>El resultado esperado será un prototipo evaluable y un informe comparativo que documente costos, efectividad, latencia y limitaciones. No se presupone que la alternativa será superior a la solución actual: la finalidad es obtener evidencia que permita a Alloxentric fundamentar decisiones sobre su utilización.</w:t>
@@ -7263,7 +7308,8 @@
             </w:pPr>
             <w:r>
               <w:rPr>
-                <w:rFonts w:asciiTheme="minorHAnsi" w:eastAsiaTheme="minorEastAsia" w:hAnsiTheme="minorHAnsi" w:cstheme="minorBidi"/>
+                <w:rFonts w:asciiTheme="minorHAnsi" w:eastAsiaTheme="minorEastAsia" w:hAnsiTheme="minorHAnsi" w:cstheme="minorBidi" w:ascii="Calibri" w:hAnsi="Calibri" w:eastAsia="Calibri" w:cs="Calibri"/>
+                <w:sz w:val="24"/>
                 <w:lang w:val="es-CL" w:eastAsia="es-CL"/>
               </w:rPr>
               <w:t>Descripción del proyecto y justificación de su relevancia</w:t>
@@ -7278,7 +7324,8 @@
             </w:pPr>
             <w:r>
               <w:rPr>
-                <w:rFonts w:asciiTheme="minorHAnsi" w:eastAsiaTheme="minorEastAsia" w:hAnsiTheme="minorHAnsi" w:cstheme="minorBidi"/>
+                <w:rFonts w:asciiTheme="minorHAnsi" w:eastAsiaTheme="minorEastAsia" w:hAnsiTheme="minorHAnsi" w:cstheme="minorBidi" w:ascii="Calibri" w:hAnsi="Calibri" w:eastAsia="Calibri" w:cs="Calibri"/>
+                <w:sz w:val="24"/>
                 <w:lang w:val="es-CL" w:eastAsia="es-CL"/>
               </w:rPr>
               <w:t>Contexto y problema empresarial</w:t>
@@ -7293,7 +7340,8 @@
             </w:pPr>
             <w:r>
               <w:rPr>
-                <w:rFonts w:asciiTheme="minorHAnsi" w:eastAsiaTheme="minorEastAsia" w:hAnsiTheme="minorHAnsi" w:cstheme="minorBidi"/>
+                <w:rFonts w:asciiTheme="minorHAnsi" w:eastAsiaTheme="minorEastAsia" w:hAnsiTheme="minorHAnsi" w:cstheme="minorBidi" w:ascii="Calibri" w:hAnsi="Calibri" w:eastAsia="Calibri" w:cs="Calibri"/>
+                <w:sz w:val="24"/>
                 <w:lang w:val="es-CL" w:eastAsia="es-CL"/>
               </w:rPr>
               <w:t xml:space="preserve">[CONFIRMADO] En la reunión inicial del 2 de septiembre de 2026, Max Kreimerman, dueño de Alloxentric, explicó que la empresa cuenta con una plataforma de comunicaciones que utiliza </w:t>
@@ -7301,7 +7349,8 @@
             <w:proofErr w:type="spellStart"/>
             <w:r>
               <w:rPr>
-                <w:rFonts w:asciiTheme="minorHAnsi" w:eastAsiaTheme="minorEastAsia" w:hAnsiTheme="minorHAnsi" w:cstheme="minorBidi"/>
+                <w:rFonts w:asciiTheme="minorHAnsi" w:eastAsiaTheme="minorEastAsia" w:hAnsiTheme="minorHAnsi" w:cstheme="minorBidi" w:ascii="Calibri" w:hAnsi="Calibri" w:eastAsia="Calibri" w:cs="Calibri"/>
+                <w:sz w:val="24"/>
                 <w:lang w:val="es-CL" w:eastAsia="es-CL"/>
               </w:rPr>
               <w:t>bots</w:t>
@@ -7309,7 +7358,8 @@
             <w:proofErr w:type="spellEnd"/>
             <w:r>
               <w:rPr>
-                <w:rFonts w:asciiTheme="minorHAnsi" w:eastAsiaTheme="minorEastAsia" w:hAnsiTheme="minorHAnsi" w:cstheme="minorBidi"/>
+                <w:rFonts w:asciiTheme="minorHAnsi" w:eastAsiaTheme="minorEastAsia" w:hAnsiTheme="minorHAnsi" w:cstheme="minorBidi" w:ascii="Calibri" w:hAnsi="Calibri" w:eastAsia="Calibri" w:cs="Calibri"/>
+                <w:sz w:val="24"/>
                 <w:lang w:val="es-CL" w:eastAsia="es-CL"/>
               </w:rPr>
               <w:t xml:space="preserve"> de voz y texto. Su solución de voz incorpora modelos propios desarrollados cuando las alternativas disponibles para español presentaban limitaciones de calidad.</w:t>
@@ -7324,7 +7374,8 @@
             </w:pPr>
             <w:r>
               <w:rPr>
-                <w:rFonts w:asciiTheme="minorHAnsi" w:eastAsiaTheme="minorEastAsia" w:hAnsiTheme="minorHAnsi" w:cstheme="minorBidi"/>
+                <w:rFonts w:asciiTheme="minorHAnsi" w:eastAsiaTheme="minorEastAsia" w:hAnsiTheme="minorHAnsi" w:cstheme="minorBidi" w:ascii="Calibri" w:hAnsi="Calibri" w:eastAsia="Calibri" w:cs="Calibri"/>
+                <w:sz w:val="24"/>
                 <w:lang w:val="es-CL" w:eastAsia="es-CL"/>
               </w:rPr>
               <w:t xml:space="preserve">Según lo señalado por Max, la infraestructura actual está optimizada para operar a gran escala, pero sus costos presentan poca elasticidad frente a disminuciones del volumen de llamadas. Cuando la demanda baja por debajo de determinados niveles, los costos de nube afectan la rentabilidad. El problema no consiste, por tanto, en la ausencia de un </w:t>
@@ -7332,7 +7383,8 @@
             <w:proofErr w:type="spellStart"/>
             <w:r>
               <w:rPr>
-                <w:rFonts w:asciiTheme="minorHAnsi" w:eastAsiaTheme="minorEastAsia" w:hAnsiTheme="minorHAnsi" w:cstheme="minorBidi"/>
+                <w:rFonts w:asciiTheme="minorHAnsi" w:eastAsiaTheme="minorEastAsia" w:hAnsiTheme="minorHAnsi" w:cstheme="minorBidi" w:ascii="Calibri" w:hAnsi="Calibri" w:eastAsia="Calibri" w:cs="Calibri"/>
+                <w:sz w:val="24"/>
                 <w:lang w:val="es-CL" w:eastAsia="es-CL"/>
               </w:rPr>
               <w:t>bot</w:t>
@@ -7340,7 +7392,8 @@
             <w:proofErr w:type="spellEnd"/>
             <w:r>
               <w:rPr>
-                <w:rFonts w:asciiTheme="minorHAnsi" w:eastAsiaTheme="minorEastAsia" w:hAnsiTheme="minorHAnsi" w:cstheme="minorBidi"/>
+                <w:rFonts w:asciiTheme="minorHAnsi" w:eastAsiaTheme="minorEastAsia" w:hAnsiTheme="minorHAnsi" w:cstheme="minorBidi" w:ascii="Calibri" w:hAnsi="Calibri" w:eastAsia="Calibri" w:cs="Calibri"/>
+                <w:sz w:val="24"/>
                 <w:lang w:val="es-CL" w:eastAsia="es-CL"/>
               </w:rPr>
               <w:t>, sino en evaluar una alternativa tecnológica cuyo costo resulte más adecuado para distintos niveles de operación.</w:t>
@@ -7355,7 +7408,8 @@
             </w:pPr>
             <w:r>
               <w:rPr>
-                <w:rFonts w:asciiTheme="minorHAnsi" w:eastAsiaTheme="minorEastAsia" w:hAnsiTheme="minorHAnsi" w:cstheme="minorBidi"/>
+                <w:rFonts w:asciiTheme="minorHAnsi" w:eastAsiaTheme="minorEastAsia" w:hAnsiTheme="minorHAnsi" w:cstheme="minorBidi" w:ascii="Calibri" w:hAnsi="Calibri" w:eastAsia="Calibri" w:cs="Calibri"/>
+                <w:sz w:val="24"/>
                 <w:lang w:val="es-CL" w:eastAsia="es-CL"/>
               </w:rPr>
               <w:t>Descripción de la solución solicitada</w:t>
@@ -7370,7 +7424,8 @@
             </w:pPr>
             <w:r>
               <w:rPr>
-                <w:rFonts w:asciiTheme="minorHAnsi" w:eastAsiaTheme="minorEastAsia" w:hAnsiTheme="minorHAnsi" w:cstheme="minorBidi"/>
+                <w:rFonts w:asciiTheme="minorHAnsi" w:eastAsiaTheme="minorEastAsia" w:hAnsiTheme="minorHAnsi" w:cstheme="minorBidi" w:ascii="Calibri" w:hAnsi="Calibri" w:eastAsia="Calibri" w:cs="Calibri"/>
+                <w:sz w:val="24"/>
                 <w:lang w:val="es-CL" w:eastAsia="es-CL"/>
               </w:rPr>
               <w:t xml:space="preserve">Alloxentric Real Time Agent consiste en desarrollar un prototipo de </w:t>
@@ -7378,7 +7433,8 @@
             <w:proofErr w:type="spellStart"/>
             <w:r>
               <w:rPr>
-                <w:rFonts w:asciiTheme="minorHAnsi" w:eastAsiaTheme="minorEastAsia" w:hAnsiTheme="minorHAnsi" w:cstheme="minorBidi"/>
+                <w:rFonts w:asciiTheme="minorHAnsi" w:eastAsiaTheme="minorEastAsia" w:hAnsiTheme="minorHAnsi" w:cstheme="minorBidi" w:ascii="Calibri" w:hAnsi="Calibri" w:eastAsia="Calibri" w:cs="Calibri"/>
+                <w:sz w:val="24"/>
                 <w:lang w:val="es-CL" w:eastAsia="es-CL"/>
               </w:rPr>
               <w:t>bot</w:t>
@@ -7386,7 +7442,8 @@
             <w:proofErr w:type="spellEnd"/>
             <w:r>
               <w:rPr>
-                <w:rFonts w:asciiTheme="minorHAnsi" w:eastAsiaTheme="minorEastAsia" w:hAnsiTheme="minorHAnsi" w:cstheme="minorBidi"/>
+                <w:rFonts w:asciiTheme="minorHAnsi" w:eastAsiaTheme="minorEastAsia" w:hAnsiTheme="minorHAnsi" w:cstheme="minorBidi" w:ascii="Calibri" w:hAnsi="Calibri" w:eastAsia="Calibri" w:cs="Calibri"/>
+                <w:sz w:val="24"/>
                 <w:lang w:val="es-CL" w:eastAsia="es-CL"/>
               </w:rPr>
               <w:t xml:space="preserve"> de cobranza por voz basado en un guion utilizado actualmente por la empresa. La implementación utilizará </w:t>
@@ -7394,7 +7451,8 @@
             <w:proofErr w:type="spellStart"/>
             <w:r>
               <w:rPr>
-                <w:rFonts w:asciiTheme="minorHAnsi" w:eastAsiaTheme="minorEastAsia" w:hAnsiTheme="minorHAnsi" w:cstheme="minorBidi"/>
+                <w:rFonts w:asciiTheme="minorHAnsi" w:eastAsiaTheme="minorEastAsia" w:hAnsiTheme="minorHAnsi" w:cstheme="minorBidi" w:ascii="Calibri" w:hAnsi="Calibri" w:eastAsia="Calibri" w:cs="Calibri"/>
+                <w:sz w:val="24"/>
                 <w:lang w:val="es-CL" w:eastAsia="es-CL"/>
               </w:rPr>
               <w:t>LiveKit</w:t>
@@ -7402,7 +7460,8 @@
             <w:proofErr w:type="spellEnd"/>
             <w:r>
               <w:rPr>
-                <w:rFonts w:asciiTheme="minorHAnsi" w:eastAsiaTheme="minorEastAsia" w:hAnsiTheme="minorHAnsi" w:cstheme="minorBidi"/>
+                <w:rFonts w:asciiTheme="minorHAnsi" w:eastAsiaTheme="minorEastAsia" w:hAnsiTheme="minorHAnsi" w:cstheme="minorBidi" w:ascii="Calibri" w:hAnsi="Calibri" w:eastAsia="Calibri" w:cs="Calibri"/>
+                <w:sz w:val="24"/>
                 <w:lang w:val="es-CL" w:eastAsia="es-CL"/>
               </w:rPr>
               <w:t xml:space="preserve">, </w:t>
@@ -7410,7 +7469,8 @@
             <w:proofErr w:type="spellStart"/>
             <w:r>
               <w:rPr>
-                <w:rFonts w:asciiTheme="minorHAnsi" w:eastAsiaTheme="minorEastAsia" w:hAnsiTheme="minorHAnsi" w:cstheme="minorBidi"/>
+                <w:rFonts w:asciiTheme="minorHAnsi" w:eastAsiaTheme="minorEastAsia" w:hAnsiTheme="minorHAnsi" w:cstheme="minorBidi" w:ascii="Calibri" w:hAnsi="Calibri" w:eastAsia="Calibri" w:cs="Calibri"/>
+                <w:sz w:val="24"/>
                 <w:lang w:val="es-CL" w:eastAsia="es-CL"/>
               </w:rPr>
               <w:t>Speechmatics</w:t>
@@ -7418,7 +7478,8 @@
             <w:proofErr w:type="spellEnd"/>
             <w:r>
               <w:rPr>
-                <w:rFonts w:asciiTheme="minorHAnsi" w:eastAsiaTheme="minorEastAsia" w:hAnsiTheme="minorHAnsi" w:cstheme="minorBidi"/>
+                <w:rFonts w:asciiTheme="minorHAnsi" w:eastAsiaTheme="minorEastAsia" w:hAnsiTheme="minorHAnsi" w:cstheme="minorBidi" w:ascii="Calibri" w:hAnsi="Calibri" w:eastAsia="Calibri" w:cs="Calibri"/>
+                <w:sz w:val="24"/>
                 <w:lang w:val="es-CL" w:eastAsia="es-CL"/>
               </w:rPr>
               <w:t xml:space="preserve"> para convertir voz a texto, </w:t>
@@ -7426,7 +7487,8 @@
             <w:proofErr w:type="spellStart"/>
             <w:r>
               <w:rPr>
-                <w:rFonts w:asciiTheme="minorHAnsi" w:eastAsiaTheme="minorEastAsia" w:hAnsiTheme="minorHAnsi" w:cstheme="minorBidi"/>
+                <w:rFonts w:asciiTheme="minorHAnsi" w:eastAsiaTheme="minorEastAsia" w:hAnsiTheme="minorHAnsi" w:cstheme="minorBidi" w:ascii="Calibri" w:hAnsi="Calibri" w:eastAsia="Calibri" w:cs="Calibri"/>
+                <w:sz w:val="24"/>
                 <w:lang w:val="es-CL" w:eastAsia="es-CL"/>
               </w:rPr>
               <w:t>ElevenLabs</w:t>
@@ -7434,7 +7496,8 @@
             <w:proofErr w:type="spellEnd"/>
             <w:r>
               <w:rPr>
-                <w:rFonts w:asciiTheme="minorHAnsi" w:eastAsiaTheme="minorEastAsia" w:hAnsiTheme="minorHAnsi" w:cstheme="minorBidi"/>
+                <w:rFonts w:asciiTheme="minorHAnsi" w:eastAsiaTheme="minorEastAsia" w:hAnsiTheme="minorHAnsi" w:cstheme="minorBidi" w:ascii="Calibri" w:hAnsi="Calibri" w:eastAsia="Calibri" w:cs="Calibri"/>
+                <w:sz w:val="24"/>
                 <w:lang w:val="es-CL" w:eastAsia="es-CL"/>
               </w:rPr>
               <w:t xml:space="preserve"> para generar voz y la plataforma de telefonía Asterisk de Alloxentric.</w:t>
@@ -7449,7 +7512,8 @@
             </w:pPr>
             <w:r>
               <w:rPr>
-                <w:rFonts w:asciiTheme="minorHAnsi" w:eastAsiaTheme="minorEastAsia" w:hAnsiTheme="minorHAnsi" w:cstheme="minorBidi"/>
+                <w:rFonts w:asciiTheme="minorHAnsi" w:eastAsiaTheme="minorEastAsia" w:hAnsiTheme="minorHAnsi" w:cstheme="minorBidi" w:ascii="Calibri" w:hAnsi="Calibri" w:eastAsia="Calibri" w:cs="Calibri"/>
+                <w:sz w:val="24"/>
                 <w:lang w:val="es-CL" w:eastAsia="es-CL"/>
               </w:rPr>
               <w:t>El flujo conversacional se basará inicialmente en reconocimiento de intenciones, tales como respuestas afirmativas, negativas o confirmación de identidad. El conjunto definitivo de intenciones y sus acciones se establecerá al revisar el guion. La indicación empresarial es evitar inicialmente un LLM para interpretar las respuestas; su incorporación solo se reconsiderará si las pruebas demuestran una necesidad y Alloxentric acuerda el cambio.</w:t>
@@ -7464,7 +7528,8 @@
             </w:pPr>
             <w:r>
               <w:rPr>
-                <w:rFonts w:asciiTheme="minorHAnsi" w:eastAsiaTheme="minorEastAsia" w:hAnsiTheme="minorHAnsi" w:cstheme="minorBidi"/>
+                <w:rFonts w:asciiTheme="minorHAnsi" w:eastAsiaTheme="minorEastAsia" w:hAnsiTheme="minorHAnsi" w:cstheme="minorBidi" w:ascii="Calibri" w:hAnsi="Calibri" w:eastAsia="Calibri" w:cs="Calibri"/>
+                <w:sz w:val="24"/>
                 <w:lang w:val="es-CL" w:eastAsia="es-CL"/>
               </w:rPr>
               <w:t>La voz deberá ser adecuada para el contexto chileno, con acento moderado y sin expresiones exageradas. El equipo evaluará alternativas para comprobar su adecuación al guion y a la interacción prevista.</w:t>
@@ -7479,7 +7544,8 @@
             </w:pPr>
             <w:r>
               <w:rPr>
-                <w:rFonts w:asciiTheme="minorHAnsi" w:eastAsiaTheme="minorEastAsia" w:hAnsiTheme="minorHAnsi" w:cstheme="minorBidi"/>
+                <w:rFonts w:asciiTheme="minorHAnsi" w:eastAsiaTheme="minorEastAsia" w:hAnsiTheme="minorHAnsi" w:cstheme="minorBidi" w:ascii="Calibri" w:hAnsi="Calibri" w:eastAsia="Calibri" w:cs="Calibri"/>
+                <w:sz w:val="24"/>
                 <w:lang w:val="es-CL" w:eastAsia="es-CL"/>
               </w:rPr>
               <w:lastRenderedPageBreak/>
@@ -7495,7 +7561,8 @@
             </w:pPr>
             <w:r>
               <w:rPr>
-                <w:rFonts w:asciiTheme="minorHAnsi" w:eastAsiaTheme="minorEastAsia" w:hAnsiTheme="minorHAnsi" w:cstheme="minorBidi"/>
+                <w:rFonts w:asciiTheme="minorHAnsi" w:eastAsiaTheme="minorEastAsia" w:hAnsiTheme="minorHAnsi" w:cstheme="minorBidi" w:ascii="Calibri" w:hAnsi="Calibri" w:eastAsia="Calibri" w:cs="Calibri"/>
+                <w:sz w:val="24"/>
                 <w:lang w:val="es-CL" w:eastAsia="es-CL"/>
               </w:rPr>
               <w:t xml:space="preserve">[CONFIRMADO] Max estableció que la respuesta del </w:t>
@@ -7503,7 +7570,8 @@
             <w:proofErr w:type="spellStart"/>
             <w:r>
               <w:rPr>
-                <w:rFonts w:asciiTheme="minorHAnsi" w:eastAsiaTheme="minorEastAsia" w:hAnsiTheme="minorHAnsi" w:cstheme="minorBidi"/>
+                <w:rFonts w:asciiTheme="minorHAnsi" w:eastAsiaTheme="minorEastAsia" w:hAnsiTheme="minorHAnsi" w:cstheme="minorBidi" w:ascii="Calibri" w:hAnsi="Calibri" w:eastAsia="Calibri" w:cs="Calibri"/>
+                <w:sz w:val="24"/>
                 <w:lang w:val="es-CL" w:eastAsia="es-CL"/>
               </w:rPr>
               <w:t>bot</w:t>
@@ -7511,7 +7579,8 @@
             <w:proofErr w:type="spellEnd"/>
             <w:r>
               <w:rPr>
-                <w:rFonts w:asciiTheme="minorHAnsi" w:eastAsiaTheme="minorEastAsia" w:hAnsiTheme="minorHAnsi" w:cstheme="minorBidi"/>
+                <w:rFonts w:asciiTheme="minorHAnsi" w:eastAsiaTheme="minorEastAsia" w:hAnsiTheme="minorHAnsi" w:cstheme="minorBidi" w:ascii="Calibri" w:hAnsi="Calibri" w:eastAsia="Calibri" w:cs="Calibri"/>
+                <w:sz w:val="24"/>
                 <w:lang w:val="es-CL" w:eastAsia="es-CL"/>
               </w:rPr>
               <w:t xml:space="preserve"> no debe demorar más de un segundo. También explicó que las demoras superiores a tres segundos pueden provocar que la persona interrumpa la llamada y que la gestión no produzca el resultado esperado. Esta observación fundamenta la importancia de la latencia, pero no constituye una medición realizada por el equipo.</w:t>
@@ -7526,7 +7595,8 @@
             </w:pPr>
             <w:r>
               <w:rPr>
-                <w:rFonts w:asciiTheme="minorHAnsi" w:eastAsiaTheme="minorEastAsia" w:hAnsiTheme="minorHAnsi" w:cstheme="minorBidi"/>
+                <w:rFonts w:asciiTheme="minorHAnsi" w:eastAsiaTheme="minorEastAsia" w:hAnsiTheme="minorHAnsi" w:cstheme="minorBidi" w:ascii="Calibri" w:hAnsi="Calibri" w:eastAsia="Calibri" w:cs="Calibri"/>
+                <w:sz w:val="24"/>
                 <w:lang w:val="es-CL" w:eastAsia="es-CL"/>
               </w:rPr>
               <w:t>[PENDIENTE] Precisar los eventos de inicio y término de la medición, las condiciones de prueba y la forma de verificar el requisito. Además del tiempo de respuesta, se comprobarán la ejecución del guion, el reconocimiento de intenciones y el comportamiento ante respuestas no reconocidas, conforme a los criterios acordados.</w:t>
@@ -7541,7 +7611,8 @@
             </w:pPr>
             <w:r>
               <w:rPr>
-                <w:rFonts w:asciiTheme="minorHAnsi" w:eastAsiaTheme="minorEastAsia" w:hAnsiTheme="minorHAnsi" w:cstheme="minorBidi"/>
+                <w:rFonts w:asciiTheme="minorHAnsi" w:eastAsiaTheme="minorEastAsia" w:hAnsiTheme="minorHAnsi" w:cstheme="minorBidi" w:ascii="Calibri" w:hAnsi="Calibri" w:eastAsia="Calibri" w:cs="Calibri"/>
+                <w:sz w:val="24"/>
                 <w:lang w:val="es-CL" w:eastAsia="es-CL"/>
               </w:rPr>
               <w:t>Alcance del proyecto</w:t>
@@ -7556,7 +7627,8 @@
             </w:pPr>
             <w:r>
               <w:rPr>
-                <w:rFonts w:asciiTheme="minorHAnsi" w:eastAsiaTheme="minorEastAsia" w:hAnsiTheme="minorHAnsi" w:cstheme="minorBidi"/>
+                <w:rFonts w:asciiTheme="minorHAnsi" w:eastAsiaTheme="minorEastAsia" w:hAnsiTheme="minorHAnsi" w:cstheme="minorBidi" w:ascii="Calibri" w:hAnsi="Calibri" w:eastAsia="Calibri" w:cs="Calibri"/>
+                <w:sz w:val="24"/>
                 <w:lang w:val="es-CL" w:eastAsia="es-CL"/>
               </w:rPr>
               <w:t xml:space="preserve">El trabajo comprenderá el análisis del guion y los requerimientos, el diseño de la integración, la construcción del </w:t>
@@ -7564,7 +7636,8 @@
             <w:proofErr w:type="spellStart"/>
             <w:r>
               <w:rPr>
-                <w:rFonts w:asciiTheme="minorHAnsi" w:eastAsiaTheme="minorEastAsia" w:hAnsiTheme="minorHAnsi" w:cstheme="minorBidi"/>
+                <w:rFonts w:asciiTheme="minorHAnsi" w:eastAsiaTheme="minorEastAsia" w:hAnsiTheme="minorHAnsi" w:cstheme="minorBidi" w:ascii="Calibri" w:hAnsi="Calibri" w:eastAsia="Calibri" w:cs="Calibri"/>
+                <w:sz w:val="24"/>
                 <w:lang w:val="es-CL" w:eastAsia="es-CL"/>
               </w:rPr>
               <w:t>bot</w:t>
@@ -7572,7 +7645,8 @@
             <w:proofErr w:type="spellEnd"/>
             <w:r>
               <w:rPr>
-                <w:rFonts w:asciiTheme="minorHAnsi" w:eastAsiaTheme="minorEastAsia" w:hAnsiTheme="minorHAnsi" w:cstheme="minorBidi"/>
+                <w:rFonts w:asciiTheme="minorHAnsi" w:eastAsiaTheme="minorEastAsia" w:hAnsiTheme="minorHAnsi" w:cstheme="minorBidi" w:ascii="Calibri" w:hAnsi="Calibri" w:eastAsia="Calibri" w:cs="Calibri"/>
+                <w:sz w:val="24"/>
                 <w:lang w:val="es-CL" w:eastAsia="es-CL"/>
               </w:rPr>
               <w:t>, las pruebas y la comparación de resultados con la solución actual. Se aprovechará la telefonía de Alloxentric y se coordinarán con la empresa el despliegue y las pruebas autorizadas.</w:t>
@@ -7587,7 +7661,8 @@
             </w:pPr>
             <w:r>
               <w:rPr>
-                <w:rFonts w:asciiTheme="minorHAnsi" w:eastAsiaTheme="minorEastAsia" w:hAnsiTheme="minorHAnsi" w:cstheme="minorBidi"/>
+                <w:rFonts w:asciiTheme="minorHAnsi" w:eastAsiaTheme="minorEastAsia" w:hAnsiTheme="minorHAnsi" w:cstheme="minorBidi" w:ascii="Calibri" w:hAnsi="Calibri" w:eastAsia="Calibri" w:cs="Calibri"/>
+                <w:sz w:val="24"/>
                 <w:lang w:val="es-CL" w:eastAsia="es-CL"/>
               </w:rPr>
               <w:t>No se contempla construir una nueva plataforma de campañas, reemplazar el sistema de colas ni implementar una selección automática entre ambas soluciones según el volumen. Tampoco se presupone acceso directo del equipo al entorno de producción.</w:t>
@@ -7602,7 +7677,8 @@
             </w:pPr>
             <w:r>
               <w:rPr>
-                <w:rFonts w:asciiTheme="minorHAnsi" w:eastAsiaTheme="minorEastAsia" w:hAnsiTheme="minorHAnsi" w:cstheme="minorBidi"/>
+                <w:rFonts w:asciiTheme="minorHAnsi" w:eastAsiaTheme="minorEastAsia" w:hAnsiTheme="minorHAnsi" w:cstheme="minorBidi" w:ascii="Calibri" w:hAnsi="Calibri" w:eastAsia="Calibri" w:cs="Calibri"/>
+                <w:sz w:val="24"/>
                 <w:lang w:val="es-CL" w:eastAsia="es-CL"/>
               </w:rPr>
               <w:t>Alloxentric se comprometió a proporcionar documentación, claves de acceso y recursos para las pruebas. Su entrega efectiva, límites de uso y responsabilidades de operación deberán confirmarse antes de ejecutar las actividades dependientes.</w:t>
@@ -7617,7 +7693,8 @@
             </w:pPr>
             <w:r>
               <w:rPr>
-                <w:rFonts w:asciiTheme="minorHAnsi" w:eastAsiaTheme="minorEastAsia" w:hAnsiTheme="minorHAnsi" w:cstheme="minorBidi"/>
+                <w:rFonts w:asciiTheme="minorHAnsi" w:eastAsiaTheme="minorEastAsia" w:hAnsiTheme="minorHAnsi" w:cstheme="minorBidi" w:ascii="Calibri" w:hAnsi="Calibri" w:eastAsia="Calibri" w:cs="Calibri"/>
+                <w:sz w:val="24"/>
                 <w:lang w:val="es-CL" w:eastAsia="es-CL"/>
               </w:rPr>
               <w:t>Relevancia profesional y aporte esperado</w:t>
@@ -7632,7 +7709,8 @@
             </w:pPr>
             <w:r>
               <w:rPr>
-                <w:rFonts w:asciiTheme="minorHAnsi" w:eastAsiaTheme="minorEastAsia" w:hAnsiTheme="minorHAnsi" w:cstheme="minorBidi"/>
+                <w:rFonts w:asciiTheme="minorHAnsi" w:eastAsiaTheme="minorEastAsia" w:hAnsiTheme="minorHAnsi" w:cstheme="minorBidi" w:ascii="Calibri" w:hAnsi="Calibri" w:eastAsia="Calibri" w:cs="Calibri"/>
+                <w:sz w:val="24"/>
                 <w:lang w:val="es-CL" w:eastAsia="es-CL"/>
               </w:rPr>
               <w:t>El proyecto es relevante para Ingeniería en Informática porque vincula una necesidad empresarial con el análisis de requerimientos, el desarrollo e integración de software y la evaluación técnica y económica de una solución. Exige justificar decisiones considerando funcionamiento, latencia, costos y restricciones operacionales.</w:t>
@@ -7647,7 +7725,8 @@
             </w:pPr>
             <w:r>
               <w:rPr>
-                <w:rFonts w:asciiTheme="minorHAnsi" w:eastAsiaTheme="minorEastAsia" w:hAnsiTheme="minorHAnsi" w:cstheme="minorBidi"/>
+                <w:rFonts w:asciiTheme="minorHAnsi" w:eastAsiaTheme="minorEastAsia" w:hAnsiTheme="minorHAnsi" w:cstheme="minorBidi" w:ascii="Calibri" w:hAnsi="Calibri" w:eastAsia="Calibri" w:cs="Calibri"/>
+                <w:sz w:val="24"/>
                 <w:lang w:val="es-CL" w:eastAsia="es-CL"/>
               </w:rPr>
               <w:t>La comparación de costo y efectividad por llamada constituye el aporte central esperado. Para realizarla, se deberá acordar qué representa una gestión efectiva, qué costos se incluirán y qué datos de referencia estarán disponibles. Las condiciones de comparación deberán permitir interpretar las diferencias entre ambas soluciones.</w:t>
@@ -7662,7 +7741,8 @@
             </w:pPr>
             <w:r>
               <w:rPr>
-                <w:rFonts w:asciiTheme="minorHAnsi" w:eastAsiaTheme="minorEastAsia" w:hAnsiTheme="minorHAnsi" w:cstheme="minorBidi"/>
+                <w:rFonts w:asciiTheme="minorHAnsi" w:eastAsiaTheme="minorEastAsia" w:hAnsiTheme="minorHAnsi" w:cstheme="minorBidi" w:ascii="Calibri" w:hAnsi="Calibri" w:eastAsia="Calibri" w:cs="Calibri"/>
+                <w:sz w:val="24"/>
                 <w:lang w:val="es-CL" w:eastAsia="es-CL"/>
               </w:rPr>
               <w:t>El resultado aportará a Alloxentric un prototipo y evidencia para evaluar la conveniencia de esta alternativa. No se anticipan ahorros ni mejoras de efectividad sin pruebas: identificar limitaciones o condiciones en las que la alternativa no resulte conveniente también permitirá fundamentar decisiones.</w:t>
@@ -7677,7 +7757,8 @@
             </w:pPr>
             <w:r>
               <w:rPr>
-                <w:rFonts w:asciiTheme="minorHAnsi" w:eastAsiaTheme="minorEastAsia" w:hAnsiTheme="minorHAnsi" w:cstheme="minorBidi"/>
+                <w:rFonts w:asciiTheme="minorHAnsi" w:eastAsiaTheme="minorEastAsia" w:hAnsiTheme="minorHAnsi" w:cstheme="minorBidi" w:ascii="Calibri" w:hAnsi="Calibri" w:eastAsia="Calibri" w:cs="Calibri"/>
+                <w:sz w:val="24"/>
                 <w:lang w:val="es-CL" w:eastAsia="es-CL"/>
               </w:rPr>
               <w:t>Fuente del contexto empresarial</w:t>
@@ -7692,7 +7773,8 @@
             </w:pPr>
             <w:r>
               <w:rPr>
-                <w:rFonts w:asciiTheme="minorHAnsi" w:eastAsiaTheme="minorEastAsia" w:hAnsiTheme="minorHAnsi" w:cstheme="minorBidi"/>
+                <w:rFonts w:asciiTheme="minorHAnsi" w:eastAsiaTheme="minorEastAsia" w:hAnsiTheme="minorHAnsi" w:cstheme="minorBidi" w:ascii="Calibri" w:hAnsi="Calibri" w:eastAsia="Calibri" w:cs="Calibri"/>
+                <w:sz w:val="24"/>
                 <w:lang w:val="es-CL" w:eastAsia="es-CL"/>
               </w:rPr>
               <w:t>La descripción se fundamenta en la transcripción aportada por Fernando Olguea de la intervención de Max Kreimerman en la reunión inicial del 2 de septiembre de 2026. Los detalles pendientes deberán contrastarse con la documentación y los acuerdos posteriores de Alloxentric.</w:t>
@@ -7725,7 +7807,7 @@
             </w:pPr>
             <w:r>
               <w:rPr>
-                <w:rFonts w:asciiTheme="minorHAnsi" w:eastAsiaTheme="minorEastAsia" w:hAnsiTheme="minorHAnsi" w:cstheme="minorBidi"/>
+                <w:rFonts w:asciiTheme="minorHAnsi" w:eastAsiaTheme="minorEastAsia" w:hAnsiTheme="minorHAnsi" w:cstheme="minorBidi" w:ascii="Calibri" w:hAnsi="Calibri" w:eastAsia="Calibri" w:cs="Calibri"/>
                 <w:b/>
                 <w:bCs/>
                 <w:sz w:val="24"/>
@@ -7746,7 +7828,7 @@
             </w:pPr>
             <w:r>
               <w:rPr>
-                <w:rFonts w:asciiTheme="minorHAnsi" w:eastAsiaTheme="minorEastAsia" w:hAnsiTheme="minorHAnsi" w:cstheme="minorBidi"/>
+                <w:rFonts w:asciiTheme="minorHAnsi" w:eastAsiaTheme="minorEastAsia" w:hAnsiTheme="minorHAnsi" w:cstheme="minorBidi" w:ascii="Calibri" w:hAnsi="Calibri" w:eastAsia="Calibri" w:cs="Calibri"/>
                 <w:sz w:val="24"/>
                 <w:szCs w:val="24"/>
                 <w:lang w:val="es-CL" w:eastAsia="es-CL"/>
@@ -7755,7 +7837,7 @@
             </w:r>
             <w:r>
               <w:rPr>
-                <w:rFonts w:asciiTheme="minorHAnsi" w:eastAsiaTheme="minorEastAsia" w:hAnsiTheme="minorHAnsi" w:cstheme="minorBidi"/>
+                <w:rFonts w:asciiTheme="minorHAnsi" w:eastAsiaTheme="minorEastAsia" w:hAnsiTheme="minorHAnsi" w:cstheme="minorBidi" w:ascii="Calibri" w:hAnsi="Calibri" w:eastAsia="Calibri" w:cs="Calibri"/>
                 <w:b/>
                 <w:bCs/>
                 <w:sz w:val="24"/>
@@ -7766,7 +7848,7 @@
             </w:r>
             <w:r>
               <w:rPr>
-                <w:rFonts w:asciiTheme="minorHAnsi" w:eastAsiaTheme="minorEastAsia" w:hAnsiTheme="minorHAnsi" w:cstheme="minorBidi"/>
+                <w:rFonts w:asciiTheme="minorHAnsi" w:eastAsiaTheme="minorEastAsia" w:hAnsiTheme="minorHAnsi" w:cstheme="minorBidi" w:ascii="Calibri" w:hAnsi="Calibri" w:eastAsia="Calibri" w:cs="Calibri"/>
                 <w:sz w:val="24"/>
                 <w:szCs w:val="24"/>
                 <w:lang w:val="es-CL" w:eastAsia="es-CL"/>
@@ -7785,7 +7867,7 @@
             </w:pPr>
             <w:r>
               <w:rPr>
-                <w:rFonts w:asciiTheme="minorHAnsi" w:eastAsiaTheme="minorEastAsia" w:hAnsiTheme="minorHAnsi" w:cstheme="minorBidi"/>
+                <w:rFonts w:asciiTheme="minorHAnsi" w:eastAsiaTheme="minorEastAsia" w:hAnsiTheme="minorHAnsi" w:cstheme="minorBidi" w:ascii="Calibri" w:hAnsi="Calibri" w:eastAsia="Calibri" w:cs="Calibri"/>
                 <w:b/>
                 <w:bCs/>
                 <w:sz w:val="24"/>
@@ -7806,7 +7888,7 @@
             </w:pPr>
             <w:r>
               <w:rPr>
-                <w:rFonts w:asciiTheme="minorHAnsi" w:eastAsiaTheme="minorEastAsia" w:hAnsiTheme="minorHAnsi" w:cstheme="minorBidi"/>
+                <w:rFonts w:asciiTheme="minorHAnsi" w:eastAsiaTheme="minorEastAsia" w:hAnsiTheme="minorHAnsi" w:cstheme="minorBidi" w:ascii="Calibri" w:hAnsi="Calibri" w:eastAsia="Calibri" w:cs="Calibri"/>
                 <w:sz w:val="24"/>
                 <w:szCs w:val="24"/>
                 <w:lang w:val="es-CL" w:eastAsia="es-CL"/>
@@ -7825,7 +7907,7 @@
             </w:pPr>
             <w:r>
               <w:rPr>
-                <w:rFonts w:asciiTheme="minorHAnsi" w:eastAsiaTheme="minorEastAsia" w:hAnsiTheme="minorHAnsi" w:cstheme="minorBidi"/>
+                <w:rFonts w:asciiTheme="minorHAnsi" w:eastAsiaTheme="minorEastAsia" w:hAnsiTheme="minorHAnsi" w:cstheme="minorBidi" w:ascii="Calibri" w:hAnsi="Calibri" w:eastAsia="Calibri" w:cs="Calibri"/>
                 <w:b/>
                 <w:bCs/>
                 <w:sz w:val="24"/>
@@ -7847,7 +7929,7 @@
             </w:pPr>
             <w:r>
               <w:rPr>
-                <w:rFonts w:asciiTheme="minorHAnsi" w:eastAsiaTheme="minorEastAsia" w:hAnsiTheme="minorHAnsi" w:cstheme="minorBidi"/>
+                <w:rFonts w:asciiTheme="minorHAnsi" w:eastAsiaTheme="minorEastAsia" w:hAnsiTheme="minorHAnsi" w:cstheme="minorBidi" w:ascii="Calibri" w:hAnsi="Calibri" w:eastAsia="Calibri" w:cs="Calibri"/>
                 <w:sz w:val="24"/>
                 <w:szCs w:val="24"/>
                 <w:lang w:val="es-CL" w:eastAsia="es-CL"/>
@@ -7857,7 +7939,7 @@
             <w:proofErr w:type="spellStart"/>
             <w:r>
               <w:rPr>
-                <w:rFonts w:asciiTheme="minorHAnsi" w:eastAsiaTheme="minorEastAsia" w:hAnsiTheme="minorHAnsi" w:cstheme="minorBidi"/>
+                <w:rFonts w:asciiTheme="minorHAnsi" w:eastAsiaTheme="minorEastAsia" w:hAnsiTheme="minorHAnsi" w:cstheme="minorBidi" w:ascii="Calibri" w:hAnsi="Calibri" w:eastAsia="Calibri" w:cs="Calibri"/>
                 <w:sz w:val="24"/>
                 <w:szCs w:val="24"/>
                 <w:lang w:val="es-CL" w:eastAsia="es-CL"/>
@@ -7867,7 +7949,7 @@
             <w:proofErr w:type="spellEnd"/>
             <w:r>
               <w:rPr>
-                <w:rFonts w:asciiTheme="minorHAnsi" w:eastAsiaTheme="minorEastAsia" w:hAnsiTheme="minorHAnsi" w:cstheme="minorBidi"/>
+                <w:rFonts w:asciiTheme="minorHAnsi" w:eastAsiaTheme="minorEastAsia" w:hAnsiTheme="minorHAnsi" w:cstheme="minorBidi" w:ascii="Calibri" w:hAnsi="Calibri" w:eastAsia="Calibri" w:cs="Calibri"/>
                 <w:sz w:val="24"/>
                 <w:szCs w:val="24"/>
                 <w:lang w:val="es-CL" w:eastAsia="es-CL"/>
@@ -7877,7 +7959,7 @@
             <w:proofErr w:type="spellStart"/>
             <w:r>
               <w:rPr>
-                <w:rFonts w:asciiTheme="minorHAnsi" w:eastAsiaTheme="minorEastAsia" w:hAnsiTheme="minorHAnsi" w:cstheme="minorBidi"/>
+                <w:rFonts w:asciiTheme="minorHAnsi" w:eastAsiaTheme="minorEastAsia" w:hAnsiTheme="minorHAnsi" w:cstheme="minorBidi" w:ascii="Calibri" w:hAnsi="Calibri" w:eastAsia="Calibri" w:cs="Calibri"/>
                 <w:sz w:val="24"/>
                 <w:szCs w:val="24"/>
                 <w:lang w:val="es-CL" w:eastAsia="es-CL"/>
@@ -7887,7 +7969,7 @@
             <w:proofErr w:type="spellEnd"/>
             <w:r>
               <w:rPr>
-                <w:rFonts w:asciiTheme="minorHAnsi" w:eastAsiaTheme="minorEastAsia" w:hAnsiTheme="minorHAnsi" w:cstheme="minorBidi"/>
+                <w:rFonts w:asciiTheme="minorHAnsi" w:eastAsiaTheme="minorEastAsia" w:hAnsiTheme="minorHAnsi" w:cstheme="minorBidi" w:ascii="Calibri" w:hAnsi="Calibri" w:eastAsia="Calibri" w:cs="Calibri"/>
                 <w:sz w:val="24"/>
                 <w:szCs w:val="24"/>
                 <w:lang w:val="es-CL" w:eastAsia="es-CL"/>
@@ -7906,7 +7988,7 @@
             </w:pPr>
             <w:r>
               <w:rPr>
-                <w:rFonts w:asciiTheme="minorHAnsi" w:eastAsiaTheme="minorEastAsia" w:hAnsiTheme="minorHAnsi" w:cstheme="minorBidi"/>
+                <w:rFonts w:asciiTheme="minorHAnsi" w:eastAsiaTheme="minorEastAsia" w:hAnsiTheme="minorHAnsi" w:cstheme="minorBidi" w:ascii="Calibri" w:hAnsi="Calibri" w:eastAsia="Calibri" w:cs="Calibri"/>
                 <w:b/>
                 <w:bCs/>
                 <w:sz w:val="24"/>
@@ -7927,7 +8009,7 @@
             </w:pPr>
             <w:r>
               <w:rPr>
-                <w:rFonts w:asciiTheme="minorHAnsi" w:eastAsiaTheme="minorEastAsia" w:hAnsiTheme="minorHAnsi" w:cstheme="minorBidi"/>
+                <w:rFonts w:asciiTheme="minorHAnsi" w:eastAsiaTheme="minorEastAsia" w:hAnsiTheme="minorHAnsi" w:cstheme="minorBidi" w:ascii="Calibri" w:hAnsi="Calibri" w:eastAsia="Calibri" w:cs="Calibri"/>
                 <w:sz w:val="24"/>
                 <w:szCs w:val="24"/>
                 <w:lang w:val="es-CL" w:eastAsia="es-CL"/>
@@ -7937,7 +8019,7 @@
             <w:proofErr w:type="spellStart"/>
             <w:r>
               <w:rPr>
-                <w:rFonts w:asciiTheme="minorHAnsi" w:eastAsiaTheme="minorEastAsia" w:hAnsiTheme="minorHAnsi" w:cstheme="minorBidi"/>
+                <w:rFonts w:asciiTheme="minorHAnsi" w:eastAsiaTheme="minorEastAsia" w:hAnsiTheme="minorHAnsi" w:cstheme="minorBidi" w:ascii="Calibri" w:hAnsi="Calibri" w:eastAsia="Calibri" w:cs="Calibri"/>
                 <w:sz w:val="24"/>
                 <w:szCs w:val="24"/>
                 <w:lang w:val="es-CL" w:eastAsia="es-CL"/>
@@ -7947,7 +8029,7 @@
             <w:proofErr w:type="spellEnd"/>
             <w:r>
               <w:rPr>
-                <w:rFonts w:asciiTheme="minorHAnsi" w:eastAsiaTheme="minorEastAsia" w:hAnsiTheme="minorHAnsi" w:cstheme="minorBidi"/>
+                <w:rFonts w:asciiTheme="minorHAnsi" w:eastAsiaTheme="minorEastAsia" w:hAnsiTheme="minorHAnsi" w:cstheme="minorBidi" w:ascii="Calibri" w:hAnsi="Calibri" w:eastAsia="Calibri" w:cs="Calibri"/>
                 <w:sz w:val="24"/>
                 <w:szCs w:val="24"/>
                 <w:lang w:val="es-CL" w:eastAsia="es-CL"/>
@@ -7957,7 +8039,7 @@
             <w:proofErr w:type="spellStart"/>
             <w:r>
               <w:rPr>
-                <w:rFonts w:asciiTheme="minorHAnsi" w:eastAsiaTheme="minorEastAsia" w:hAnsiTheme="minorHAnsi" w:cstheme="minorBidi"/>
+                <w:rFonts w:asciiTheme="minorHAnsi" w:eastAsiaTheme="minorEastAsia" w:hAnsiTheme="minorHAnsi" w:cstheme="minorBidi" w:ascii="Calibri" w:hAnsi="Calibri" w:eastAsia="Calibri" w:cs="Calibri"/>
                 <w:sz w:val="24"/>
                 <w:szCs w:val="24"/>
                 <w:lang w:val="es-CL" w:eastAsia="es-CL"/>
@@ -7967,7 +8049,7 @@
             <w:proofErr w:type="spellEnd"/>
             <w:r>
               <w:rPr>
-                <w:rFonts w:asciiTheme="minorHAnsi" w:eastAsiaTheme="minorEastAsia" w:hAnsiTheme="minorHAnsi" w:cstheme="minorBidi"/>
+                <w:rFonts w:asciiTheme="minorHAnsi" w:eastAsiaTheme="minorEastAsia" w:hAnsiTheme="minorHAnsi" w:cstheme="minorBidi" w:ascii="Calibri" w:hAnsi="Calibri" w:eastAsia="Calibri" w:cs="Calibri"/>
                 <w:sz w:val="24"/>
                 <w:szCs w:val="24"/>
                 <w:lang w:val="es-CL" w:eastAsia="es-CL"/>
@@ -7977,7 +8059,7 @@
             <w:proofErr w:type="spellStart"/>
             <w:r>
               <w:rPr>
-                <w:rFonts w:asciiTheme="minorHAnsi" w:eastAsiaTheme="minorEastAsia" w:hAnsiTheme="minorHAnsi" w:cstheme="minorBidi"/>
+                <w:rFonts w:asciiTheme="minorHAnsi" w:eastAsiaTheme="minorEastAsia" w:hAnsiTheme="minorHAnsi" w:cstheme="minorBidi" w:ascii="Calibri" w:hAnsi="Calibri" w:eastAsia="Calibri" w:cs="Calibri"/>
                 <w:sz w:val="24"/>
                 <w:szCs w:val="24"/>
                 <w:lang w:val="es-CL" w:eastAsia="es-CL"/>
@@ -7987,7 +8069,7 @@
             <w:proofErr w:type="spellEnd"/>
             <w:r>
               <w:rPr>
-                <w:rFonts w:asciiTheme="minorHAnsi" w:eastAsiaTheme="minorEastAsia" w:hAnsiTheme="minorHAnsi" w:cstheme="minorBidi"/>
+                <w:rFonts w:asciiTheme="minorHAnsi" w:eastAsiaTheme="minorEastAsia" w:hAnsiTheme="minorHAnsi" w:cstheme="minorBidi" w:ascii="Calibri" w:hAnsi="Calibri" w:eastAsia="Calibri" w:cs="Calibri"/>
                 <w:sz w:val="24"/>
                 <w:szCs w:val="24"/>
                 <w:lang w:val="es-CL" w:eastAsia="es-CL"/>
@@ -8006,7 +8088,7 @@
             </w:pPr>
             <w:r>
               <w:rPr>
-                <w:rFonts w:asciiTheme="minorHAnsi" w:eastAsiaTheme="minorEastAsia" w:hAnsiTheme="minorHAnsi" w:cstheme="minorBidi"/>
+                <w:rFonts w:asciiTheme="minorHAnsi" w:eastAsiaTheme="minorEastAsia" w:hAnsiTheme="minorHAnsi" w:cstheme="minorBidi" w:ascii="Calibri" w:hAnsi="Calibri" w:eastAsia="Calibri" w:cs="Calibri"/>
                 <w:b/>
                 <w:bCs/>
                 <w:sz w:val="24"/>
@@ -8027,7 +8109,7 @@
             </w:pPr>
             <w:r>
               <w:rPr>
-                <w:rFonts w:asciiTheme="minorHAnsi" w:eastAsiaTheme="minorEastAsia" w:hAnsiTheme="minorHAnsi" w:cstheme="minorBidi"/>
+                <w:rFonts w:asciiTheme="minorHAnsi" w:eastAsiaTheme="minorEastAsia" w:hAnsiTheme="minorHAnsi" w:cstheme="minorBidi" w:ascii="Calibri" w:hAnsi="Calibri" w:eastAsia="Calibri" w:cs="Calibri"/>
                 <w:sz w:val="24"/>
                 <w:szCs w:val="24"/>
                 <w:lang w:val="es-CL" w:eastAsia="es-CL"/>
@@ -8037,7 +8119,7 @@
             <w:proofErr w:type="spellStart"/>
             <w:r>
               <w:rPr>
-                <w:rFonts w:asciiTheme="minorHAnsi" w:eastAsiaTheme="minorEastAsia" w:hAnsiTheme="minorHAnsi" w:cstheme="minorBidi"/>
+                <w:rFonts w:asciiTheme="minorHAnsi" w:eastAsiaTheme="minorEastAsia" w:hAnsiTheme="minorHAnsi" w:cstheme="minorBidi" w:ascii="Calibri" w:hAnsi="Calibri" w:eastAsia="Calibri" w:cs="Calibri"/>
                 <w:sz w:val="24"/>
                 <w:szCs w:val="24"/>
                 <w:lang w:val="es-CL" w:eastAsia="es-CL"/>
@@ -8047,7 +8129,7 @@
             <w:proofErr w:type="spellEnd"/>
             <w:r>
               <w:rPr>
-                <w:rFonts w:asciiTheme="minorHAnsi" w:eastAsiaTheme="minorEastAsia" w:hAnsiTheme="minorHAnsi" w:cstheme="minorBidi"/>
+                <w:rFonts w:asciiTheme="minorHAnsi" w:eastAsiaTheme="minorEastAsia" w:hAnsiTheme="minorHAnsi" w:cstheme="minorBidi" w:ascii="Calibri" w:hAnsi="Calibri" w:eastAsia="Calibri" w:cs="Calibri"/>
                 <w:sz w:val="24"/>
                 <w:szCs w:val="24"/>
                 <w:lang w:val="es-CL" w:eastAsia="es-CL"/>
@@ -8066,7 +8148,7 @@
             </w:pPr>
             <w:r>
               <w:rPr>
-                <w:rFonts w:asciiTheme="minorHAnsi" w:eastAsiaTheme="minorEastAsia" w:hAnsiTheme="minorHAnsi" w:cstheme="minorBidi"/>
+                <w:rFonts w:asciiTheme="minorHAnsi" w:eastAsiaTheme="minorEastAsia" w:hAnsiTheme="minorHAnsi" w:cstheme="minorBidi" w:ascii="Calibri" w:hAnsi="Calibri" w:eastAsia="Calibri" w:cs="Calibri"/>
                 <w:b/>
                 <w:bCs/>
                 <w:sz w:val="24"/>
@@ -8087,7 +8169,7 @@
             </w:pPr>
             <w:r>
               <w:rPr>
-                <w:rFonts w:asciiTheme="minorHAnsi" w:eastAsiaTheme="minorEastAsia" w:hAnsiTheme="minorHAnsi" w:cstheme="minorBidi"/>
+                <w:rFonts w:asciiTheme="minorHAnsi" w:eastAsiaTheme="minorEastAsia" w:hAnsiTheme="minorHAnsi" w:cstheme="minorBidi" w:ascii="Calibri" w:hAnsi="Calibri" w:eastAsia="Calibri" w:cs="Calibri"/>
                 <w:sz w:val="24"/>
                 <w:szCs w:val="24"/>
                 <w:lang w:val="es-CL" w:eastAsia="es-CL"/>
@@ -8106,7 +8188,7 @@
             </w:pPr>
             <w:r>
               <w:rPr>
-                <w:rFonts w:asciiTheme="minorHAnsi" w:eastAsiaTheme="minorEastAsia" w:hAnsiTheme="minorHAnsi" w:cstheme="minorBidi"/>
+                <w:rFonts w:asciiTheme="minorHAnsi" w:eastAsiaTheme="minorEastAsia" w:hAnsiTheme="minorHAnsi" w:cstheme="minorBidi" w:ascii="Calibri" w:hAnsi="Calibri" w:eastAsia="Calibri" w:cs="Calibri"/>
                 <w:b/>
                 <w:bCs/>
                 <w:sz w:val="24"/>
@@ -8127,7 +8209,7 @@
             </w:pPr>
             <w:r>
               <w:rPr>
-                <w:rFonts w:asciiTheme="minorHAnsi" w:eastAsiaTheme="minorEastAsia" w:hAnsiTheme="minorHAnsi" w:cstheme="minorBidi"/>
+                <w:rFonts w:asciiTheme="minorHAnsi" w:eastAsiaTheme="minorEastAsia" w:hAnsiTheme="minorHAnsi" w:cstheme="minorBidi" w:ascii="Calibri" w:hAnsi="Calibri" w:eastAsia="Calibri" w:cs="Calibri"/>
                 <w:sz w:val="24"/>
                 <w:szCs w:val="24"/>
                 <w:lang w:val="es-CL" w:eastAsia="es-CL"/>
@@ -8136,7 +8218,7 @@
             </w:r>
             <w:r>
               <w:rPr>
-                <w:rFonts w:asciiTheme="minorHAnsi" w:eastAsiaTheme="minorEastAsia" w:hAnsiTheme="minorHAnsi" w:cstheme="minorBidi"/>
+                <w:rFonts w:asciiTheme="minorHAnsi" w:eastAsiaTheme="minorEastAsia" w:hAnsiTheme="minorHAnsi" w:cstheme="minorBidi" w:ascii="Calibri" w:hAnsi="Calibri" w:eastAsia="Calibri" w:cs="Calibri"/>
                 <w:b/>
                 <w:bCs/>
                 <w:sz w:val="24"/>
@@ -8157,7 +8239,7 @@
             </w:pPr>
             <w:r>
               <w:rPr>
-                <w:rFonts w:asciiTheme="minorHAnsi" w:eastAsiaTheme="minorEastAsia" w:hAnsiTheme="minorHAnsi" w:cstheme="minorBidi"/>
+                <w:rFonts w:asciiTheme="minorHAnsi" w:eastAsiaTheme="minorEastAsia" w:hAnsiTheme="minorHAnsi" w:cstheme="minorBidi" w:ascii="Calibri" w:hAnsi="Calibri" w:eastAsia="Calibri" w:cs="Calibri"/>
                 <w:b/>
                 <w:bCs/>
                 <w:sz w:val="24"/>
@@ -8178,7 +8260,7 @@
             </w:pPr>
             <w:r>
               <w:rPr>
-                <w:rFonts w:asciiTheme="minorHAnsi" w:eastAsiaTheme="minorEastAsia" w:hAnsiTheme="minorHAnsi" w:cstheme="minorBidi"/>
+                <w:rFonts w:asciiTheme="minorHAnsi" w:eastAsiaTheme="minorEastAsia" w:hAnsiTheme="minorHAnsi" w:cstheme="minorBidi" w:ascii="Calibri" w:hAnsi="Calibri" w:eastAsia="Calibri" w:cs="Calibri"/>
                 <w:sz w:val="24"/>
                 <w:szCs w:val="24"/>
                 <w:lang w:val="es-CL" w:eastAsia="es-CL"/>
@@ -8187,7 +8269,7 @@
             </w:r>
             <w:r>
               <w:rPr>
-                <w:rFonts w:asciiTheme="minorHAnsi" w:eastAsiaTheme="minorEastAsia" w:hAnsiTheme="minorHAnsi" w:cstheme="minorBidi"/>
+                <w:rFonts w:asciiTheme="minorHAnsi" w:eastAsiaTheme="minorEastAsia" w:hAnsiTheme="minorHAnsi" w:cstheme="minorBidi" w:ascii="Calibri" w:hAnsi="Calibri" w:eastAsia="Calibri" w:cs="Calibri"/>
                 <w:b/>
                 <w:bCs/>
                 <w:sz w:val="24"/>
@@ -8198,7 +8280,7 @@
             </w:r>
             <w:r>
               <w:rPr>
-                <w:rFonts w:asciiTheme="minorHAnsi" w:eastAsiaTheme="minorEastAsia" w:hAnsiTheme="minorHAnsi" w:cstheme="minorBidi"/>
+                <w:rFonts w:asciiTheme="minorHAnsi" w:eastAsiaTheme="minorEastAsia" w:hAnsiTheme="minorHAnsi" w:cstheme="minorBidi" w:ascii="Calibri" w:hAnsi="Calibri" w:eastAsia="Calibri" w:cs="Calibri"/>
                 <w:sz w:val="24"/>
                 <w:szCs w:val="24"/>
                 <w:lang w:val="es-CL" w:eastAsia="es-CL"/>
@@ -8217,7 +8299,7 @@
             </w:pPr>
             <w:r>
               <w:rPr>
-                <w:rFonts w:asciiTheme="minorHAnsi" w:eastAsiaTheme="minorEastAsia" w:hAnsiTheme="minorHAnsi" w:cstheme="minorBidi"/>
+                <w:rFonts w:asciiTheme="minorHAnsi" w:eastAsiaTheme="minorEastAsia" w:hAnsiTheme="minorHAnsi" w:cstheme="minorBidi" w:ascii="Calibri" w:hAnsi="Calibri" w:eastAsia="Calibri" w:cs="Calibri"/>
                 <w:b/>
                 <w:bCs/>
                 <w:sz w:val="24"/>
@@ -8238,7 +8320,7 @@
             </w:pPr>
             <w:r>
               <w:rPr>
-                <w:rFonts w:asciiTheme="minorHAnsi" w:eastAsiaTheme="minorEastAsia" w:hAnsiTheme="minorHAnsi" w:cstheme="minorBidi"/>
+                <w:rFonts w:asciiTheme="minorHAnsi" w:eastAsiaTheme="minorEastAsia" w:hAnsiTheme="minorHAnsi" w:cstheme="minorBidi" w:ascii="Calibri" w:hAnsi="Calibri" w:eastAsia="Calibri" w:cs="Calibri"/>
                 <w:sz w:val="24"/>
                 <w:szCs w:val="24"/>
                 <w:lang w:val="es-CL" w:eastAsia="es-CL"/>
@@ -8247,7 +8329,7 @@
             </w:r>
             <w:r>
               <w:rPr>
-                <w:rFonts w:asciiTheme="minorHAnsi" w:eastAsiaTheme="minorEastAsia" w:hAnsiTheme="minorHAnsi" w:cstheme="minorBidi"/>
+                <w:rFonts w:asciiTheme="minorHAnsi" w:eastAsiaTheme="minorEastAsia" w:hAnsiTheme="minorHAnsi" w:cstheme="minorBidi" w:ascii="Calibri" w:hAnsi="Calibri" w:eastAsia="Calibri" w:cs="Calibri"/>
                 <w:sz w:val="24"/>
                 <w:szCs w:val="24"/>
                 <w:lang w:val="es-CL" w:eastAsia="es-CL"/>
@@ -8287,7 +8369,7 @@
             </w:pPr>
             <w:r>
               <w:rPr>
-                <w:rFonts w:asciiTheme="minorHAnsi" w:eastAsiaTheme="minorEastAsia" w:hAnsiTheme="minorHAnsi" w:cstheme="minorBidi"/>
+                <w:rFonts w:asciiTheme="minorHAnsi" w:eastAsiaTheme="minorEastAsia" w:hAnsiTheme="minorHAnsi" w:cstheme="minorBidi" w:ascii="Calibri" w:hAnsi="Calibri" w:eastAsia="Calibri" w:cs="Calibri"/>
                 <w:b/>
                 <w:bCs/>
                 <w:sz w:val="24"/>
@@ -8308,7 +8390,7 @@
             </w:pPr>
             <w:r>
               <w:rPr>
-                <w:rFonts w:asciiTheme="minorHAnsi" w:eastAsiaTheme="minorEastAsia" w:hAnsiTheme="minorHAnsi" w:cstheme="minorBidi"/>
+                <w:rFonts w:asciiTheme="minorHAnsi" w:eastAsiaTheme="minorEastAsia" w:hAnsiTheme="minorHAnsi" w:cstheme="minorBidi" w:ascii="Calibri" w:hAnsi="Calibri" w:eastAsia="Calibri" w:cs="Calibri"/>
                 <w:sz w:val="24"/>
                 <w:szCs w:val="24"/>
                 <w:lang w:val="es-CL" w:eastAsia="es-CL"/>
@@ -8317,7 +8399,7 @@
             </w:r>
             <w:r>
               <w:rPr>
-                <w:rFonts w:asciiTheme="minorHAnsi" w:eastAsiaTheme="minorEastAsia" w:hAnsiTheme="minorHAnsi" w:cstheme="minorBidi"/>
+                <w:rFonts w:asciiTheme="minorHAnsi" w:eastAsiaTheme="minorEastAsia" w:hAnsiTheme="minorHAnsi" w:cstheme="minorBidi" w:ascii="Calibri" w:hAnsi="Calibri" w:eastAsia="Calibri" w:cs="Calibri"/>
                 <w:b/>
                 <w:bCs/>
                 <w:sz w:val="24"/>
@@ -8328,7 +8410,7 @@
             </w:r>
             <w:r>
               <w:rPr>
-                <w:rFonts w:asciiTheme="minorHAnsi" w:eastAsiaTheme="minorEastAsia" w:hAnsiTheme="minorHAnsi" w:cstheme="minorBidi"/>
+                <w:rFonts w:asciiTheme="minorHAnsi" w:eastAsiaTheme="minorEastAsia" w:hAnsiTheme="minorHAnsi" w:cstheme="minorBidi" w:ascii="Calibri" w:hAnsi="Calibri" w:eastAsia="Calibri" w:cs="Calibri"/>
                 <w:sz w:val="24"/>
                 <w:szCs w:val="24"/>
                 <w:lang w:val="es-CL" w:eastAsia="es-CL"/>
@@ -8347,7 +8429,7 @@
             </w:pPr>
             <w:r>
               <w:rPr>
-                <w:rFonts w:asciiTheme="minorHAnsi" w:eastAsiaTheme="minorEastAsia" w:hAnsiTheme="minorHAnsi" w:cstheme="minorBidi"/>
+                <w:rFonts w:asciiTheme="minorHAnsi" w:eastAsiaTheme="minorEastAsia" w:hAnsiTheme="minorHAnsi" w:cstheme="minorBidi" w:ascii="Calibri" w:hAnsi="Calibri" w:eastAsia="Calibri" w:cs="Calibri"/>
                 <w:b/>
                 <w:bCs/>
                 <w:sz w:val="24"/>
@@ -8368,7 +8450,7 @@
             </w:pPr>
             <w:r>
               <w:rPr>
-                <w:rFonts w:asciiTheme="minorHAnsi" w:eastAsiaTheme="minorEastAsia" w:hAnsiTheme="minorHAnsi" w:cstheme="minorBidi"/>
+                <w:rFonts w:asciiTheme="minorHAnsi" w:eastAsiaTheme="minorEastAsia" w:hAnsiTheme="minorHAnsi" w:cstheme="minorBidi" w:ascii="Calibri" w:hAnsi="Calibri" w:eastAsia="Calibri" w:cs="Calibri"/>
                 <w:sz w:val="24"/>
                 <w:szCs w:val="24"/>
                 <w:lang w:val="es-CL" w:eastAsia="es-CL"/>
@@ -8378,7 +8460,7 @@
             <w:proofErr w:type="spellStart"/>
             <w:r>
               <w:rPr>
-                <w:rFonts w:asciiTheme="minorHAnsi" w:eastAsiaTheme="minorEastAsia" w:hAnsiTheme="minorHAnsi" w:cstheme="minorBidi"/>
+                <w:rFonts w:asciiTheme="minorHAnsi" w:eastAsiaTheme="minorEastAsia" w:hAnsiTheme="minorHAnsi" w:cstheme="minorBidi" w:ascii="Calibri" w:hAnsi="Calibri" w:eastAsia="Calibri" w:cs="Calibri"/>
                 <w:sz w:val="24"/>
                 <w:szCs w:val="24"/>
                 <w:lang w:val="es-CL" w:eastAsia="es-CL"/>
@@ -8388,7 +8470,7 @@
             <w:proofErr w:type="spellEnd"/>
             <w:r>
               <w:rPr>
-                <w:rFonts w:asciiTheme="minorHAnsi" w:eastAsiaTheme="minorEastAsia" w:hAnsiTheme="minorHAnsi" w:cstheme="minorBidi"/>
+                <w:rFonts w:asciiTheme="minorHAnsi" w:eastAsiaTheme="minorEastAsia" w:hAnsiTheme="minorHAnsi" w:cstheme="minorBidi" w:ascii="Calibri" w:hAnsi="Calibri" w:eastAsia="Calibri" w:cs="Calibri"/>
                 <w:sz w:val="24"/>
                 <w:szCs w:val="24"/>
                 <w:lang w:val="es-CL" w:eastAsia="es-CL"/>
@@ -8407,7 +8489,7 @@
             </w:pPr>
             <w:r>
               <w:rPr>
-                <w:rFonts w:asciiTheme="minorHAnsi" w:eastAsiaTheme="minorEastAsia" w:hAnsiTheme="minorHAnsi" w:cstheme="minorBidi"/>
+                <w:rFonts w:asciiTheme="minorHAnsi" w:eastAsiaTheme="minorEastAsia" w:hAnsiTheme="minorHAnsi" w:cstheme="minorBidi" w:ascii="Calibri" w:hAnsi="Calibri" w:eastAsia="Calibri" w:cs="Calibri"/>
                 <w:b/>
                 <w:bCs/>
                 <w:sz w:val="24"/>
@@ -8428,7 +8510,7 @@
             </w:pPr>
             <w:r>
               <w:rPr>
-                <w:rFonts w:asciiTheme="minorHAnsi" w:eastAsiaTheme="minorEastAsia" w:hAnsiTheme="minorHAnsi" w:cstheme="minorBidi"/>
+                <w:rFonts w:asciiTheme="minorHAnsi" w:eastAsiaTheme="minorEastAsia" w:hAnsiTheme="minorHAnsi" w:cstheme="minorBidi" w:ascii="Calibri" w:hAnsi="Calibri" w:eastAsia="Calibri" w:cs="Calibri"/>
                 <w:sz w:val="24"/>
                 <w:szCs w:val="24"/>
                 <w:lang w:val="es-CL" w:eastAsia="es-CL"/>
@@ -8447,7 +8529,7 @@
             </w:pPr>
             <w:r>
               <w:rPr>
-                <w:rFonts w:asciiTheme="minorHAnsi" w:eastAsiaTheme="minorEastAsia" w:hAnsiTheme="minorHAnsi" w:cstheme="minorBidi"/>
+                <w:rFonts w:asciiTheme="minorHAnsi" w:eastAsiaTheme="minorEastAsia" w:hAnsiTheme="minorHAnsi" w:cstheme="minorBidi" w:ascii="Calibri" w:hAnsi="Calibri" w:eastAsia="Calibri" w:cs="Calibri"/>
                 <w:b/>
                 <w:bCs/>
                 <w:sz w:val="24"/>
@@ -8468,7 +8550,7 @@
             </w:pPr>
             <w:r>
               <w:rPr>
-                <w:rFonts w:asciiTheme="minorHAnsi" w:eastAsiaTheme="minorEastAsia" w:hAnsiTheme="minorHAnsi" w:cstheme="minorBidi"/>
+                <w:rFonts w:asciiTheme="minorHAnsi" w:eastAsiaTheme="minorEastAsia" w:hAnsiTheme="minorHAnsi" w:cstheme="minorBidi" w:ascii="Calibri" w:hAnsi="Calibri" w:eastAsia="Calibri" w:cs="Calibri"/>
                 <w:sz w:val="24"/>
                 <w:szCs w:val="24"/>
                 <w:lang w:val="es-CL" w:eastAsia="es-CL"/>
@@ -8487,7 +8569,7 @@
             </w:pPr>
             <w:r>
               <w:rPr>
-                <w:rFonts w:asciiTheme="minorHAnsi" w:eastAsiaTheme="minorEastAsia" w:hAnsiTheme="minorHAnsi" w:cstheme="minorBidi"/>
+                <w:rFonts w:asciiTheme="minorHAnsi" w:eastAsiaTheme="minorEastAsia" w:hAnsiTheme="minorHAnsi" w:cstheme="minorBidi" w:ascii="Calibri" w:hAnsi="Calibri" w:eastAsia="Calibri" w:cs="Calibri"/>
                 <w:b/>
                 <w:bCs/>
                 <w:sz w:val="24"/>
@@ -8508,7 +8590,7 @@
             </w:pPr>
             <w:r>
               <w:rPr>
-                <w:rFonts w:asciiTheme="minorHAnsi" w:eastAsiaTheme="minorEastAsia" w:hAnsiTheme="minorHAnsi" w:cstheme="minorBidi"/>
+                <w:rFonts w:asciiTheme="minorHAnsi" w:eastAsiaTheme="minorEastAsia" w:hAnsiTheme="minorHAnsi" w:cstheme="minorBidi" w:ascii="Calibri" w:hAnsi="Calibri" w:eastAsia="Calibri" w:cs="Calibri"/>
                 <w:sz w:val="24"/>
                 <w:szCs w:val="24"/>
                 <w:lang w:val="es-CL" w:eastAsia="es-CL"/>
@@ -8527,7 +8609,7 @@
             </w:pPr>
             <w:r>
               <w:rPr>
-                <w:rFonts w:asciiTheme="minorHAnsi" w:eastAsiaTheme="minorEastAsia" w:hAnsiTheme="minorHAnsi" w:cstheme="minorBidi"/>
+                <w:rFonts w:asciiTheme="minorHAnsi" w:eastAsiaTheme="minorEastAsia" w:hAnsiTheme="minorHAnsi" w:cstheme="minorBidi" w:ascii="Calibri" w:hAnsi="Calibri" w:eastAsia="Calibri" w:cs="Calibri"/>
                 <w:sz w:val="24"/>
                 <w:szCs w:val="24"/>
                 <w:lang w:val="es-CL" w:eastAsia="es-CL"/>
@@ -8576,7 +8658,7 @@
             </w:pPr>
             <w:r>
               <w:rPr>
-                <w:rFonts w:asciiTheme="minorHAnsi" w:eastAsiaTheme="minorEastAsia" w:hAnsiTheme="minorHAnsi" w:cstheme="minorBidi"/>
+                <w:rFonts w:asciiTheme="minorHAnsi" w:eastAsiaTheme="minorEastAsia" w:hAnsiTheme="minorHAnsi" w:cstheme="minorBidi" w:ascii="Calibri" w:hAnsi="Calibri" w:eastAsia="Calibri" w:cs="Calibri"/>
                 <w:b/>
                 <w:bCs/>
                 <w:sz w:val="24"/>
@@ -8597,7 +8679,7 @@
             </w:pPr>
             <w:r>
               <w:rPr>
-                <w:rFonts w:asciiTheme="minorHAnsi" w:eastAsiaTheme="minorEastAsia" w:hAnsiTheme="minorHAnsi" w:cstheme="minorBidi"/>
+                <w:rFonts w:asciiTheme="minorHAnsi" w:eastAsiaTheme="minorEastAsia" w:hAnsiTheme="minorHAnsi" w:cstheme="minorBidi" w:ascii="Calibri" w:hAnsi="Calibri" w:eastAsia="Calibri" w:cs="Calibri"/>
                 <w:sz w:val="24"/>
                 <w:szCs w:val="24"/>
                 <w:lang w:val="es-CL" w:eastAsia="es-CL"/>
@@ -8606,7 +8688,7 @@
             </w:r>
             <w:r>
               <w:rPr>
-                <w:rFonts w:asciiTheme="minorHAnsi" w:eastAsiaTheme="minorEastAsia" w:hAnsiTheme="minorHAnsi" w:cstheme="minorBidi"/>
+                <w:rFonts w:asciiTheme="minorHAnsi" w:eastAsiaTheme="minorEastAsia" w:hAnsiTheme="minorHAnsi" w:cstheme="minorBidi" w:ascii="Calibri" w:hAnsi="Calibri" w:eastAsia="Calibri" w:cs="Calibri"/>
                 <w:b/>
                 <w:bCs/>
                 <w:sz w:val="24"/>
@@ -8617,7 +8699,7 @@
             </w:r>
             <w:r>
               <w:rPr>
-                <w:rFonts w:asciiTheme="minorHAnsi" w:eastAsiaTheme="minorEastAsia" w:hAnsiTheme="minorHAnsi" w:cstheme="minorBidi"/>
+                <w:rFonts w:asciiTheme="minorHAnsi" w:eastAsiaTheme="minorEastAsia" w:hAnsiTheme="minorHAnsi" w:cstheme="minorBidi" w:ascii="Calibri" w:hAnsi="Calibri" w:eastAsia="Calibri" w:cs="Calibri"/>
                 <w:sz w:val="24"/>
                 <w:szCs w:val="24"/>
                 <w:lang w:val="es-CL" w:eastAsia="es-CL"/>
@@ -8636,7 +8718,7 @@
             </w:pPr>
             <w:r>
               <w:rPr>
-                <w:rFonts w:asciiTheme="minorHAnsi" w:eastAsiaTheme="minorEastAsia" w:hAnsiTheme="minorHAnsi" w:cstheme="minorBidi"/>
+                <w:rFonts w:asciiTheme="minorHAnsi" w:eastAsiaTheme="minorEastAsia" w:hAnsiTheme="minorHAnsi" w:cstheme="minorBidi" w:ascii="Calibri" w:hAnsi="Calibri" w:eastAsia="Calibri" w:cs="Calibri"/>
                 <w:b/>
                 <w:bCs/>
                 <w:sz w:val="24"/>
@@ -8657,7 +8739,7 @@
             </w:pPr>
             <w:r>
               <w:rPr>
-                <w:rFonts w:asciiTheme="minorHAnsi" w:eastAsiaTheme="minorEastAsia" w:hAnsiTheme="minorHAnsi" w:cstheme="minorBidi"/>
+                <w:rFonts w:asciiTheme="minorHAnsi" w:eastAsiaTheme="minorEastAsia" w:hAnsiTheme="minorHAnsi" w:cstheme="minorBidi" w:ascii="Calibri" w:hAnsi="Calibri" w:eastAsia="Calibri" w:cs="Calibri"/>
                 <w:sz w:val="24"/>
                 <w:szCs w:val="24"/>
                 <w:lang w:val="es-CL" w:eastAsia="es-CL"/>
@@ -8680,7 +8762,7 @@
             </w:pPr>
             <w:r>
               <w:rPr>
-                <w:rFonts w:asciiTheme="minorHAnsi" w:eastAsiaTheme="minorEastAsia" w:hAnsiTheme="minorHAnsi" w:cstheme="minorBidi"/>
+                <w:rFonts w:asciiTheme="minorHAnsi" w:eastAsiaTheme="minorEastAsia" w:hAnsiTheme="minorHAnsi" w:cstheme="minorBidi" w:ascii="Calibri" w:hAnsi="Calibri" w:eastAsia="Calibri" w:cs="Calibri"/>
                 <w:sz w:val="24"/>
                 <w:szCs w:val="24"/>
                 <w:lang w:val="es-CL" w:eastAsia="es-CL"/>
@@ -8703,7 +8785,7 @@
             </w:pPr>
             <w:r>
               <w:rPr>
-                <w:rFonts w:asciiTheme="minorHAnsi" w:eastAsiaTheme="minorEastAsia" w:hAnsiTheme="minorHAnsi" w:cstheme="minorBidi"/>
+                <w:rFonts w:asciiTheme="minorHAnsi" w:eastAsiaTheme="minorEastAsia" w:hAnsiTheme="minorHAnsi" w:cstheme="minorBidi" w:ascii="Calibri" w:hAnsi="Calibri" w:eastAsia="Calibri" w:cs="Calibri"/>
                 <w:sz w:val="24"/>
                 <w:szCs w:val="24"/>
                 <w:lang w:val="es-CL" w:eastAsia="es-CL"/>
@@ -8726,7 +8808,7 @@
             </w:pPr>
             <w:r>
               <w:rPr>
-                <w:rFonts w:asciiTheme="minorHAnsi" w:eastAsiaTheme="minorEastAsia" w:hAnsiTheme="minorHAnsi" w:cstheme="minorBidi"/>
+                <w:rFonts w:asciiTheme="minorHAnsi" w:eastAsiaTheme="minorEastAsia" w:hAnsiTheme="minorHAnsi" w:cstheme="minorBidi" w:ascii="Calibri" w:hAnsi="Calibri" w:eastAsia="Calibri" w:cs="Calibri"/>
                 <w:sz w:val="24"/>
                 <w:szCs w:val="24"/>
                 <w:lang w:val="es-CL" w:eastAsia="es-CL"/>
@@ -8745,7 +8827,7 @@
             </w:pPr>
             <w:r>
               <w:rPr>
-                <w:rFonts w:asciiTheme="minorHAnsi" w:eastAsiaTheme="minorEastAsia" w:hAnsiTheme="minorHAnsi" w:cstheme="minorBidi"/>
+                <w:rFonts w:asciiTheme="minorHAnsi" w:eastAsiaTheme="minorEastAsia" w:hAnsiTheme="minorHAnsi" w:cstheme="minorBidi" w:ascii="Calibri" w:hAnsi="Calibri" w:eastAsia="Calibri" w:cs="Calibri"/>
                 <w:sz w:val="24"/>
                 <w:szCs w:val="24"/>
                 <w:lang w:val="es-CL" w:eastAsia="es-CL"/>
@@ -8755,7 +8837,7 @@
             <w:proofErr w:type="spellStart"/>
             <w:r>
               <w:rPr>
-                <w:rFonts w:asciiTheme="minorHAnsi" w:eastAsiaTheme="minorEastAsia" w:hAnsiTheme="minorHAnsi" w:cstheme="minorBidi"/>
+                <w:rFonts w:asciiTheme="minorHAnsi" w:eastAsiaTheme="minorEastAsia" w:hAnsiTheme="minorHAnsi" w:cstheme="minorBidi" w:ascii="Calibri" w:hAnsi="Calibri" w:eastAsia="Calibri" w:cs="Calibri"/>
                 <w:sz w:val="24"/>
                 <w:szCs w:val="24"/>
                 <w:lang w:val="es-CL" w:eastAsia="es-CL"/>
@@ -8765,7 +8847,7 @@
             <w:proofErr w:type="spellEnd"/>
             <w:r>
               <w:rPr>
-                <w:rFonts w:asciiTheme="minorHAnsi" w:eastAsiaTheme="minorEastAsia" w:hAnsiTheme="minorHAnsi" w:cstheme="minorBidi"/>
+                <w:rFonts w:asciiTheme="minorHAnsi" w:eastAsiaTheme="minorEastAsia" w:hAnsiTheme="minorHAnsi" w:cstheme="minorBidi" w:ascii="Calibri" w:hAnsi="Calibri" w:eastAsia="Calibri" w:cs="Calibri"/>
                 <w:sz w:val="24"/>
                 <w:szCs w:val="24"/>
                 <w:lang w:val="es-CL" w:eastAsia="es-CL"/>
@@ -8784,7 +8866,7 @@
             </w:pPr>
             <w:r>
               <w:rPr>
-                <w:rFonts w:asciiTheme="minorHAnsi" w:eastAsiaTheme="minorEastAsia" w:hAnsiTheme="minorHAnsi" w:cstheme="minorBidi"/>
+                <w:rFonts w:asciiTheme="minorHAnsi" w:eastAsiaTheme="minorEastAsia" w:hAnsiTheme="minorHAnsi" w:cstheme="minorBidi" w:ascii="Calibri" w:hAnsi="Calibri" w:eastAsia="Calibri" w:cs="Calibri"/>
                 <w:b/>
                 <w:bCs/>
                 <w:sz w:val="24"/>
@@ -8795,7 +8877,7 @@
             </w:r>
             <w:r>
               <w:rPr>
-                <w:rFonts w:asciiTheme="minorHAnsi" w:eastAsiaTheme="minorEastAsia" w:hAnsiTheme="minorHAnsi" w:cstheme="minorBidi"/>
+                <w:rFonts w:asciiTheme="minorHAnsi" w:eastAsiaTheme="minorEastAsia" w:hAnsiTheme="minorHAnsi" w:cstheme="minorBidi" w:ascii="Calibri" w:hAnsi="Calibri" w:eastAsia="Calibri" w:cs="Calibri"/>
                 <w:sz w:val="24"/>
                 <w:szCs w:val="24"/>
                 <w:lang w:val="es-CL" w:eastAsia="es-CL"/>
@@ -8814,7 +8896,7 @@
             </w:pPr>
             <w:r>
               <w:rPr>
-                <w:rFonts w:asciiTheme="minorHAnsi" w:eastAsiaTheme="minorEastAsia" w:hAnsiTheme="minorHAnsi" w:cstheme="minorBidi"/>
+                <w:rFonts w:asciiTheme="minorHAnsi" w:eastAsiaTheme="minorEastAsia" w:hAnsiTheme="minorHAnsi" w:cstheme="minorBidi" w:ascii="Calibri" w:hAnsi="Calibri" w:eastAsia="Calibri" w:cs="Calibri"/>
                 <w:b/>
                 <w:bCs/>
                 <w:sz w:val="24"/>
@@ -8835,7 +8917,7 @@
             </w:pPr>
             <w:r>
               <w:rPr>
-                <w:rFonts w:asciiTheme="minorHAnsi" w:eastAsiaTheme="minorEastAsia" w:hAnsiTheme="minorHAnsi" w:cstheme="minorBidi"/>
+                <w:rFonts w:asciiTheme="minorHAnsi" w:eastAsiaTheme="minorEastAsia" w:hAnsiTheme="minorHAnsi" w:cstheme="minorBidi" w:ascii="Calibri" w:hAnsi="Calibri" w:eastAsia="Calibri" w:cs="Calibri"/>
                 <w:sz w:val="24"/>
                 <w:szCs w:val="24"/>
                 <w:lang w:val="es-CL" w:eastAsia="es-CL"/>
@@ -8845,7 +8927,7 @@
             <w:proofErr w:type="spellStart"/>
             <w:r>
               <w:rPr>
-                <w:rFonts w:asciiTheme="minorHAnsi" w:eastAsiaTheme="minorEastAsia" w:hAnsiTheme="minorHAnsi" w:cstheme="minorBidi"/>
+                <w:rFonts w:asciiTheme="minorHAnsi" w:eastAsiaTheme="minorEastAsia" w:hAnsiTheme="minorHAnsi" w:cstheme="minorBidi" w:ascii="Calibri" w:hAnsi="Calibri" w:eastAsia="Calibri" w:cs="Calibri"/>
                 <w:sz w:val="24"/>
                 <w:szCs w:val="24"/>
                 <w:lang w:val="es-CL" w:eastAsia="es-CL"/>
@@ -8855,7 +8937,7 @@
             <w:proofErr w:type="spellEnd"/>
             <w:r>
               <w:rPr>
-                <w:rFonts w:asciiTheme="minorHAnsi" w:eastAsiaTheme="minorEastAsia" w:hAnsiTheme="minorHAnsi" w:cstheme="minorBidi"/>
+                <w:rFonts w:asciiTheme="minorHAnsi" w:eastAsiaTheme="minorEastAsia" w:hAnsiTheme="minorHAnsi" w:cstheme="minorBidi" w:ascii="Calibri" w:hAnsi="Calibri" w:eastAsia="Calibri" w:cs="Calibri"/>
                 <w:sz w:val="24"/>
                 <w:szCs w:val="24"/>
                 <w:lang w:val="es-CL" w:eastAsia="es-CL"/>
@@ -8865,7 +8947,7 @@
             <w:proofErr w:type="spellStart"/>
             <w:r>
               <w:rPr>
-                <w:rFonts w:asciiTheme="minorHAnsi" w:eastAsiaTheme="minorEastAsia" w:hAnsiTheme="minorHAnsi" w:cstheme="minorBidi"/>
+                <w:rFonts w:asciiTheme="minorHAnsi" w:eastAsiaTheme="minorEastAsia" w:hAnsiTheme="minorHAnsi" w:cstheme="minorBidi" w:ascii="Calibri" w:hAnsi="Calibri" w:eastAsia="Calibri" w:cs="Calibri"/>
                 <w:sz w:val="24"/>
                 <w:szCs w:val="24"/>
                 <w:lang w:val="es-CL" w:eastAsia="es-CL"/>
@@ -8875,7 +8957,7 @@
             <w:proofErr w:type="spellEnd"/>
             <w:r>
               <w:rPr>
-                <w:rFonts w:asciiTheme="minorHAnsi" w:eastAsiaTheme="minorEastAsia" w:hAnsiTheme="minorHAnsi" w:cstheme="minorBidi"/>
+                <w:rFonts w:asciiTheme="minorHAnsi" w:eastAsiaTheme="minorEastAsia" w:hAnsiTheme="minorHAnsi" w:cstheme="minorBidi" w:ascii="Calibri" w:hAnsi="Calibri" w:eastAsia="Calibri" w:cs="Calibri"/>
                 <w:sz w:val="24"/>
                 <w:szCs w:val="24"/>
                 <w:lang w:val="es-CL" w:eastAsia="es-CL"/>
@@ -8885,7 +8967,7 @@
             <w:proofErr w:type="spellStart"/>
             <w:r>
               <w:rPr>
-                <w:rFonts w:asciiTheme="minorHAnsi" w:eastAsiaTheme="minorEastAsia" w:hAnsiTheme="minorHAnsi" w:cstheme="minorBidi"/>
+                <w:rFonts w:asciiTheme="minorHAnsi" w:eastAsiaTheme="minorEastAsia" w:hAnsiTheme="minorHAnsi" w:cstheme="minorBidi" w:ascii="Calibri" w:hAnsi="Calibri" w:eastAsia="Calibri" w:cs="Calibri"/>
                 <w:sz w:val="24"/>
                 <w:szCs w:val="24"/>
                 <w:lang w:val="es-CL" w:eastAsia="es-CL"/>
@@ -8895,7 +8977,7 @@
             <w:proofErr w:type="spellEnd"/>
             <w:r>
               <w:rPr>
-                <w:rFonts w:asciiTheme="minorHAnsi" w:eastAsiaTheme="minorEastAsia" w:hAnsiTheme="minorHAnsi" w:cstheme="minorBidi"/>
+                <w:rFonts w:asciiTheme="minorHAnsi" w:eastAsiaTheme="minorEastAsia" w:hAnsiTheme="minorHAnsi" w:cstheme="minorBidi" w:ascii="Calibri" w:hAnsi="Calibri" w:eastAsia="Calibri" w:cs="Calibri"/>
                 <w:sz w:val="24"/>
                 <w:szCs w:val="24"/>
                 <w:lang w:val="es-CL" w:eastAsia="es-CL"/>
@@ -8914,7 +8996,7 @@
             </w:pPr>
             <w:r>
               <w:rPr>
-                <w:rFonts w:asciiTheme="minorHAnsi" w:eastAsiaTheme="minorEastAsia" w:hAnsiTheme="minorHAnsi" w:cstheme="minorBidi"/>
+                <w:rFonts w:asciiTheme="minorHAnsi" w:eastAsiaTheme="minorEastAsia" w:hAnsiTheme="minorHAnsi" w:cstheme="minorBidi" w:ascii="Calibri" w:hAnsi="Calibri" w:eastAsia="Calibri" w:cs="Calibri"/>
                 <w:sz w:val="24"/>
                 <w:szCs w:val="24"/>
                 <w:lang w:val="es-CL" w:eastAsia="es-CL"/>
@@ -8933,7 +9015,7 @@
             </w:pPr>
             <w:r>
               <w:rPr>
-                <w:rFonts w:asciiTheme="minorHAnsi" w:eastAsiaTheme="minorEastAsia" w:hAnsiTheme="minorHAnsi" w:cstheme="minorBidi"/>
+                <w:rFonts w:asciiTheme="minorHAnsi" w:eastAsiaTheme="minorEastAsia" w:hAnsiTheme="minorHAnsi" w:cstheme="minorBidi" w:ascii="Calibri" w:hAnsi="Calibri" w:eastAsia="Calibri" w:cs="Calibri"/>
                 <w:sz w:val="24"/>
                 <w:szCs w:val="24"/>
                 <w:lang w:val="es-CL" w:eastAsia="es-CL"/>
@@ -8942,7 +9024,7 @@
             </w:r>
             <w:r>
               <w:rPr>
-                <w:rFonts w:asciiTheme="minorHAnsi" w:eastAsiaTheme="minorEastAsia" w:hAnsiTheme="minorHAnsi" w:cstheme="minorBidi"/>
+                <w:rFonts w:asciiTheme="minorHAnsi" w:eastAsiaTheme="minorEastAsia" w:hAnsiTheme="minorHAnsi" w:cstheme="minorBidi" w:ascii="Calibri" w:hAnsi="Calibri" w:eastAsia="Calibri" w:cs="Calibri"/>
                 <w:b/>
                 <w:bCs/>
                 <w:sz w:val="24"/>
@@ -8953,7 +9035,7 @@
             </w:r>
             <w:r>
               <w:rPr>
-                <w:rFonts w:asciiTheme="minorHAnsi" w:eastAsiaTheme="minorEastAsia" w:hAnsiTheme="minorHAnsi" w:cstheme="minorBidi"/>
+                <w:rFonts w:asciiTheme="minorHAnsi" w:eastAsiaTheme="minorEastAsia" w:hAnsiTheme="minorHAnsi" w:cstheme="minorBidi" w:ascii="Calibri" w:hAnsi="Calibri" w:eastAsia="Calibri" w:cs="Calibri"/>
                 <w:sz w:val="24"/>
                 <w:szCs w:val="24"/>
                 <w:lang w:val="es-CL" w:eastAsia="es-CL"/>
@@ -8972,7 +9054,7 @@
             </w:pPr>
             <w:r>
               <w:rPr>
-                <w:rFonts w:asciiTheme="minorHAnsi" w:eastAsiaTheme="minorEastAsia" w:hAnsiTheme="minorHAnsi" w:cstheme="minorBidi"/>
+                <w:rFonts w:asciiTheme="minorHAnsi" w:eastAsiaTheme="minorEastAsia" w:hAnsiTheme="minorHAnsi" w:cstheme="minorBidi" w:ascii="Calibri" w:hAnsi="Calibri" w:eastAsia="Calibri" w:cs="Calibri"/>
                 <w:b/>
                 <w:bCs/>
                 <w:sz w:val="24"/>
@@ -8993,7 +9075,7 @@
             </w:pPr>
             <w:r>
               <w:rPr>
-                <w:rFonts w:asciiTheme="minorHAnsi" w:eastAsiaTheme="minorEastAsia" w:hAnsiTheme="minorHAnsi" w:cstheme="minorBidi"/>
+                <w:rFonts w:asciiTheme="minorHAnsi" w:eastAsiaTheme="minorEastAsia" w:hAnsiTheme="minorHAnsi" w:cstheme="minorBidi" w:ascii="Calibri" w:hAnsi="Calibri" w:eastAsia="Calibri" w:cs="Calibri"/>
                 <w:sz w:val="24"/>
                 <w:szCs w:val="24"/>
                 <w:lang w:val="es-CL" w:eastAsia="es-CL"/>
@@ -9003,7 +9085,7 @@
             <w:proofErr w:type="spellStart"/>
             <w:r>
               <w:rPr>
-                <w:rFonts w:asciiTheme="minorHAnsi" w:eastAsiaTheme="minorEastAsia" w:hAnsiTheme="minorHAnsi" w:cstheme="minorBidi"/>
+                <w:rFonts w:asciiTheme="minorHAnsi" w:eastAsiaTheme="minorEastAsia" w:hAnsiTheme="minorHAnsi" w:cstheme="minorBidi" w:ascii="Calibri" w:hAnsi="Calibri" w:eastAsia="Calibri" w:cs="Calibri"/>
                 <w:sz w:val="24"/>
                 <w:szCs w:val="24"/>
                 <w:lang w:val="es-CL" w:eastAsia="es-CL"/>
@@ -9013,7 +9095,7 @@
             <w:proofErr w:type="spellEnd"/>
             <w:r>
               <w:rPr>
-                <w:rFonts w:asciiTheme="minorHAnsi" w:eastAsiaTheme="minorEastAsia" w:hAnsiTheme="minorHAnsi" w:cstheme="minorBidi"/>
+                <w:rFonts w:asciiTheme="minorHAnsi" w:eastAsiaTheme="minorEastAsia" w:hAnsiTheme="minorHAnsi" w:cstheme="minorBidi" w:ascii="Calibri" w:hAnsi="Calibri" w:eastAsia="Calibri" w:cs="Calibri"/>
                 <w:sz w:val="24"/>
                 <w:szCs w:val="24"/>
                 <w:lang w:val="es-CL" w:eastAsia="es-CL"/>
@@ -9023,7 +9105,7 @@
             <w:proofErr w:type="spellStart"/>
             <w:r>
               <w:rPr>
-                <w:rFonts w:asciiTheme="minorHAnsi" w:eastAsiaTheme="minorEastAsia" w:hAnsiTheme="minorHAnsi" w:cstheme="minorBidi"/>
+                <w:rFonts w:asciiTheme="minorHAnsi" w:eastAsiaTheme="minorEastAsia" w:hAnsiTheme="minorHAnsi" w:cstheme="minorBidi" w:ascii="Calibri" w:hAnsi="Calibri" w:eastAsia="Calibri" w:cs="Calibri"/>
                 <w:sz w:val="24"/>
                 <w:szCs w:val="24"/>
                 <w:lang w:val="es-CL" w:eastAsia="es-CL"/>
@@ -9033,7 +9115,7 @@
             <w:proofErr w:type="spellEnd"/>
             <w:r>
               <w:rPr>
-                <w:rFonts w:asciiTheme="minorHAnsi" w:eastAsiaTheme="minorEastAsia" w:hAnsiTheme="minorHAnsi" w:cstheme="minorBidi"/>
+                <w:rFonts w:asciiTheme="minorHAnsi" w:eastAsiaTheme="minorEastAsia" w:hAnsiTheme="minorHAnsi" w:cstheme="minorBidi" w:ascii="Calibri" w:hAnsi="Calibri" w:eastAsia="Calibri" w:cs="Calibri"/>
                 <w:sz w:val="24"/>
                 <w:szCs w:val="24"/>
                 <w:lang w:val="es-CL" w:eastAsia="es-CL"/>
@@ -9043,7 +9125,7 @@
             <w:proofErr w:type="spellStart"/>
             <w:r>
               <w:rPr>
-                <w:rFonts w:asciiTheme="minorHAnsi" w:eastAsiaTheme="minorEastAsia" w:hAnsiTheme="minorHAnsi" w:cstheme="minorBidi"/>
+                <w:rFonts w:asciiTheme="minorHAnsi" w:eastAsiaTheme="minorEastAsia" w:hAnsiTheme="minorHAnsi" w:cstheme="minorBidi" w:ascii="Calibri" w:hAnsi="Calibri" w:eastAsia="Calibri" w:cs="Calibri"/>
                 <w:sz w:val="24"/>
                 <w:szCs w:val="24"/>
                 <w:lang w:val="es-CL" w:eastAsia="es-CL"/>
@@ -9053,7 +9135,7 @@
             <w:proofErr w:type="spellEnd"/>
             <w:r>
               <w:rPr>
-                <w:rFonts w:asciiTheme="minorHAnsi" w:eastAsiaTheme="minorEastAsia" w:hAnsiTheme="minorHAnsi" w:cstheme="minorBidi"/>
+                <w:rFonts w:asciiTheme="minorHAnsi" w:eastAsiaTheme="minorEastAsia" w:hAnsiTheme="minorHAnsi" w:cstheme="minorBidi" w:ascii="Calibri" w:hAnsi="Calibri" w:eastAsia="Calibri" w:cs="Calibri"/>
                 <w:sz w:val="24"/>
                 <w:szCs w:val="24"/>
                 <w:lang w:val="es-CL" w:eastAsia="es-CL"/>
@@ -9072,7 +9154,7 @@
             </w:pPr>
             <w:r>
               <w:rPr>
-                <w:rFonts w:asciiTheme="minorHAnsi" w:eastAsiaTheme="minorEastAsia" w:hAnsiTheme="minorHAnsi" w:cstheme="minorBidi"/>
+                <w:rFonts w:asciiTheme="minorHAnsi" w:eastAsiaTheme="minorEastAsia" w:hAnsiTheme="minorHAnsi" w:cstheme="minorBidi" w:ascii="Calibri" w:hAnsi="Calibri" w:eastAsia="Calibri" w:cs="Calibri"/>
                 <w:sz w:val="24"/>
                 <w:szCs w:val="24"/>
                 <w:lang w:val="es-CL" w:eastAsia="es-CL"/>
@@ -9081,7 +9163,7 @@
             </w:r>
             <w:r>
               <w:rPr>
-                <w:rFonts w:asciiTheme="minorHAnsi" w:eastAsiaTheme="minorEastAsia" w:hAnsiTheme="minorHAnsi" w:cstheme="minorBidi"/>
+                <w:rFonts w:asciiTheme="minorHAnsi" w:eastAsiaTheme="minorEastAsia" w:hAnsiTheme="minorHAnsi" w:cstheme="minorBidi" w:ascii="Calibri" w:hAnsi="Calibri" w:eastAsia="Calibri" w:cs="Calibri"/>
                 <w:b/>
                 <w:bCs/>
                 <w:sz w:val="24"/>
@@ -9102,7 +9184,7 @@
             </w:pPr>
             <w:r>
               <w:rPr>
-                <w:rFonts w:asciiTheme="minorHAnsi" w:eastAsiaTheme="minorEastAsia" w:hAnsiTheme="minorHAnsi" w:cstheme="minorBidi"/>
+                <w:rFonts w:asciiTheme="minorHAnsi" w:eastAsiaTheme="minorEastAsia" w:hAnsiTheme="minorHAnsi" w:cstheme="minorBidi" w:ascii="Calibri" w:hAnsi="Calibri" w:eastAsia="Calibri" w:cs="Calibri"/>
                 <w:sz w:val="24"/>
                 <w:szCs w:val="24"/>
                 <w:lang w:val="es-CL" w:eastAsia="es-CL"/>
@@ -9121,7 +9203,7 @@
             </w:pPr>
             <w:r>
               <w:rPr>
-                <w:rFonts w:asciiTheme="minorHAnsi" w:eastAsiaTheme="minorEastAsia" w:hAnsiTheme="minorHAnsi" w:cstheme="minorBidi"/>
+                <w:rFonts w:asciiTheme="minorHAnsi" w:eastAsiaTheme="minorEastAsia" w:hAnsiTheme="minorHAnsi" w:cstheme="minorBidi" w:ascii="Calibri" w:hAnsi="Calibri" w:eastAsia="Calibri" w:cs="Calibri"/>
                 <w:b/>
                 <w:bCs/>
                 <w:sz w:val="24"/>
@@ -9143,7 +9225,7 @@
             </w:pPr>
             <w:r>
               <w:rPr>
-                <w:rFonts w:asciiTheme="minorHAnsi" w:eastAsiaTheme="minorEastAsia" w:hAnsiTheme="minorHAnsi" w:cstheme="minorBidi"/>
+                <w:rFonts w:asciiTheme="minorHAnsi" w:eastAsiaTheme="minorEastAsia" w:hAnsiTheme="minorHAnsi" w:cstheme="minorBidi" w:ascii="Calibri" w:hAnsi="Calibri" w:eastAsia="Calibri" w:cs="Calibri"/>
                 <w:sz w:val="24"/>
                 <w:szCs w:val="24"/>
                 <w:lang w:val="es-CL" w:eastAsia="es-CL"/>
@@ -9166,7 +9248,7 @@
             </w:pPr>
             <w:r>
               <w:rPr>
-                <w:rFonts w:asciiTheme="minorHAnsi" w:eastAsiaTheme="minorEastAsia" w:hAnsiTheme="minorHAnsi" w:cstheme="minorBidi"/>
+                <w:rFonts w:asciiTheme="minorHAnsi" w:eastAsiaTheme="minorEastAsia" w:hAnsiTheme="minorHAnsi" w:cstheme="minorBidi" w:ascii="Calibri" w:hAnsi="Calibri" w:eastAsia="Calibri" w:cs="Calibri"/>
                 <w:sz w:val="24"/>
                 <w:szCs w:val="24"/>
                 <w:lang w:val="es-CL" w:eastAsia="es-CL"/>
@@ -9176,7 +9258,7 @@
             <w:proofErr w:type="spellStart"/>
             <w:r>
               <w:rPr>
-                <w:rFonts w:asciiTheme="minorHAnsi" w:eastAsiaTheme="minorEastAsia" w:hAnsiTheme="minorHAnsi" w:cstheme="minorBidi"/>
+                <w:rFonts w:asciiTheme="minorHAnsi" w:eastAsiaTheme="minorEastAsia" w:hAnsiTheme="minorHAnsi" w:cstheme="minorBidi" w:ascii="Calibri" w:hAnsi="Calibri" w:eastAsia="Calibri" w:cs="Calibri"/>
                 <w:sz w:val="24"/>
                 <w:szCs w:val="24"/>
                 <w:lang w:val="es-CL" w:eastAsia="es-CL"/>
@@ -9186,7 +9268,7 @@
             <w:proofErr w:type="spellEnd"/>
             <w:r>
               <w:rPr>
-                <w:rFonts w:asciiTheme="minorHAnsi" w:eastAsiaTheme="minorEastAsia" w:hAnsiTheme="minorHAnsi" w:cstheme="minorBidi"/>
+                <w:rFonts w:asciiTheme="minorHAnsi" w:eastAsiaTheme="minorEastAsia" w:hAnsiTheme="minorHAnsi" w:cstheme="minorBidi" w:ascii="Calibri" w:hAnsi="Calibri" w:eastAsia="Calibri" w:cs="Calibri"/>
                 <w:sz w:val="24"/>
                 <w:szCs w:val="24"/>
                 <w:lang w:val="es-CL" w:eastAsia="es-CL"/>
@@ -9209,7 +9291,7 @@
             </w:pPr>
             <w:r>
               <w:rPr>
-                <w:rFonts w:asciiTheme="minorHAnsi" w:eastAsiaTheme="minorEastAsia" w:hAnsiTheme="minorHAnsi" w:cstheme="minorBidi"/>
+                <w:rFonts w:asciiTheme="minorHAnsi" w:eastAsiaTheme="minorEastAsia" w:hAnsiTheme="minorHAnsi" w:cstheme="minorBidi" w:ascii="Calibri" w:hAnsi="Calibri" w:eastAsia="Calibri" w:cs="Calibri"/>
                 <w:sz w:val="24"/>
                 <w:szCs w:val="24"/>
                 <w:lang w:val="es-CL" w:eastAsia="es-CL"/>
@@ -9232,7 +9314,7 @@
             </w:pPr>
             <w:r>
               <w:rPr>
-                <w:rFonts w:asciiTheme="minorHAnsi" w:eastAsiaTheme="minorEastAsia" w:hAnsiTheme="minorHAnsi" w:cstheme="minorBidi"/>
+                <w:rFonts w:asciiTheme="minorHAnsi" w:eastAsiaTheme="minorEastAsia" w:hAnsiTheme="minorHAnsi" w:cstheme="minorBidi" w:ascii="Calibri" w:hAnsi="Calibri" w:eastAsia="Calibri" w:cs="Calibri"/>
                 <w:sz w:val="24"/>
                 <w:szCs w:val="24"/>
                 <w:lang w:val="es-CL" w:eastAsia="es-CL"/>
@@ -9251,7 +9333,7 @@
             </w:pPr>
             <w:r>
               <w:rPr>
-                <w:rFonts w:asciiTheme="minorHAnsi" w:eastAsiaTheme="minorEastAsia" w:hAnsiTheme="minorHAnsi" w:cstheme="minorBidi"/>
+                <w:rFonts w:asciiTheme="minorHAnsi" w:eastAsiaTheme="minorEastAsia" w:hAnsiTheme="minorHAnsi" w:cstheme="minorBidi" w:ascii="Calibri" w:hAnsi="Calibri" w:eastAsia="Calibri" w:cs="Calibri"/>
                 <w:sz w:val="24"/>
                 <w:szCs w:val="24"/>
                 <w:lang w:val="es-CL" w:eastAsia="es-CL"/>
@@ -9270,7 +9352,7 @@
             </w:pPr>
             <w:r>
               <w:rPr>
-                <w:rFonts w:asciiTheme="minorHAnsi" w:eastAsiaTheme="minorEastAsia" w:hAnsiTheme="minorHAnsi" w:cstheme="minorBidi"/>
+                <w:rFonts w:asciiTheme="minorHAnsi" w:eastAsiaTheme="minorEastAsia" w:hAnsiTheme="minorHAnsi" w:cstheme="minorBidi" w:ascii="Calibri" w:hAnsi="Calibri" w:eastAsia="Calibri" w:cs="Calibri"/>
                 <w:b/>
                 <w:bCs/>
                 <w:sz w:val="24"/>
@@ -9291,7 +9373,7 @@
             </w:pPr>
             <w:r>
               <w:rPr>
-                <w:rFonts w:asciiTheme="minorHAnsi" w:eastAsiaTheme="minorEastAsia" w:hAnsiTheme="minorHAnsi" w:cstheme="minorBidi"/>
+                <w:rFonts w:asciiTheme="minorHAnsi" w:eastAsiaTheme="minorEastAsia" w:hAnsiTheme="minorHAnsi" w:cstheme="minorBidi" w:ascii="Calibri" w:hAnsi="Calibri" w:eastAsia="Calibri" w:cs="Calibri"/>
                 <w:sz w:val="24"/>
                 <w:szCs w:val="24"/>
                 <w:lang w:val="es-CL" w:eastAsia="es-CL"/>
@@ -9314,7 +9396,7 @@
             </w:pPr>
             <w:r>
               <w:rPr>
-                <w:rFonts w:asciiTheme="minorHAnsi" w:eastAsiaTheme="minorEastAsia" w:hAnsiTheme="minorHAnsi" w:cstheme="minorBidi"/>
+                <w:rFonts w:asciiTheme="minorHAnsi" w:eastAsiaTheme="minorEastAsia" w:hAnsiTheme="minorHAnsi" w:cstheme="minorBidi" w:ascii="Calibri" w:hAnsi="Calibri" w:eastAsia="Calibri" w:cs="Calibri"/>
                 <w:sz w:val="24"/>
                 <w:szCs w:val="24"/>
                 <w:lang w:val="es-CL" w:eastAsia="es-CL"/>
@@ -9337,7 +9419,7 @@
             </w:pPr>
             <w:r>
               <w:rPr>
-                <w:rFonts w:asciiTheme="minorHAnsi" w:eastAsiaTheme="minorEastAsia" w:hAnsiTheme="minorHAnsi" w:cstheme="minorBidi"/>
+                <w:rFonts w:asciiTheme="minorHAnsi" w:eastAsiaTheme="minorEastAsia" w:hAnsiTheme="minorHAnsi" w:cstheme="minorBidi" w:ascii="Calibri" w:hAnsi="Calibri" w:eastAsia="Calibri" w:cs="Calibri"/>
                 <w:sz w:val="24"/>
                 <w:szCs w:val="24"/>
                 <w:lang w:val="es-CL" w:eastAsia="es-CL"/>
@@ -9360,7 +9442,7 @@
             </w:pPr>
             <w:r>
               <w:rPr>
-                <w:rFonts w:asciiTheme="minorHAnsi" w:eastAsiaTheme="minorEastAsia" w:hAnsiTheme="minorHAnsi" w:cstheme="minorBidi"/>
+                <w:rFonts w:asciiTheme="minorHAnsi" w:eastAsiaTheme="minorEastAsia" w:hAnsiTheme="minorHAnsi" w:cstheme="minorBidi" w:ascii="Calibri" w:hAnsi="Calibri" w:eastAsia="Calibri" w:cs="Calibri"/>
                 <w:sz w:val="24"/>
                 <w:szCs w:val="24"/>
                 <w:lang w:val="es-CL" w:eastAsia="es-CL"/>
@@ -9383,7 +9465,7 @@
             </w:pPr>
             <w:r>
               <w:rPr>
-                <w:rFonts w:asciiTheme="minorHAnsi" w:eastAsiaTheme="minorEastAsia" w:hAnsiTheme="minorHAnsi" w:cstheme="minorBidi"/>
+                <w:rFonts w:asciiTheme="minorHAnsi" w:eastAsiaTheme="minorEastAsia" w:hAnsiTheme="minorHAnsi" w:cstheme="minorBidi" w:ascii="Calibri" w:hAnsi="Calibri" w:eastAsia="Calibri" w:cs="Calibri"/>
                 <w:sz w:val="24"/>
                 <w:szCs w:val="24"/>
                 <w:lang w:val="es-CL" w:eastAsia="es-CL"/>
@@ -9406,7 +9488,7 @@
             </w:pPr>
             <w:r>
               <w:rPr>
-                <w:rFonts w:asciiTheme="minorHAnsi" w:eastAsiaTheme="minorEastAsia" w:hAnsiTheme="minorHAnsi" w:cstheme="minorBidi"/>
+                <w:rFonts w:asciiTheme="minorHAnsi" w:eastAsiaTheme="minorEastAsia" w:hAnsiTheme="minorHAnsi" w:cstheme="minorBidi" w:ascii="Calibri" w:hAnsi="Calibri" w:eastAsia="Calibri" w:cs="Calibri"/>
                 <w:sz w:val="24"/>
                 <w:szCs w:val="24"/>
                 <w:lang w:val="es-CL" w:eastAsia="es-CL"/>
@@ -9429,7 +9511,7 @@
             </w:pPr>
             <w:r>
               <w:rPr>
-                <w:rFonts w:asciiTheme="minorHAnsi" w:eastAsiaTheme="minorEastAsia" w:hAnsiTheme="minorHAnsi" w:cstheme="minorBidi"/>
+                <w:rFonts w:asciiTheme="minorHAnsi" w:eastAsiaTheme="minorEastAsia" w:hAnsiTheme="minorHAnsi" w:cstheme="minorBidi" w:ascii="Calibri" w:hAnsi="Calibri" w:eastAsia="Calibri" w:cs="Calibri"/>
                 <w:sz w:val="24"/>
                 <w:szCs w:val="24"/>
                 <w:lang w:val="es-CL" w:eastAsia="es-CL"/>
@@ -9452,7 +9534,7 @@
             </w:pPr>
             <w:r>
               <w:rPr>
-                <w:rFonts w:asciiTheme="minorHAnsi" w:eastAsiaTheme="minorEastAsia" w:hAnsiTheme="minorHAnsi" w:cstheme="minorBidi"/>
+                <w:rFonts w:asciiTheme="minorHAnsi" w:eastAsiaTheme="minorEastAsia" w:hAnsiTheme="minorHAnsi" w:cstheme="minorBidi" w:ascii="Calibri" w:hAnsi="Calibri" w:eastAsia="Calibri" w:cs="Calibri"/>
                 <w:sz w:val="24"/>
                 <w:szCs w:val="24"/>
                 <w:lang w:val="es-CL" w:eastAsia="es-CL"/>
@@ -9471,7 +9553,7 @@
             </w:pPr>
             <w:r>
               <w:rPr>
-                <w:rFonts w:asciiTheme="minorHAnsi" w:eastAsiaTheme="minorEastAsia" w:hAnsiTheme="minorHAnsi" w:cstheme="minorBidi"/>
+                <w:rFonts w:asciiTheme="minorHAnsi" w:eastAsiaTheme="minorEastAsia" w:hAnsiTheme="minorHAnsi" w:cstheme="minorBidi" w:ascii="Calibri" w:hAnsi="Calibri" w:eastAsia="Calibri" w:cs="Calibri"/>
                 <w:b/>
                 <w:bCs/>
                 <w:sz w:val="24"/>
@@ -9492,7 +9574,7 @@
             </w:pPr>
             <w:r>
               <w:rPr>
-                <w:rFonts w:asciiTheme="minorHAnsi" w:eastAsiaTheme="minorEastAsia" w:hAnsiTheme="minorHAnsi" w:cstheme="minorBidi"/>
+                <w:rFonts w:asciiTheme="minorHAnsi" w:eastAsiaTheme="minorEastAsia" w:hAnsiTheme="minorHAnsi" w:cstheme="minorBidi" w:ascii="Calibri" w:hAnsi="Calibri" w:eastAsia="Calibri" w:cs="Calibri"/>
                 <w:sz w:val="24"/>
                 <w:szCs w:val="24"/>
                 <w:lang w:val="es-CL" w:eastAsia="es-CL"/>
@@ -9511,7 +9593,7 @@
             </w:pPr>
             <w:r>
               <w:rPr>
-                <w:rFonts w:asciiTheme="minorHAnsi" w:eastAsiaTheme="minorEastAsia" w:hAnsiTheme="minorHAnsi" w:cstheme="minorBidi"/>
+                <w:rFonts w:asciiTheme="minorHAnsi" w:eastAsiaTheme="minorEastAsia" w:hAnsiTheme="minorHAnsi" w:cstheme="minorBidi" w:ascii="Calibri" w:hAnsi="Calibri" w:eastAsia="Calibri" w:cs="Calibri"/>
                 <w:sz w:val="24"/>
                 <w:szCs w:val="24"/>
                 <w:lang w:val="es-CL" w:eastAsia="es-CL"/>
@@ -9521,7 +9603,7 @@
             <w:proofErr w:type="spellStart"/>
             <w:r>
               <w:rPr>
-                <w:rFonts w:asciiTheme="minorHAnsi" w:eastAsiaTheme="minorEastAsia" w:hAnsiTheme="minorHAnsi" w:cstheme="minorBidi"/>
+                <w:rFonts w:asciiTheme="minorHAnsi" w:eastAsiaTheme="minorEastAsia" w:hAnsiTheme="minorHAnsi" w:cstheme="minorBidi" w:ascii="Calibri" w:hAnsi="Calibri" w:eastAsia="Calibri" w:cs="Calibri"/>
                 <w:sz w:val="24"/>
                 <w:szCs w:val="24"/>
                 <w:lang w:val="es-CL" w:eastAsia="es-CL"/>
@@ -9531,7 +9613,7 @@
             <w:proofErr w:type="spellEnd"/>
             <w:r>
               <w:rPr>
-                <w:rFonts w:asciiTheme="minorHAnsi" w:eastAsiaTheme="minorEastAsia" w:hAnsiTheme="minorHAnsi" w:cstheme="minorBidi"/>
+                <w:rFonts w:asciiTheme="minorHAnsi" w:eastAsiaTheme="minorEastAsia" w:hAnsiTheme="minorHAnsi" w:cstheme="minorBidi" w:ascii="Calibri" w:hAnsi="Calibri" w:eastAsia="Calibri" w:cs="Calibri"/>
                 <w:sz w:val="24"/>
                 <w:szCs w:val="24"/>
                 <w:lang w:val="es-CL" w:eastAsia="es-CL"/>
@@ -9541,7 +9623,7 @@
             <w:proofErr w:type="spellStart"/>
             <w:r>
               <w:rPr>
-                <w:rFonts w:asciiTheme="minorHAnsi" w:eastAsiaTheme="minorEastAsia" w:hAnsiTheme="minorHAnsi" w:cstheme="minorBidi"/>
+                <w:rFonts w:asciiTheme="minorHAnsi" w:eastAsiaTheme="minorEastAsia" w:hAnsiTheme="minorHAnsi" w:cstheme="minorBidi" w:ascii="Calibri" w:hAnsi="Calibri" w:eastAsia="Calibri" w:cs="Calibri"/>
                 <w:sz w:val="24"/>
                 <w:szCs w:val="24"/>
                 <w:lang w:val="es-CL" w:eastAsia="es-CL"/>
@@ -9551,7 +9633,7 @@
             <w:proofErr w:type="spellEnd"/>
             <w:r>
               <w:rPr>
-                <w:rFonts w:asciiTheme="minorHAnsi" w:eastAsiaTheme="minorEastAsia" w:hAnsiTheme="minorHAnsi" w:cstheme="minorBidi"/>
+                <w:rFonts w:asciiTheme="minorHAnsi" w:eastAsiaTheme="minorEastAsia" w:hAnsiTheme="minorHAnsi" w:cstheme="minorBidi" w:ascii="Calibri" w:hAnsi="Calibri" w:eastAsia="Calibri" w:cs="Calibri"/>
                 <w:sz w:val="24"/>
                 <w:szCs w:val="24"/>
                 <w:lang w:val="es-CL" w:eastAsia="es-CL"/>
@@ -9561,7 +9643,7 @@
             <w:proofErr w:type="spellStart"/>
             <w:r>
               <w:rPr>
-                <w:rFonts w:asciiTheme="minorHAnsi" w:eastAsiaTheme="minorEastAsia" w:hAnsiTheme="minorHAnsi" w:cstheme="minorBidi"/>
+                <w:rFonts w:asciiTheme="minorHAnsi" w:eastAsiaTheme="minorEastAsia" w:hAnsiTheme="minorHAnsi" w:cstheme="minorBidi" w:ascii="Calibri" w:hAnsi="Calibri" w:eastAsia="Calibri" w:cs="Calibri"/>
                 <w:sz w:val="24"/>
                 <w:szCs w:val="24"/>
                 <w:lang w:val="es-CL" w:eastAsia="es-CL"/>
@@ -9571,7 +9653,7 @@
             <w:proofErr w:type="spellEnd"/>
             <w:r>
               <w:rPr>
-                <w:rFonts w:asciiTheme="minorHAnsi" w:eastAsiaTheme="minorEastAsia" w:hAnsiTheme="minorHAnsi" w:cstheme="minorBidi"/>
+                <w:rFonts w:asciiTheme="minorHAnsi" w:eastAsiaTheme="minorEastAsia" w:hAnsiTheme="minorHAnsi" w:cstheme="minorBidi" w:ascii="Calibri" w:hAnsi="Calibri" w:eastAsia="Calibri" w:cs="Calibri"/>
                 <w:sz w:val="24"/>
                 <w:szCs w:val="24"/>
                 <w:lang w:val="es-CL" w:eastAsia="es-CL"/>
@@ -9590,7 +9672,7 @@
             </w:pPr>
             <w:r>
               <w:rPr>
-                <w:rFonts w:asciiTheme="minorHAnsi" w:eastAsiaTheme="minorEastAsia" w:hAnsiTheme="minorHAnsi" w:cstheme="minorBidi"/>
+                <w:rFonts w:asciiTheme="minorHAnsi" w:eastAsiaTheme="minorEastAsia" w:hAnsiTheme="minorHAnsi" w:cstheme="minorBidi" w:ascii="Calibri" w:hAnsi="Calibri" w:eastAsia="Calibri" w:cs="Calibri"/>
                 <w:sz w:val="24"/>
                 <w:szCs w:val="24"/>
                 <w:lang w:val="es-CL" w:eastAsia="es-CL"/>
@@ -9609,7 +9691,7 @@
             </w:pPr>
             <w:r>
               <w:rPr>
-                <w:rFonts w:asciiTheme="minorHAnsi" w:eastAsiaTheme="minorEastAsia" w:hAnsiTheme="minorHAnsi" w:cstheme="minorBidi"/>
+                <w:rFonts w:asciiTheme="minorHAnsi" w:eastAsiaTheme="minorEastAsia" w:hAnsiTheme="minorHAnsi" w:cstheme="minorBidi" w:ascii="Calibri" w:hAnsi="Calibri" w:eastAsia="Calibri" w:cs="Calibri"/>
                 <w:sz w:val="24"/>
                 <w:szCs w:val="24"/>
                 <w:lang w:val="es-CL" w:eastAsia="es-CL"/>
@@ -9628,7 +9710,7 @@
             </w:pPr>
             <w:r>
               <w:rPr>
-                <w:rFonts w:asciiTheme="minorHAnsi" w:eastAsiaTheme="minorEastAsia" w:hAnsiTheme="minorHAnsi" w:cstheme="minorBidi"/>
+                <w:rFonts w:asciiTheme="minorHAnsi" w:eastAsiaTheme="minorEastAsia" w:hAnsiTheme="minorHAnsi" w:cstheme="minorBidi" w:ascii="Calibri" w:hAnsi="Calibri" w:eastAsia="Calibri" w:cs="Calibri"/>
                 <w:b/>
                 <w:bCs/>
                 <w:sz w:val="24"/>
@@ -9649,7 +9731,7 @@
             </w:pPr>
             <w:r>
               <w:rPr>
-                <w:rFonts w:asciiTheme="minorHAnsi" w:eastAsiaTheme="minorEastAsia" w:hAnsiTheme="minorHAnsi" w:cstheme="minorBidi"/>
+                <w:rFonts w:asciiTheme="minorHAnsi" w:eastAsiaTheme="minorEastAsia" w:hAnsiTheme="minorHAnsi" w:cstheme="minorBidi" w:ascii="Calibri" w:hAnsi="Calibri" w:eastAsia="Calibri" w:cs="Calibri"/>
                 <w:sz w:val="24"/>
                 <w:szCs w:val="24"/>
                 <w:lang w:val="es-CL" w:eastAsia="es-CL"/>
@@ -9698,7 +9780,7 @@
             </w:pPr>
             <w:r>
               <w:rPr>
-                <w:rFonts w:asciiTheme="minorHAnsi" w:eastAsiaTheme="minorEastAsia" w:hAnsiTheme="minorHAnsi" w:cstheme="minorBidi"/>
+                <w:rFonts w:asciiTheme="minorHAnsi" w:eastAsiaTheme="minorEastAsia" w:hAnsiTheme="minorHAnsi" w:cstheme="minorBidi" w:ascii="Calibri" w:hAnsi="Calibri" w:eastAsia="Calibri" w:cs="Calibri"/>
                 <w:b/>
                 <w:bCs/>
                 <w:sz w:val="24"/>
@@ -9719,7 +9801,7 @@
             </w:pPr>
             <w:r>
               <w:rPr>
-                <w:rFonts w:asciiTheme="minorHAnsi" w:eastAsiaTheme="minorEastAsia" w:hAnsiTheme="minorHAnsi" w:cstheme="minorBidi"/>
+                <w:rFonts w:asciiTheme="minorHAnsi" w:eastAsiaTheme="minorEastAsia" w:hAnsiTheme="minorHAnsi" w:cstheme="minorBidi" w:ascii="Calibri" w:hAnsi="Calibri" w:eastAsia="Calibri" w:cs="Calibri"/>
                 <w:sz w:val="24"/>
                 <w:szCs w:val="24"/>
                 <w:lang w:val="es-CL" w:eastAsia="es-CL"/>
@@ -9728,7 +9810,7 @@
             </w:r>
             <w:r>
               <w:rPr>
-                <w:rFonts w:asciiTheme="minorHAnsi" w:eastAsiaTheme="minorEastAsia" w:hAnsiTheme="minorHAnsi" w:cstheme="minorBidi"/>
+                <w:rFonts w:asciiTheme="minorHAnsi" w:eastAsiaTheme="minorEastAsia" w:hAnsiTheme="minorHAnsi" w:cstheme="minorBidi" w:ascii="Calibri" w:hAnsi="Calibri" w:eastAsia="Calibri" w:cs="Calibri"/>
                 <w:b/>
                 <w:bCs/>
                 <w:sz w:val="24"/>
@@ -9739,7 +9821,7 @@
             </w:r>
             <w:r>
               <w:rPr>
-                <w:rFonts w:asciiTheme="minorHAnsi" w:eastAsiaTheme="minorEastAsia" w:hAnsiTheme="minorHAnsi" w:cstheme="minorBidi"/>
+                <w:rFonts w:asciiTheme="minorHAnsi" w:eastAsiaTheme="minorEastAsia" w:hAnsiTheme="minorHAnsi" w:cstheme="minorBidi" w:ascii="Calibri" w:hAnsi="Calibri" w:eastAsia="Calibri" w:cs="Calibri"/>
                 <w:sz w:val="24"/>
                 <w:szCs w:val="24"/>
                 <w:lang w:val="es-CL" w:eastAsia="es-CL"/>
@@ -9758,7 +9840,7 @@
             </w:pPr>
             <w:r>
               <w:rPr>
-                <w:rFonts w:asciiTheme="minorHAnsi" w:eastAsiaTheme="minorEastAsia" w:hAnsiTheme="minorHAnsi" w:cstheme="minorBidi"/>
+                <w:rFonts w:asciiTheme="minorHAnsi" w:eastAsiaTheme="minorEastAsia" w:hAnsiTheme="minorHAnsi" w:cstheme="minorBidi" w:ascii="Calibri" w:hAnsi="Calibri" w:eastAsia="Calibri" w:cs="Calibri"/>
                 <w:sz w:val="24"/>
                 <w:szCs w:val="24"/>
                 <w:lang w:val="es-CL" w:eastAsia="es-CL"/>
@@ -9767,7 +9849,7 @@
             </w:r>
             <w:r>
               <w:rPr>
-                <w:rFonts w:asciiTheme="minorHAnsi" w:eastAsiaTheme="minorEastAsia" w:hAnsiTheme="minorHAnsi" w:cstheme="minorBidi"/>
+                <w:rFonts w:asciiTheme="minorHAnsi" w:eastAsiaTheme="minorEastAsia" w:hAnsiTheme="minorHAnsi" w:cstheme="minorBidi" w:ascii="Calibri" w:hAnsi="Calibri" w:eastAsia="Calibri" w:cs="Calibri"/>
                 <w:b/>
                 <w:bCs/>
                 <w:sz w:val="24"/>
@@ -9818,7 +9900,7 @@
                   </w:pPr>
                   <w:r>
                     <w:rPr>
-                      <w:rFonts w:asciiTheme="minorHAnsi" w:eastAsiaTheme="minorEastAsia" w:hAnsiTheme="minorHAnsi" w:cstheme="minorBidi"/>
+                      <w:rFonts w:asciiTheme="minorHAnsi" w:eastAsiaTheme="minorEastAsia" w:hAnsiTheme="minorHAnsi" w:cstheme="minorBidi" w:ascii="Calibri" w:hAnsi="Calibri" w:eastAsia="Calibri" w:cs="Calibri"/>
                       <w:b/>
                       <w:bCs/>
                       <w:sz w:val="24"/>
@@ -9849,7 +9931,7 @@
                   </w:pPr>
                   <w:r>
                     <w:rPr>
-                      <w:rFonts w:asciiTheme="minorHAnsi" w:eastAsiaTheme="minorEastAsia" w:hAnsiTheme="minorHAnsi" w:cstheme="minorBidi"/>
+                      <w:rFonts w:asciiTheme="minorHAnsi" w:eastAsiaTheme="minorEastAsia" w:hAnsiTheme="minorHAnsi" w:cstheme="minorBidi" w:ascii="Calibri" w:hAnsi="Calibri" w:eastAsia="Calibri" w:cs="Calibri"/>
                       <w:b/>
                       <w:bCs/>
                       <w:sz w:val="24"/>
@@ -9880,7 +9962,7 @@
                   </w:pPr>
                   <w:r>
                     <w:rPr>
-                      <w:rFonts w:asciiTheme="minorHAnsi" w:eastAsiaTheme="minorEastAsia" w:hAnsiTheme="minorHAnsi" w:cstheme="minorBidi"/>
+                      <w:rFonts w:asciiTheme="minorHAnsi" w:eastAsiaTheme="minorEastAsia" w:hAnsiTheme="minorHAnsi" w:cstheme="minorBidi" w:ascii="Calibri" w:hAnsi="Calibri" w:eastAsia="Calibri" w:cs="Calibri"/>
                       <w:b/>
                       <w:bCs/>
                       <w:sz w:val="24"/>
@@ -9914,7 +9996,7 @@
                   </w:pPr>
                   <w:r>
                     <w:rPr>
-                      <w:rFonts w:asciiTheme="minorHAnsi" w:eastAsiaTheme="minorEastAsia" w:hAnsiTheme="minorHAnsi" w:cstheme="minorBidi"/>
+                      <w:rFonts w:asciiTheme="minorHAnsi" w:eastAsiaTheme="minorEastAsia" w:hAnsiTheme="minorHAnsi" w:cstheme="minorBidi" w:ascii="Calibri" w:hAnsi="Calibri" w:eastAsia="Calibri" w:cs="Calibri"/>
                       <w:sz w:val="24"/>
                       <w:szCs w:val="24"/>
                       <w:lang w:val="es-CL" w:eastAsia="es-CL"/>
@@ -9941,7 +10023,7 @@
                   </w:pPr>
                   <w:r>
                     <w:rPr>
-                      <w:rFonts w:asciiTheme="minorHAnsi" w:eastAsiaTheme="minorEastAsia" w:hAnsiTheme="minorHAnsi" w:cstheme="minorBidi"/>
+                      <w:rFonts w:asciiTheme="minorHAnsi" w:eastAsiaTheme="minorEastAsia" w:hAnsiTheme="minorHAnsi" w:cstheme="minorBidi" w:ascii="Calibri" w:hAnsi="Calibri" w:eastAsia="Calibri" w:cs="Calibri"/>
                       <w:sz w:val="24"/>
                       <w:szCs w:val="24"/>
                       <w:lang w:val="es-CL" w:eastAsia="es-CL"/>
@@ -9968,7 +10050,7 @@
                   </w:pPr>
                   <w:r>
                     <w:rPr>
-                      <w:rFonts w:asciiTheme="minorHAnsi" w:eastAsiaTheme="minorEastAsia" w:hAnsiTheme="minorHAnsi" w:cstheme="minorBidi"/>
+                      <w:rFonts w:asciiTheme="minorHAnsi" w:eastAsiaTheme="minorEastAsia" w:hAnsiTheme="minorHAnsi" w:cstheme="minorBidi" w:ascii="Calibri" w:hAnsi="Calibri" w:eastAsia="Calibri" w:cs="Calibri"/>
                       <w:sz w:val="24"/>
                       <w:szCs w:val="24"/>
                       <w:lang w:val="es-CL" w:eastAsia="es-CL"/>
@@ -9978,7 +10060,7 @@
                   <w:proofErr w:type="spellStart"/>
                   <w:r>
                     <w:rPr>
-                      <w:rFonts w:asciiTheme="minorHAnsi" w:eastAsiaTheme="minorEastAsia" w:hAnsiTheme="minorHAnsi" w:cstheme="minorBidi"/>
+                      <w:rFonts w:asciiTheme="minorHAnsi" w:eastAsiaTheme="minorEastAsia" w:hAnsiTheme="minorHAnsi" w:cstheme="minorBidi" w:ascii="Calibri" w:hAnsi="Calibri" w:eastAsia="Calibri" w:cs="Calibri"/>
                       <w:sz w:val="24"/>
                       <w:szCs w:val="24"/>
                       <w:lang w:val="es-CL" w:eastAsia="es-CL"/>
@@ -9988,7 +10070,7 @@
                   <w:proofErr w:type="spellEnd"/>
                   <w:r>
                     <w:rPr>
-                      <w:rFonts w:asciiTheme="minorHAnsi" w:eastAsiaTheme="minorEastAsia" w:hAnsiTheme="minorHAnsi" w:cstheme="minorBidi"/>
+                      <w:rFonts w:asciiTheme="minorHAnsi" w:eastAsiaTheme="minorEastAsia" w:hAnsiTheme="minorHAnsi" w:cstheme="minorBidi" w:ascii="Calibri" w:hAnsi="Calibri" w:eastAsia="Calibri" w:cs="Calibri"/>
                       <w:sz w:val="24"/>
                       <w:szCs w:val="24"/>
                       <w:lang w:val="es-CL" w:eastAsia="es-CL"/>
@@ -10020,7 +10102,7 @@
                   </w:pPr>
                   <w:r>
                     <w:rPr>
-                      <w:rFonts w:asciiTheme="minorHAnsi" w:eastAsiaTheme="minorEastAsia" w:hAnsiTheme="minorHAnsi" w:cstheme="minorBidi"/>
+                      <w:rFonts w:asciiTheme="minorHAnsi" w:eastAsiaTheme="minorEastAsia" w:hAnsiTheme="minorHAnsi" w:cstheme="minorBidi" w:ascii="Calibri" w:hAnsi="Calibri" w:eastAsia="Calibri" w:cs="Calibri"/>
                       <w:sz w:val="24"/>
                       <w:szCs w:val="24"/>
                       <w:lang w:val="es-CL" w:eastAsia="es-CL"/>
@@ -10047,7 +10129,7 @@
                   </w:pPr>
                   <w:r>
                     <w:rPr>
-                      <w:rFonts w:asciiTheme="minorHAnsi" w:eastAsiaTheme="minorEastAsia" w:hAnsiTheme="minorHAnsi" w:cstheme="minorBidi"/>
+                      <w:rFonts w:asciiTheme="minorHAnsi" w:eastAsiaTheme="minorEastAsia" w:hAnsiTheme="minorHAnsi" w:cstheme="minorBidi" w:ascii="Calibri" w:hAnsi="Calibri" w:eastAsia="Calibri" w:cs="Calibri"/>
                       <w:sz w:val="24"/>
                       <w:szCs w:val="24"/>
                       <w:lang w:val="es-CL" w:eastAsia="es-CL"/>
@@ -10074,7 +10156,7 @@
                   </w:pPr>
                   <w:r>
                     <w:rPr>
-                      <w:rFonts w:asciiTheme="minorHAnsi" w:eastAsiaTheme="minorEastAsia" w:hAnsiTheme="minorHAnsi" w:cstheme="minorBidi"/>
+                      <w:rFonts w:asciiTheme="minorHAnsi" w:eastAsiaTheme="minorEastAsia" w:hAnsiTheme="minorHAnsi" w:cstheme="minorBidi" w:ascii="Calibri" w:hAnsi="Calibri" w:eastAsia="Calibri" w:cs="Calibri"/>
                       <w:sz w:val="24"/>
                       <w:szCs w:val="24"/>
                       <w:lang w:val="es-CL" w:eastAsia="es-CL"/>
@@ -10106,7 +10188,7 @@
                   </w:pPr>
                   <w:r>
                     <w:rPr>
-                      <w:rFonts w:asciiTheme="minorHAnsi" w:eastAsiaTheme="minorEastAsia" w:hAnsiTheme="minorHAnsi" w:cstheme="minorBidi"/>
+                      <w:rFonts w:asciiTheme="minorHAnsi" w:eastAsiaTheme="minorEastAsia" w:hAnsiTheme="minorHAnsi" w:cstheme="minorBidi" w:ascii="Calibri" w:hAnsi="Calibri" w:eastAsia="Calibri" w:cs="Calibri"/>
                       <w:sz w:val="24"/>
                       <w:szCs w:val="24"/>
                       <w:lang w:val="es-CL" w:eastAsia="es-CL"/>
@@ -10133,7 +10215,7 @@
                   </w:pPr>
                   <w:r>
                     <w:rPr>
-                      <w:rFonts w:asciiTheme="minorHAnsi" w:eastAsiaTheme="minorEastAsia" w:hAnsiTheme="minorHAnsi" w:cstheme="minorBidi"/>
+                      <w:rFonts w:asciiTheme="minorHAnsi" w:eastAsiaTheme="minorEastAsia" w:hAnsiTheme="minorHAnsi" w:cstheme="minorBidi" w:ascii="Calibri" w:hAnsi="Calibri" w:eastAsia="Calibri" w:cs="Calibri"/>
                       <w:sz w:val="24"/>
                       <w:szCs w:val="24"/>
                       <w:lang w:val="es-CL" w:eastAsia="es-CL"/>
@@ -10160,7 +10242,7 @@
                   </w:pPr>
                   <w:r>
                     <w:rPr>
-                      <w:rFonts w:asciiTheme="minorHAnsi" w:eastAsiaTheme="minorEastAsia" w:hAnsiTheme="minorHAnsi" w:cstheme="minorBidi"/>
+                      <w:rFonts w:asciiTheme="minorHAnsi" w:eastAsiaTheme="minorEastAsia" w:hAnsiTheme="minorHAnsi" w:cstheme="minorBidi" w:ascii="Calibri" w:hAnsi="Calibri" w:eastAsia="Calibri" w:cs="Calibri"/>
                       <w:sz w:val="24"/>
                       <w:szCs w:val="24"/>
                       <w:lang w:val="es-CL" w:eastAsia="es-CL"/>
@@ -10192,7 +10274,7 @@
                   </w:pPr>
                   <w:r>
                     <w:rPr>
-                      <w:rFonts w:asciiTheme="minorHAnsi" w:eastAsiaTheme="minorEastAsia" w:hAnsiTheme="minorHAnsi" w:cstheme="minorBidi"/>
+                      <w:rFonts w:asciiTheme="minorHAnsi" w:eastAsiaTheme="minorEastAsia" w:hAnsiTheme="minorHAnsi" w:cstheme="minorBidi" w:ascii="Calibri" w:hAnsi="Calibri" w:eastAsia="Calibri" w:cs="Calibri"/>
                       <w:sz w:val="24"/>
                       <w:szCs w:val="24"/>
                       <w:lang w:val="es-CL" w:eastAsia="es-CL"/>
@@ -10219,7 +10301,7 @@
                   </w:pPr>
                   <w:r>
                     <w:rPr>
-                      <w:rFonts w:asciiTheme="minorHAnsi" w:eastAsiaTheme="minorEastAsia" w:hAnsiTheme="minorHAnsi" w:cstheme="minorBidi"/>
+                      <w:rFonts w:asciiTheme="minorHAnsi" w:eastAsiaTheme="minorEastAsia" w:hAnsiTheme="minorHAnsi" w:cstheme="minorBidi" w:ascii="Calibri" w:hAnsi="Calibri" w:eastAsia="Calibri" w:cs="Calibri"/>
                       <w:sz w:val="24"/>
                       <w:szCs w:val="24"/>
                       <w:lang w:val="es-CL" w:eastAsia="es-CL"/>
@@ -10246,7 +10328,7 @@
                   </w:pPr>
                   <w:r>
                     <w:rPr>
-                      <w:rFonts w:asciiTheme="minorHAnsi" w:eastAsiaTheme="minorEastAsia" w:hAnsiTheme="minorHAnsi" w:cstheme="minorBidi"/>
+                      <w:rFonts w:asciiTheme="minorHAnsi" w:eastAsiaTheme="minorEastAsia" w:hAnsiTheme="minorHAnsi" w:cstheme="minorBidi" w:ascii="Calibri" w:hAnsi="Calibri" w:eastAsia="Calibri" w:cs="Calibri"/>
                       <w:sz w:val="24"/>
                       <w:szCs w:val="24"/>
                       <w:lang w:val="es-CL" w:eastAsia="es-CL"/>
@@ -10278,7 +10360,7 @@
                   </w:pPr>
                   <w:r>
                     <w:rPr>
-                      <w:rFonts w:asciiTheme="minorHAnsi" w:eastAsiaTheme="minorEastAsia" w:hAnsiTheme="minorHAnsi" w:cstheme="minorBidi"/>
+                      <w:rFonts w:asciiTheme="minorHAnsi" w:eastAsiaTheme="minorEastAsia" w:hAnsiTheme="minorHAnsi" w:cstheme="minorBidi" w:ascii="Calibri" w:hAnsi="Calibri" w:eastAsia="Calibri" w:cs="Calibri"/>
                       <w:sz w:val="24"/>
                       <w:szCs w:val="24"/>
                       <w:lang w:val="es-CL" w:eastAsia="es-CL"/>
@@ -10305,7 +10387,7 @@
                   </w:pPr>
                   <w:r>
                     <w:rPr>
-                      <w:rFonts w:asciiTheme="minorHAnsi" w:eastAsiaTheme="minorEastAsia" w:hAnsiTheme="minorHAnsi" w:cstheme="minorBidi"/>
+                      <w:rFonts w:asciiTheme="minorHAnsi" w:eastAsiaTheme="minorEastAsia" w:hAnsiTheme="minorHAnsi" w:cstheme="minorBidi" w:ascii="Calibri" w:hAnsi="Calibri" w:eastAsia="Calibri" w:cs="Calibri"/>
                       <w:sz w:val="24"/>
                       <w:szCs w:val="24"/>
                       <w:lang w:val="es-CL" w:eastAsia="es-CL"/>
@@ -10332,7 +10414,7 @@
                   </w:pPr>
                   <w:r>
                     <w:rPr>
-                      <w:rFonts w:asciiTheme="minorHAnsi" w:eastAsiaTheme="minorEastAsia" w:hAnsiTheme="minorHAnsi" w:cstheme="minorBidi"/>
+                      <w:rFonts w:asciiTheme="minorHAnsi" w:eastAsiaTheme="minorEastAsia" w:hAnsiTheme="minorHAnsi" w:cstheme="minorBidi" w:ascii="Calibri" w:hAnsi="Calibri" w:eastAsia="Calibri" w:cs="Calibri"/>
                       <w:sz w:val="24"/>
                       <w:szCs w:val="24"/>
                       <w:lang w:val="es-CL" w:eastAsia="es-CL"/>
@@ -10342,7 +10424,7 @@
                   <w:proofErr w:type="spellStart"/>
                   <w:r>
                     <w:rPr>
-                      <w:rFonts w:asciiTheme="minorHAnsi" w:eastAsiaTheme="minorEastAsia" w:hAnsiTheme="minorHAnsi" w:cstheme="minorBidi"/>
+                      <w:rFonts w:asciiTheme="minorHAnsi" w:eastAsiaTheme="minorEastAsia" w:hAnsiTheme="minorHAnsi" w:cstheme="minorBidi" w:ascii="Calibri" w:hAnsi="Calibri" w:eastAsia="Calibri" w:cs="Calibri"/>
                       <w:sz w:val="24"/>
                       <w:szCs w:val="24"/>
                       <w:lang w:val="es-CL" w:eastAsia="es-CL"/>
@@ -10352,7 +10434,7 @@
                   <w:proofErr w:type="spellEnd"/>
                   <w:r>
                     <w:rPr>
-                      <w:rFonts w:asciiTheme="minorHAnsi" w:eastAsiaTheme="minorEastAsia" w:hAnsiTheme="minorHAnsi" w:cstheme="minorBidi"/>
+                      <w:rFonts w:asciiTheme="minorHAnsi" w:eastAsiaTheme="minorEastAsia" w:hAnsiTheme="minorHAnsi" w:cstheme="minorBidi" w:ascii="Calibri" w:hAnsi="Calibri" w:eastAsia="Calibri" w:cs="Calibri"/>
                       <w:sz w:val="24"/>
                       <w:szCs w:val="24"/>
                       <w:lang w:val="es-CL" w:eastAsia="es-CL"/>
@@ -10384,7 +10466,7 @@
                   </w:pPr>
                   <w:r>
                     <w:rPr>
-                      <w:rFonts w:asciiTheme="minorHAnsi" w:eastAsiaTheme="minorEastAsia" w:hAnsiTheme="minorHAnsi" w:cstheme="minorBidi"/>
+                      <w:rFonts w:asciiTheme="minorHAnsi" w:eastAsiaTheme="minorEastAsia" w:hAnsiTheme="minorHAnsi" w:cstheme="minorBidi" w:ascii="Calibri" w:hAnsi="Calibri" w:eastAsia="Calibri" w:cs="Calibri"/>
                       <w:sz w:val="24"/>
                       <w:szCs w:val="24"/>
                       <w:lang w:val="es-CL" w:eastAsia="es-CL"/>
@@ -10412,7 +10494,7 @@
                   <w:proofErr w:type="spellStart"/>
                   <w:r>
                     <w:rPr>
-                      <w:rFonts w:asciiTheme="minorHAnsi" w:eastAsiaTheme="minorEastAsia" w:hAnsiTheme="minorHAnsi" w:cstheme="minorBidi"/>
+                      <w:rFonts w:asciiTheme="minorHAnsi" w:eastAsiaTheme="minorEastAsia" w:hAnsiTheme="minorHAnsi" w:cstheme="minorBidi" w:ascii="Calibri" w:hAnsi="Calibri" w:eastAsia="Calibri" w:cs="Calibri"/>
                       <w:sz w:val="24"/>
                       <w:szCs w:val="24"/>
                       <w:lang w:val="es-CL" w:eastAsia="es-CL"/>
@@ -10422,7 +10504,7 @@
                   <w:proofErr w:type="spellEnd"/>
                   <w:r>
                     <w:rPr>
-                      <w:rFonts w:asciiTheme="minorHAnsi" w:eastAsiaTheme="minorEastAsia" w:hAnsiTheme="minorHAnsi" w:cstheme="minorBidi"/>
+                      <w:rFonts w:asciiTheme="minorHAnsi" w:eastAsiaTheme="minorEastAsia" w:hAnsiTheme="minorHAnsi" w:cstheme="minorBidi" w:ascii="Calibri" w:hAnsi="Calibri" w:eastAsia="Calibri" w:cs="Calibri"/>
                       <w:sz w:val="24"/>
                       <w:szCs w:val="24"/>
                       <w:lang w:val="es-CL" w:eastAsia="es-CL"/>
@@ -10432,7 +10514,7 @@
                   <w:proofErr w:type="spellStart"/>
                   <w:r>
                     <w:rPr>
-                      <w:rFonts w:asciiTheme="minorHAnsi" w:eastAsiaTheme="minorEastAsia" w:hAnsiTheme="minorHAnsi" w:cstheme="minorBidi"/>
+                      <w:rFonts w:asciiTheme="minorHAnsi" w:eastAsiaTheme="minorEastAsia" w:hAnsiTheme="minorHAnsi" w:cstheme="minorBidi" w:ascii="Calibri" w:hAnsi="Calibri" w:eastAsia="Calibri" w:cs="Calibri"/>
                       <w:sz w:val="24"/>
                       <w:szCs w:val="24"/>
                       <w:lang w:val="es-CL" w:eastAsia="es-CL"/>
@@ -10442,7 +10524,7 @@
                   <w:proofErr w:type="spellEnd"/>
                   <w:r>
                     <w:rPr>
-                      <w:rFonts w:asciiTheme="minorHAnsi" w:eastAsiaTheme="minorEastAsia" w:hAnsiTheme="minorHAnsi" w:cstheme="minorBidi"/>
+                      <w:rFonts w:asciiTheme="minorHAnsi" w:eastAsiaTheme="minorEastAsia" w:hAnsiTheme="minorHAnsi" w:cstheme="minorBidi" w:ascii="Calibri" w:hAnsi="Calibri" w:eastAsia="Calibri" w:cs="Calibri"/>
                       <w:sz w:val="24"/>
                       <w:szCs w:val="24"/>
                       <w:lang w:val="es-CL" w:eastAsia="es-CL"/>
@@ -10452,7 +10534,7 @@
                   <w:proofErr w:type="spellStart"/>
                   <w:r>
                     <w:rPr>
-                      <w:rFonts w:asciiTheme="minorHAnsi" w:eastAsiaTheme="minorEastAsia" w:hAnsiTheme="minorHAnsi" w:cstheme="minorBidi"/>
+                      <w:rFonts w:asciiTheme="minorHAnsi" w:eastAsiaTheme="minorEastAsia" w:hAnsiTheme="minorHAnsi" w:cstheme="minorBidi" w:ascii="Calibri" w:hAnsi="Calibri" w:eastAsia="Calibri" w:cs="Calibri"/>
                       <w:sz w:val="24"/>
                       <w:szCs w:val="24"/>
                       <w:lang w:val="es-CL" w:eastAsia="es-CL"/>
@@ -10462,7 +10544,7 @@
                   <w:proofErr w:type="spellEnd"/>
                   <w:r>
                     <w:rPr>
-                      <w:rFonts w:asciiTheme="minorHAnsi" w:eastAsiaTheme="minorEastAsia" w:hAnsiTheme="minorHAnsi" w:cstheme="minorBidi"/>
+                      <w:rFonts w:asciiTheme="minorHAnsi" w:eastAsiaTheme="minorEastAsia" w:hAnsiTheme="minorHAnsi" w:cstheme="minorBidi" w:ascii="Calibri" w:hAnsi="Calibri" w:eastAsia="Calibri" w:cs="Calibri"/>
                       <w:sz w:val="24"/>
                       <w:szCs w:val="24"/>
                       <w:lang w:val="es-CL" w:eastAsia="es-CL"/>
@@ -10489,7 +10571,7 @@
                   </w:pPr>
                   <w:r>
                     <w:rPr>
-                      <w:rFonts w:asciiTheme="minorHAnsi" w:eastAsiaTheme="minorEastAsia" w:hAnsiTheme="minorHAnsi" w:cstheme="minorBidi"/>
+                      <w:rFonts w:asciiTheme="minorHAnsi" w:eastAsiaTheme="minorEastAsia" w:hAnsiTheme="minorHAnsi" w:cstheme="minorBidi" w:ascii="Calibri" w:hAnsi="Calibri" w:eastAsia="Calibri" w:cs="Calibri"/>
                       <w:sz w:val="24"/>
                       <w:szCs w:val="24"/>
                       <w:lang w:val="es-CL" w:eastAsia="es-CL"/>
@@ -10521,7 +10603,7 @@
                   </w:pPr>
                   <w:r>
                     <w:rPr>
-                      <w:rFonts w:asciiTheme="minorHAnsi" w:eastAsiaTheme="minorEastAsia" w:hAnsiTheme="minorHAnsi" w:cstheme="minorBidi"/>
+                      <w:rFonts w:asciiTheme="minorHAnsi" w:eastAsiaTheme="minorEastAsia" w:hAnsiTheme="minorHAnsi" w:cstheme="minorBidi" w:ascii="Calibri" w:hAnsi="Calibri" w:eastAsia="Calibri" w:cs="Calibri"/>
                       <w:sz w:val="24"/>
                       <w:szCs w:val="24"/>
                       <w:lang w:val="es-CL" w:eastAsia="es-CL"/>
@@ -10548,7 +10630,7 @@
                   </w:pPr>
                   <w:r>
                     <w:rPr>
-                      <w:rFonts w:asciiTheme="minorHAnsi" w:eastAsiaTheme="minorEastAsia" w:hAnsiTheme="minorHAnsi" w:cstheme="minorBidi"/>
+                      <w:rFonts w:asciiTheme="minorHAnsi" w:eastAsiaTheme="minorEastAsia" w:hAnsiTheme="minorHAnsi" w:cstheme="minorBidi" w:ascii="Calibri" w:hAnsi="Calibri" w:eastAsia="Calibri" w:cs="Calibri"/>
                       <w:sz w:val="24"/>
                       <w:szCs w:val="24"/>
                       <w:lang w:val="es-CL" w:eastAsia="es-CL"/>
@@ -10575,7 +10657,7 @@
                   </w:pPr>
                   <w:r>
                     <w:rPr>
-                      <w:rFonts w:asciiTheme="minorHAnsi" w:eastAsiaTheme="minorEastAsia" w:hAnsiTheme="minorHAnsi" w:cstheme="minorBidi"/>
+                      <w:rFonts w:asciiTheme="minorHAnsi" w:eastAsiaTheme="minorEastAsia" w:hAnsiTheme="minorHAnsi" w:cstheme="minorBidi" w:ascii="Calibri" w:hAnsi="Calibri" w:eastAsia="Calibri" w:cs="Calibri"/>
                       <w:sz w:val="24"/>
                       <w:szCs w:val="24"/>
                       <w:lang w:val="es-CL" w:eastAsia="es-CL"/>
@@ -10607,7 +10689,7 @@
                   </w:pPr>
                   <w:r>
                     <w:rPr>
-                      <w:rFonts w:asciiTheme="minorHAnsi" w:eastAsiaTheme="minorEastAsia" w:hAnsiTheme="minorHAnsi" w:cstheme="minorBidi"/>
+                      <w:rFonts w:asciiTheme="minorHAnsi" w:eastAsiaTheme="minorEastAsia" w:hAnsiTheme="minorHAnsi" w:cstheme="minorBidi" w:ascii="Calibri" w:hAnsi="Calibri" w:eastAsia="Calibri" w:cs="Calibri"/>
                       <w:sz w:val="24"/>
                       <w:szCs w:val="24"/>
                       <w:lang w:val="es-CL" w:eastAsia="es-CL"/>
@@ -10634,7 +10716,7 @@
                   </w:pPr>
                   <w:r>
                     <w:rPr>
-                      <w:rFonts w:asciiTheme="minorHAnsi" w:eastAsiaTheme="minorEastAsia" w:hAnsiTheme="minorHAnsi" w:cstheme="minorBidi"/>
+                      <w:rFonts w:asciiTheme="minorHAnsi" w:eastAsiaTheme="minorEastAsia" w:hAnsiTheme="minorHAnsi" w:cstheme="minorBidi" w:ascii="Calibri" w:hAnsi="Calibri" w:eastAsia="Calibri" w:cs="Calibri"/>
                       <w:sz w:val="24"/>
                       <w:szCs w:val="24"/>
                       <w:lang w:val="es-CL" w:eastAsia="es-CL"/>
@@ -10661,7 +10743,7 @@
                   </w:pPr>
                   <w:r>
                     <w:rPr>
-                      <w:rFonts w:asciiTheme="minorHAnsi" w:eastAsiaTheme="minorEastAsia" w:hAnsiTheme="minorHAnsi" w:cstheme="minorBidi"/>
+                      <w:rFonts w:asciiTheme="minorHAnsi" w:eastAsiaTheme="minorEastAsia" w:hAnsiTheme="minorHAnsi" w:cstheme="minorBidi" w:ascii="Calibri" w:hAnsi="Calibri" w:eastAsia="Calibri" w:cs="Calibri"/>
                       <w:sz w:val="24"/>
                       <w:szCs w:val="24"/>
                       <w:lang w:val="es-CL" w:eastAsia="es-CL"/>
@@ -10670,7 +10752,7 @@
                   </w:r>
                   <w:r>
                     <w:rPr>
-                      <w:rFonts w:asciiTheme="minorHAnsi" w:eastAsiaTheme="minorEastAsia" w:hAnsiTheme="minorHAnsi" w:cstheme="minorBidi"/>
+                      <w:rFonts w:asciiTheme="minorHAnsi" w:eastAsiaTheme="minorEastAsia" w:hAnsiTheme="minorHAnsi" w:cstheme="minorBidi" w:ascii="Calibri" w:hAnsi="Calibri" w:eastAsia="Calibri" w:cs="Calibri"/>
                       <w:b/>
                       <w:bCs/>
                       <w:sz w:val="24"/>
@@ -10681,7 +10763,7 @@
                   </w:r>
                   <w:r>
                     <w:rPr>
-                      <w:rFonts w:asciiTheme="minorHAnsi" w:eastAsiaTheme="minorEastAsia" w:hAnsiTheme="minorHAnsi" w:cstheme="minorBidi"/>
+                      <w:rFonts w:asciiTheme="minorHAnsi" w:eastAsiaTheme="minorEastAsia" w:hAnsiTheme="minorHAnsi" w:cstheme="minorBidi" w:ascii="Calibri" w:hAnsi="Calibri" w:eastAsia="Calibri" w:cs="Calibri"/>
                       <w:sz w:val="24"/>
                       <w:szCs w:val="24"/>
                       <w:lang w:val="es-CL" w:eastAsia="es-CL"/>
@@ -10713,7 +10795,7 @@
                   </w:pPr>
                   <w:r>
                     <w:rPr>
-                      <w:rFonts w:asciiTheme="minorHAnsi" w:eastAsiaTheme="minorEastAsia" w:hAnsiTheme="minorHAnsi" w:cstheme="minorBidi"/>
+                      <w:rFonts w:asciiTheme="minorHAnsi" w:eastAsiaTheme="minorEastAsia" w:hAnsiTheme="minorHAnsi" w:cstheme="minorBidi" w:ascii="Calibri" w:hAnsi="Calibri" w:eastAsia="Calibri" w:cs="Calibri"/>
                       <w:sz w:val="24"/>
                       <w:szCs w:val="24"/>
                       <w:lang w:val="es-CL" w:eastAsia="es-CL"/>
@@ -10741,7 +10823,7 @@
                   </w:pPr>
                   <w:r>
                     <w:rPr>
-                      <w:rFonts w:asciiTheme="minorHAnsi" w:eastAsiaTheme="minorEastAsia" w:hAnsiTheme="minorHAnsi" w:cstheme="minorBidi"/>
+                      <w:rFonts w:asciiTheme="minorHAnsi" w:eastAsiaTheme="minorEastAsia" w:hAnsiTheme="minorHAnsi" w:cstheme="minorBidi" w:ascii="Calibri" w:hAnsi="Calibri" w:eastAsia="Calibri" w:cs="Calibri"/>
                       <w:sz w:val="24"/>
                       <w:szCs w:val="24"/>
                       <w:lang w:val="es-CL" w:eastAsia="es-CL"/>
@@ -10768,7 +10850,7 @@
                   </w:pPr>
                   <w:r>
                     <w:rPr>
-                      <w:rFonts w:asciiTheme="minorHAnsi" w:eastAsiaTheme="minorEastAsia" w:hAnsiTheme="minorHAnsi" w:cstheme="minorBidi"/>
+                      <w:rFonts w:asciiTheme="minorHAnsi" w:eastAsiaTheme="minorEastAsia" w:hAnsiTheme="minorHAnsi" w:cstheme="minorBidi" w:ascii="Calibri" w:hAnsi="Calibri" w:eastAsia="Calibri" w:cs="Calibri"/>
                       <w:sz w:val="24"/>
                       <w:szCs w:val="24"/>
                       <w:lang w:val="es-CL" w:eastAsia="es-CL"/>
@@ -10800,7 +10882,7 @@
                   </w:pPr>
                   <w:r>
                     <w:rPr>
-                      <w:rFonts w:asciiTheme="minorHAnsi" w:eastAsiaTheme="minorEastAsia" w:hAnsiTheme="minorHAnsi" w:cstheme="minorBidi"/>
+                      <w:rFonts w:asciiTheme="minorHAnsi" w:eastAsiaTheme="minorEastAsia" w:hAnsiTheme="minorHAnsi" w:cstheme="minorBidi" w:ascii="Calibri" w:hAnsi="Calibri" w:eastAsia="Calibri" w:cs="Calibri"/>
                       <w:sz w:val="24"/>
                       <w:szCs w:val="24"/>
                       <w:lang w:val="es-CL" w:eastAsia="es-CL"/>
@@ -10827,7 +10909,7 @@
                   </w:pPr>
                   <w:r>
                     <w:rPr>
-                      <w:rFonts w:asciiTheme="minorHAnsi" w:eastAsiaTheme="minorEastAsia" w:hAnsiTheme="minorHAnsi" w:cstheme="minorBidi"/>
+                      <w:rFonts w:asciiTheme="minorHAnsi" w:eastAsiaTheme="minorEastAsia" w:hAnsiTheme="minorHAnsi" w:cstheme="minorBidi" w:ascii="Calibri" w:hAnsi="Calibri" w:eastAsia="Calibri" w:cs="Calibri"/>
                       <w:sz w:val="24"/>
                       <w:szCs w:val="24"/>
                       <w:lang w:val="es-CL" w:eastAsia="es-CL"/>
@@ -10854,7 +10936,7 @@
                   </w:pPr>
                   <w:r>
                     <w:rPr>
-                      <w:rFonts w:asciiTheme="minorHAnsi" w:eastAsiaTheme="minorEastAsia" w:hAnsiTheme="minorHAnsi" w:cstheme="minorBidi"/>
+                      <w:rFonts w:asciiTheme="minorHAnsi" w:eastAsiaTheme="minorEastAsia" w:hAnsiTheme="minorHAnsi" w:cstheme="minorBidi" w:ascii="Calibri" w:hAnsi="Calibri" w:eastAsia="Calibri" w:cs="Calibri"/>
                       <w:sz w:val="24"/>
                       <w:szCs w:val="24"/>
                       <w:lang w:val="es-CL" w:eastAsia="es-CL"/>
@@ -10886,7 +10968,7 @@
                   </w:pPr>
                   <w:r>
                     <w:rPr>
-                      <w:rFonts w:asciiTheme="minorHAnsi" w:eastAsiaTheme="minorEastAsia" w:hAnsiTheme="minorHAnsi" w:cstheme="minorBidi"/>
+                      <w:rFonts w:asciiTheme="minorHAnsi" w:eastAsiaTheme="minorEastAsia" w:hAnsiTheme="minorHAnsi" w:cstheme="minorBidi" w:ascii="Calibri" w:hAnsi="Calibri" w:eastAsia="Calibri" w:cs="Calibri"/>
                       <w:sz w:val="24"/>
                       <w:szCs w:val="24"/>
                       <w:lang w:val="es-CL" w:eastAsia="es-CL"/>
@@ -10913,7 +10995,7 @@
                   </w:pPr>
                   <w:r>
                     <w:rPr>
-                      <w:rFonts w:asciiTheme="minorHAnsi" w:eastAsiaTheme="minorEastAsia" w:hAnsiTheme="minorHAnsi" w:cstheme="minorBidi"/>
+                      <w:rFonts w:asciiTheme="minorHAnsi" w:eastAsiaTheme="minorEastAsia" w:hAnsiTheme="minorHAnsi" w:cstheme="minorBidi" w:ascii="Calibri" w:hAnsi="Calibri" w:eastAsia="Calibri" w:cs="Calibri"/>
                       <w:sz w:val="24"/>
                       <w:szCs w:val="24"/>
                       <w:lang w:val="es-CL" w:eastAsia="es-CL"/>
@@ -10940,7 +11022,7 @@
                   </w:pPr>
                   <w:r>
                     <w:rPr>
-                      <w:rFonts w:asciiTheme="minorHAnsi" w:eastAsiaTheme="minorEastAsia" w:hAnsiTheme="minorHAnsi" w:cstheme="minorBidi"/>
+                      <w:rFonts w:asciiTheme="minorHAnsi" w:eastAsiaTheme="minorEastAsia" w:hAnsiTheme="minorHAnsi" w:cstheme="minorBidi" w:ascii="Calibri" w:hAnsi="Calibri" w:eastAsia="Calibri" w:cs="Calibri"/>
                       <w:sz w:val="24"/>
                       <w:szCs w:val="24"/>
                       <w:lang w:val="es-CL" w:eastAsia="es-CL"/>
@@ -10949,7 +11031,7 @@
                   </w:r>
                   <w:r>
                     <w:rPr>
-                      <w:rFonts w:asciiTheme="minorHAnsi" w:eastAsiaTheme="minorEastAsia" w:hAnsiTheme="minorHAnsi" w:cstheme="minorBidi"/>
+                      <w:rFonts w:asciiTheme="minorHAnsi" w:eastAsiaTheme="minorEastAsia" w:hAnsiTheme="minorHAnsi" w:cstheme="minorBidi" w:ascii="Calibri" w:hAnsi="Calibri" w:eastAsia="Calibri" w:cs="Calibri"/>
                       <w:b/>
                       <w:bCs/>
                       <w:sz w:val="24"/>
@@ -10960,7 +11042,7 @@
                   </w:r>
                   <w:r>
                     <w:rPr>
-                      <w:rFonts w:asciiTheme="minorHAnsi" w:eastAsiaTheme="minorEastAsia" w:hAnsiTheme="minorHAnsi" w:cstheme="minorBidi"/>
+                      <w:rFonts w:asciiTheme="minorHAnsi" w:eastAsiaTheme="minorEastAsia" w:hAnsiTheme="minorHAnsi" w:cstheme="minorBidi" w:ascii="Calibri" w:hAnsi="Calibri" w:eastAsia="Calibri" w:cs="Calibri"/>
                       <w:sz w:val="24"/>
                       <w:szCs w:val="24"/>
                       <w:lang w:val="es-CL" w:eastAsia="es-CL"/>
@@ -10992,7 +11074,7 @@
                   </w:pPr>
                   <w:r>
                     <w:rPr>
-                      <w:rFonts w:asciiTheme="minorHAnsi" w:eastAsiaTheme="minorEastAsia" w:hAnsiTheme="minorHAnsi" w:cstheme="minorBidi"/>
+                      <w:rFonts w:asciiTheme="minorHAnsi" w:eastAsiaTheme="minorEastAsia" w:hAnsiTheme="minorHAnsi" w:cstheme="minorBidi" w:ascii="Calibri" w:hAnsi="Calibri" w:eastAsia="Calibri" w:cs="Calibri"/>
                       <w:sz w:val="24"/>
                       <w:szCs w:val="24"/>
                       <w:lang w:val="es-CL" w:eastAsia="es-CL"/>
@@ -11019,7 +11101,7 @@
                   </w:pPr>
                   <w:r>
                     <w:rPr>
-                      <w:rFonts w:asciiTheme="minorHAnsi" w:eastAsiaTheme="minorEastAsia" w:hAnsiTheme="minorHAnsi" w:cstheme="minorBidi"/>
+                      <w:rFonts w:asciiTheme="minorHAnsi" w:eastAsiaTheme="minorEastAsia" w:hAnsiTheme="minorHAnsi" w:cstheme="minorBidi" w:ascii="Calibri" w:hAnsi="Calibri" w:eastAsia="Calibri" w:cs="Calibri"/>
                       <w:sz w:val="24"/>
                       <w:szCs w:val="24"/>
                       <w:lang w:val="es-CL" w:eastAsia="es-CL"/>
@@ -11046,7 +11128,7 @@
                   </w:pPr>
                   <w:r>
                     <w:rPr>
-                      <w:rFonts w:asciiTheme="minorHAnsi" w:eastAsiaTheme="minorEastAsia" w:hAnsiTheme="minorHAnsi" w:cstheme="minorBidi"/>
+                      <w:rFonts w:asciiTheme="minorHAnsi" w:eastAsiaTheme="minorEastAsia" w:hAnsiTheme="minorHAnsi" w:cstheme="minorBidi" w:ascii="Calibri" w:hAnsi="Calibri" w:eastAsia="Calibri" w:cs="Calibri"/>
                       <w:sz w:val="24"/>
                       <w:szCs w:val="24"/>
                       <w:lang w:val="es-CL" w:eastAsia="es-CL"/>
@@ -11056,7 +11138,7 @@
                   <w:proofErr w:type="spellStart"/>
                   <w:r>
                     <w:rPr>
-                      <w:rFonts w:asciiTheme="minorHAnsi" w:eastAsiaTheme="minorEastAsia" w:hAnsiTheme="minorHAnsi" w:cstheme="minorBidi"/>
+                      <w:rFonts w:asciiTheme="minorHAnsi" w:eastAsiaTheme="minorEastAsia" w:hAnsiTheme="minorHAnsi" w:cstheme="minorBidi" w:ascii="Calibri" w:hAnsi="Calibri" w:eastAsia="Calibri" w:cs="Calibri"/>
                       <w:sz w:val="24"/>
                       <w:szCs w:val="24"/>
                       <w:lang w:val="es-CL" w:eastAsia="es-CL"/>
@@ -11066,7 +11148,7 @@
                   <w:proofErr w:type="spellEnd"/>
                   <w:r>
                     <w:rPr>
-                      <w:rFonts w:asciiTheme="minorHAnsi" w:eastAsiaTheme="minorEastAsia" w:hAnsiTheme="minorHAnsi" w:cstheme="minorBidi"/>
+                      <w:rFonts w:asciiTheme="minorHAnsi" w:eastAsiaTheme="minorEastAsia" w:hAnsiTheme="minorHAnsi" w:cstheme="minorBidi" w:ascii="Calibri" w:hAnsi="Calibri" w:eastAsia="Calibri" w:cs="Calibri"/>
                       <w:sz w:val="24"/>
                       <w:szCs w:val="24"/>
                       <w:lang w:val="es-CL" w:eastAsia="es-CL"/>
@@ -11098,7 +11180,7 @@
                   </w:pPr>
                   <w:r>
                     <w:rPr>
-                      <w:rFonts w:asciiTheme="minorHAnsi" w:eastAsiaTheme="minorEastAsia" w:hAnsiTheme="minorHAnsi" w:cstheme="minorBidi"/>
+                      <w:rFonts w:asciiTheme="minorHAnsi" w:eastAsiaTheme="minorEastAsia" w:hAnsiTheme="minorHAnsi" w:cstheme="minorBidi" w:ascii="Calibri" w:hAnsi="Calibri" w:eastAsia="Calibri" w:cs="Calibri"/>
                       <w:sz w:val="24"/>
                       <w:szCs w:val="24"/>
                       <w:lang w:val="es-CL" w:eastAsia="es-CL"/>
@@ -11125,7 +11207,7 @@
                   </w:pPr>
                   <w:r>
                     <w:rPr>
-                      <w:rFonts w:asciiTheme="minorHAnsi" w:eastAsiaTheme="minorEastAsia" w:hAnsiTheme="minorHAnsi" w:cstheme="minorBidi"/>
+                      <w:rFonts w:asciiTheme="minorHAnsi" w:eastAsiaTheme="minorEastAsia" w:hAnsiTheme="minorHAnsi" w:cstheme="minorBidi" w:ascii="Calibri" w:hAnsi="Calibri" w:eastAsia="Calibri" w:cs="Calibri"/>
                       <w:sz w:val="24"/>
                       <w:szCs w:val="24"/>
                       <w:lang w:val="es-CL" w:eastAsia="es-CL"/>
@@ -11152,7 +11234,7 @@
                   </w:pPr>
                   <w:r>
                     <w:rPr>
-                      <w:rFonts w:asciiTheme="minorHAnsi" w:eastAsiaTheme="minorEastAsia" w:hAnsiTheme="minorHAnsi" w:cstheme="minorBidi"/>
+                      <w:rFonts w:asciiTheme="minorHAnsi" w:eastAsiaTheme="minorEastAsia" w:hAnsiTheme="minorHAnsi" w:cstheme="minorBidi" w:ascii="Calibri" w:hAnsi="Calibri" w:eastAsia="Calibri" w:cs="Calibri"/>
                       <w:sz w:val="24"/>
                       <w:szCs w:val="24"/>
                       <w:lang w:val="es-CL" w:eastAsia="es-CL"/>
@@ -11174,7 +11256,7 @@
             </w:pPr>
             <w:r>
               <w:rPr>
-                <w:rFonts w:asciiTheme="minorHAnsi" w:eastAsiaTheme="minorEastAsia" w:hAnsiTheme="minorHAnsi" w:cstheme="minorBidi"/>
+                <w:rFonts w:asciiTheme="minorHAnsi" w:eastAsiaTheme="minorEastAsia" w:hAnsiTheme="minorHAnsi" w:cstheme="minorBidi" w:ascii="Calibri" w:hAnsi="Calibri" w:eastAsia="Calibri" w:cs="Calibri"/>
                 <w:sz w:val="24"/>
                 <w:szCs w:val="24"/>
                 <w:lang w:val="es-CL" w:eastAsia="es-CL"/>
@@ -11193,7 +11275,7 @@
             </w:pPr>
             <w:r>
               <w:rPr>
-                <w:rFonts w:asciiTheme="minorHAnsi" w:eastAsiaTheme="minorEastAsia" w:hAnsiTheme="minorHAnsi" w:cstheme="minorBidi"/>
+                <w:rFonts w:asciiTheme="minorHAnsi" w:eastAsiaTheme="minorEastAsia" w:hAnsiTheme="minorHAnsi" w:cstheme="minorBidi" w:ascii="Calibri" w:hAnsi="Calibri" w:eastAsia="Calibri" w:cs="Calibri"/>
                 <w:sz w:val="24"/>
                 <w:szCs w:val="24"/>
                 <w:lang w:val="es-CL" w:eastAsia="es-CL"/>
@@ -11202,7 +11284,7 @@
             </w:r>
             <w:r>
               <w:rPr>
-                <w:rFonts w:asciiTheme="minorHAnsi" w:eastAsiaTheme="minorEastAsia" w:hAnsiTheme="minorHAnsi" w:cstheme="minorBidi"/>
+                <w:rFonts w:asciiTheme="minorHAnsi" w:eastAsiaTheme="minorEastAsia" w:hAnsiTheme="minorHAnsi" w:cstheme="minorBidi" w:ascii="Calibri" w:hAnsi="Calibri" w:eastAsia="Calibri" w:cs="Calibri"/>
                 <w:b/>
                 <w:bCs/>
                 <w:sz w:val="24"/>
@@ -11213,7 +11295,7 @@
             </w:r>
             <w:r>
               <w:rPr>
-                <w:rFonts w:asciiTheme="minorHAnsi" w:eastAsiaTheme="minorEastAsia" w:hAnsiTheme="minorHAnsi" w:cstheme="minorBidi"/>
+                <w:rFonts w:asciiTheme="minorHAnsi" w:eastAsiaTheme="minorEastAsia" w:hAnsiTheme="minorHAnsi" w:cstheme="minorBidi" w:ascii="Calibri" w:hAnsi="Calibri" w:eastAsia="Calibri" w:cs="Calibri"/>
                 <w:sz w:val="24"/>
                 <w:szCs w:val="24"/>
                 <w:lang w:val="es-CL" w:eastAsia="es-CL"/>
@@ -11254,7 +11336,7 @@
             </w:pPr>
             <w:r>
               <w:rPr>
-                <w:rFonts w:asciiTheme="minorHAnsi" w:eastAsiaTheme="minorEastAsia" w:hAnsiTheme="minorHAnsi" w:cstheme="minorBidi"/>
+                <w:rFonts w:asciiTheme="minorHAnsi" w:eastAsiaTheme="minorEastAsia" w:hAnsiTheme="minorHAnsi" w:cstheme="minorBidi" w:ascii="Calibri" w:hAnsi="Calibri" w:eastAsia="Calibri" w:cs="Calibri"/>
                 <w:b/>
                 <w:bCs/>
                 <w:sz w:val="24"/>
@@ -11277,7 +11359,7 @@
             </w:pPr>
             <w:r>
               <w:rPr>
-                <w:rFonts w:asciiTheme="minorHAnsi" w:eastAsiaTheme="minorEastAsia" w:hAnsiTheme="minorHAnsi" w:cstheme="minorBidi"/>
+                <w:rFonts w:asciiTheme="minorHAnsi" w:eastAsiaTheme="minorEastAsia" w:hAnsiTheme="minorHAnsi" w:cstheme="minorBidi" w:ascii="Calibri" w:hAnsi="Calibri" w:eastAsia="Calibri" w:cs="Calibri"/>
                 <w:b/>
                 <w:bCs/>
                 <w:sz w:val="24"/>
@@ -11300,7 +11382,7 @@
             </w:pPr>
             <w:r>
               <w:rPr>
-                <w:rFonts w:asciiTheme="minorHAnsi" w:eastAsiaTheme="minorEastAsia" w:hAnsiTheme="minorHAnsi" w:cstheme="minorBidi"/>
+                <w:rFonts w:asciiTheme="minorHAnsi" w:eastAsiaTheme="minorEastAsia" w:hAnsiTheme="minorHAnsi" w:cstheme="minorBidi" w:ascii="Calibri" w:hAnsi="Calibri" w:eastAsia="Calibri" w:cs="Calibri"/>
                 <w:b/>
                 <w:bCs/>
                 <w:sz w:val="24"/>
@@ -11323,7 +11405,7 @@
             </w:pPr>
             <w:r>
               <w:rPr>
-                <w:rFonts w:asciiTheme="minorHAnsi" w:eastAsiaTheme="minorEastAsia" w:hAnsiTheme="minorHAnsi" w:cstheme="minorBidi"/>
+                <w:rFonts w:asciiTheme="minorHAnsi" w:eastAsiaTheme="minorEastAsia" w:hAnsiTheme="minorHAnsi" w:cstheme="minorBidi" w:ascii="Calibri" w:hAnsi="Calibri" w:eastAsia="Calibri" w:cs="Calibri"/>
                 <w:b/>
                 <w:bCs/>
                 <w:sz w:val="24"/>
@@ -11335,7 +11417,7 @@
             <w:proofErr w:type="spellStart"/>
             <w:r>
               <w:rPr>
-                <w:rFonts w:asciiTheme="minorHAnsi" w:eastAsiaTheme="minorEastAsia" w:hAnsiTheme="minorHAnsi" w:cstheme="minorBidi"/>
+                <w:rFonts w:asciiTheme="minorHAnsi" w:eastAsiaTheme="minorEastAsia" w:hAnsiTheme="minorHAnsi" w:cstheme="minorBidi" w:ascii="Calibri" w:hAnsi="Calibri" w:eastAsia="Calibri" w:cs="Calibri"/>
                 <w:b/>
                 <w:bCs/>
                 <w:sz w:val="24"/>
@@ -11347,7 +11429,7 @@
             <w:proofErr w:type="spellEnd"/>
             <w:r>
               <w:rPr>
-                <w:rFonts w:asciiTheme="minorHAnsi" w:eastAsiaTheme="minorEastAsia" w:hAnsiTheme="minorHAnsi" w:cstheme="minorBidi"/>
+                <w:rFonts w:asciiTheme="minorHAnsi" w:eastAsiaTheme="minorEastAsia" w:hAnsiTheme="minorHAnsi" w:cstheme="minorBidi" w:ascii="Calibri" w:hAnsi="Calibri" w:eastAsia="Calibri" w:cs="Calibri"/>
                 <w:b/>
                 <w:bCs/>
                 <w:sz w:val="24"/>
@@ -11370,7 +11452,7 @@
             </w:pPr>
             <w:r>
               <w:rPr>
-                <w:rFonts w:asciiTheme="minorHAnsi" w:eastAsiaTheme="minorEastAsia" w:hAnsiTheme="minorHAnsi" w:cstheme="minorBidi"/>
+                <w:rFonts w:asciiTheme="minorHAnsi" w:eastAsiaTheme="minorEastAsia" w:hAnsiTheme="minorHAnsi" w:cstheme="minorBidi" w:ascii="Calibri" w:hAnsi="Calibri" w:eastAsia="Calibri" w:cs="Calibri"/>
                 <w:b/>
                 <w:bCs/>
                 <w:sz w:val="24"/>
@@ -11393,7 +11475,7 @@
             </w:pPr>
             <w:r>
               <w:rPr>
-                <w:rFonts w:asciiTheme="minorHAnsi" w:eastAsiaTheme="minorEastAsia" w:hAnsiTheme="minorHAnsi" w:cstheme="minorBidi"/>
+                <w:rFonts w:asciiTheme="minorHAnsi" w:eastAsiaTheme="minorEastAsia" w:hAnsiTheme="minorHAnsi" w:cstheme="minorBidi" w:ascii="Calibri" w:hAnsi="Calibri" w:eastAsia="Calibri" w:cs="Calibri"/>
                 <w:b/>
                 <w:bCs/>
                 <w:sz w:val="24"/>
@@ -11406,7 +11488,7 @@
             <w:proofErr w:type="spellStart"/>
             <w:r>
               <w:rPr>
-                <w:rFonts w:asciiTheme="minorHAnsi" w:eastAsiaTheme="minorEastAsia" w:hAnsiTheme="minorHAnsi" w:cstheme="minorBidi"/>
+                <w:rFonts w:asciiTheme="minorHAnsi" w:eastAsiaTheme="minorEastAsia" w:hAnsiTheme="minorHAnsi" w:cstheme="minorBidi" w:ascii="Calibri" w:hAnsi="Calibri" w:eastAsia="Calibri" w:cs="Calibri"/>
                 <w:b/>
                 <w:bCs/>
                 <w:sz w:val="24"/>
@@ -11418,7 +11500,7 @@
             <w:proofErr w:type="spellEnd"/>
             <w:r>
               <w:rPr>
-                <w:rFonts w:asciiTheme="minorHAnsi" w:eastAsiaTheme="minorEastAsia" w:hAnsiTheme="minorHAnsi" w:cstheme="minorBidi"/>
+                <w:rFonts w:asciiTheme="minorHAnsi" w:eastAsiaTheme="minorEastAsia" w:hAnsiTheme="minorHAnsi" w:cstheme="minorBidi" w:ascii="Calibri" w:hAnsi="Calibri" w:eastAsia="Calibri" w:cs="Calibri"/>
                 <w:b/>
                 <w:bCs/>
                 <w:sz w:val="24"/>
@@ -11430,7 +11512,7 @@
             <w:proofErr w:type="spellStart"/>
             <w:r>
               <w:rPr>
-                <w:rFonts w:asciiTheme="minorHAnsi" w:eastAsiaTheme="minorEastAsia" w:hAnsiTheme="minorHAnsi" w:cstheme="minorBidi"/>
+                <w:rFonts w:asciiTheme="minorHAnsi" w:eastAsiaTheme="minorEastAsia" w:hAnsiTheme="minorHAnsi" w:cstheme="minorBidi" w:ascii="Calibri" w:hAnsi="Calibri" w:eastAsia="Calibri" w:cs="Calibri"/>
                 <w:b/>
                 <w:bCs/>
                 <w:sz w:val="24"/>
@@ -11442,7 +11524,7 @@
             <w:proofErr w:type="spellEnd"/>
             <w:r>
               <w:rPr>
-                <w:rFonts w:asciiTheme="minorHAnsi" w:eastAsiaTheme="minorEastAsia" w:hAnsiTheme="minorHAnsi" w:cstheme="minorBidi"/>
+                <w:rFonts w:asciiTheme="minorHAnsi" w:eastAsiaTheme="minorEastAsia" w:hAnsiTheme="minorHAnsi" w:cstheme="minorBidi" w:ascii="Calibri" w:hAnsi="Calibri" w:eastAsia="Calibri" w:cs="Calibri"/>
                 <w:b/>
                 <w:bCs/>
                 <w:sz w:val="24"/>
@@ -11454,7 +11536,7 @@
             <w:proofErr w:type="spellStart"/>
             <w:r>
               <w:rPr>
-                <w:rFonts w:asciiTheme="minorHAnsi" w:eastAsiaTheme="minorEastAsia" w:hAnsiTheme="minorHAnsi" w:cstheme="minorBidi"/>
+                <w:rFonts w:asciiTheme="minorHAnsi" w:eastAsiaTheme="minorEastAsia" w:hAnsiTheme="minorHAnsi" w:cstheme="minorBidi" w:ascii="Calibri" w:hAnsi="Calibri" w:eastAsia="Calibri" w:cs="Calibri"/>
                 <w:b/>
                 <w:bCs/>
                 <w:sz w:val="24"/>
@@ -11466,7 +11548,7 @@
             <w:proofErr w:type="spellEnd"/>
             <w:r>
               <w:rPr>
-                <w:rFonts w:asciiTheme="minorHAnsi" w:eastAsiaTheme="minorEastAsia" w:hAnsiTheme="minorHAnsi" w:cstheme="minorBidi"/>
+                <w:rFonts w:asciiTheme="minorHAnsi" w:eastAsiaTheme="minorEastAsia" w:hAnsiTheme="minorHAnsi" w:cstheme="minorBidi" w:ascii="Calibri" w:hAnsi="Calibri" w:eastAsia="Calibri" w:cs="Calibri"/>
                 <w:b/>
                 <w:bCs/>
                 <w:sz w:val="24"/>
@@ -11489,7 +11571,7 @@
             </w:pPr>
             <w:r>
               <w:rPr>
-                <w:rFonts w:asciiTheme="minorHAnsi" w:eastAsiaTheme="minorEastAsia" w:hAnsiTheme="minorHAnsi" w:cstheme="minorBidi"/>
+                <w:rFonts w:asciiTheme="minorHAnsi" w:eastAsiaTheme="minorEastAsia" w:hAnsiTheme="minorHAnsi" w:cstheme="minorBidi" w:ascii="Calibri" w:hAnsi="Calibri" w:eastAsia="Calibri" w:cs="Calibri"/>
                 <w:b/>
                 <w:bCs/>
                 <w:sz w:val="24"/>
@@ -11512,7 +11594,7 @@
             </w:pPr>
             <w:r>
               <w:rPr>
-                <w:rFonts w:asciiTheme="minorHAnsi" w:eastAsiaTheme="minorEastAsia" w:hAnsiTheme="minorHAnsi" w:cstheme="minorBidi"/>
+                <w:rFonts w:asciiTheme="minorHAnsi" w:eastAsiaTheme="minorEastAsia" w:hAnsiTheme="minorHAnsi" w:cstheme="minorBidi" w:ascii="Calibri" w:hAnsi="Calibri" w:eastAsia="Calibri" w:cs="Calibri"/>
                 <w:b/>
                 <w:bCs/>
                 <w:sz w:val="24"/>
@@ -11535,7 +11617,7 @@
             </w:pPr>
             <w:r>
               <w:rPr>
-                <w:rFonts w:asciiTheme="minorHAnsi" w:eastAsiaTheme="minorEastAsia" w:hAnsiTheme="minorHAnsi" w:cstheme="minorBidi"/>
+                <w:rFonts w:asciiTheme="minorHAnsi" w:eastAsiaTheme="minorEastAsia" w:hAnsiTheme="minorHAnsi" w:cstheme="minorBidi" w:ascii="Calibri" w:hAnsi="Calibri" w:eastAsia="Calibri" w:cs="Calibri"/>
                 <w:b/>
                 <w:bCs/>
                 <w:sz w:val="24"/>
@@ -11558,7 +11640,7 @@
             </w:pPr>
             <w:r>
               <w:rPr>
-                <w:rFonts w:asciiTheme="minorHAnsi" w:eastAsiaTheme="minorEastAsia" w:hAnsiTheme="minorHAnsi" w:cstheme="minorBidi"/>
+                <w:rFonts w:asciiTheme="minorHAnsi" w:eastAsiaTheme="minorEastAsia" w:hAnsiTheme="minorHAnsi" w:cstheme="minorBidi" w:ascii="Calibri" w:hAnsi="Calibri" w:eastAsia="Calibri" w:cs="Calibri"/>
                 <w:b/>
                 <w:bCs/>
                 <w:sz w:val="24"/>
@@ -11599,7 +11681,7 @@
             </w:pPr>
             <w:r>
               <w:rPr>
-                <w:rFonts w:asciiTheme="minorHAnsi" w:eastAsiaTheme="minorEastAsia" w:hAnsiTheme="minorHAnsi" w:cstheme="minorBidi"/>
+                <w:rFonts w:asciiTheme="minorHAnsi" w:eastAsiaTheme="minorEastAsia" w:hAnsiTheme="minorHAnsi" w:cstheme="minorBidi" w:ascii="Calibri" w:hAnsi="Calibri" w:eastAsia="Calibri" w:cs="Calibri"/>
                 <w:b/>
                 <w:bCs/>
                 <w:sz w:val="24"/>
@@ -11620,7 +11702,7 @@
             </w:pPr>
             <w:r>
               <w:rPr>
-                <w:rFonts w:asciiTheme="minorHAnsi" w:eastAsiaTheme="minorEastAsia" w:hAnsiTheme="minorHAnsi" w:cstheme="minorBidi"/>
+                <w:rFonts w:asciiTheme="minorHAnsi" w:eastAsiaTheme="minorEastAsia" w:hAnsiTheme="minorHAnsi" w:cstheme="minorBidi" w:ascii="Calibri" w:hAnsi="Calibri" w:eastAsia="Calibri" w:cs="Calibri"/>
                 <w:b/>
                 <w:bCs/>
                 <w:sz w:val="24"/>
@@ -11641,7 +11723,7 @@
             </w:pPr>
             <w:r>
               <w:rPr>
-                <w:rFonts w:asciiTheme="minorHAnsi" w:eastAsiaTheme="minorEastAsia" w:hAnsiTheme="minorHAnsi" w:cstheme="minorBidi"/>
+                <w:rFonts w:asciiTheme="minorHAnsi" w:eastAsiaTheme="minorEastAsia" w:hAnsiTheme="minorHAnsi" w:cstheme="minorBidi" w:ascii="Calibri" w:hAnsi="Calibri" w:eastAsia="Calibri" w:cs="Calibri"/>
                 <w:sz w:val="24"/>
                 <w:szCs w:val="24"/>
                 <w:lang w:val="es-CL" w:eastAsia="es-CL"/>
@@ -11660,7 +11742,7 @@
             </w:pPr>
             <w:r>
               <w:rPr>
-                <w:rFonts w:asciiTheme="minorHAnsi" w:eastAsiaTheme="minorEastAsia" w:hAnsiTheme="minorHAnsi" w:cstheme="minorBidi"/>
+                <w:rFonts w:asciiTheme="minorHAnsi" w:eastAsiaTheme="minorEastAsia" w:hAnsiTheme="minorHAnsi" w:cstheme="minorBidi" w:ascii="Calibri" w:hAnsi="Calibri" w:eastAsia="Calibri" w:cs="Calibri"/>
                 <w:sz w:val="24"/>
                 <w:szCs w:val="24"/>
                 <w:lang w:val="es-CL" w:eastAsia="es-CL"/>
@@ -11670,7 +11752,7 @@
             <w:proofErr w:type="spellStart"/>
             <w:r>
               <w:rPr>
-                <w:rFonts w:asciiTheme="minorHAnsi" w:eastAsiaTheme="minorEastAsia" w:hAnsiTheme="minorHAnsi" w:cstheme="minorBidi"/>
+                <w:rFonts w:asciiTheme="minorHAnsi" w:eastAsiaTheme="minorEastAsia" w:hAnsiTheme="minorHAnsi" w:cstheme="minorBidi" w:ascii="Calibri" w:hAnsi="Calibri" w:eastAsia="Calibri" w:cs="Calibri"/>
                 <w:sz w:val="24"/>
                 <w:szCs w:val="24"/>
                 <w:lang w:val="es-CL" w:eastAsia="es-CL"/>
@@ -11680,7 +11762,7 @@
             <w:proofErr w:type="spellEnd"/>
             <w:r>
               <w:rPr>
-                <w:rFonts w:asciiTheme="minorHAnsi" w:eastAsiaTheme="minorEastAsia" w:hAnsiTheme="minorHAnsi" w:cstheme="minorBidi"/>
+                <w:rFonts w:asciiTheme="minorHAnsi" w:eastAsiaTheme="minorEastAsia" w:hAnsiTheme="minorHAnsi" w:cstheme="minorBidi" w:ascii="Calibri" w:hAnsi="Calibri" w:eastAsia="Calibri" w:cs="Calibri"/>
                 <w:sz w:val="24"/>
                 <w:szCs w:val="24"/>
                 <w:lang w:val="es-CL" w:eastAsia="es-CL"/>
@@ -11699,7 +11781,7 @@
             </w:pPr>
             <w:r>
               <w:rPr>
-                <w:rFonts w:asciiTheme="minorHAnsi" w:eastAsiaTheme="minorEastAsia" w:hAnsiTheme="minorHAnsi" w:cstheme="minorBidi"/>
+                <w:rFonts w:asciiTheme="minorHAnsi" w:eastAsiaTheme="minorEastAsia" w:hAnsiTheme="minorHAnsi" w:cstheme="minorBidi" w:ascii="Calibri" w:hAnsi="Calibri" w:eastAsia="Calibri" w:cs="Calibri"/>
                 <w:sz w:val="24"/>
                 <w:szCs w:val="24"/>
                 <w:lang w:val="es-CL" w:eastAsia="es-CL"/>
@@ -11718,7 +11800,7 @@
             </w:pPr>
             <w:r>
               <w:rPr>
-                <w:rFonts w:asciiTheme="minorHAnsi" w:eastAsiaTheme="minorEastAsia" w:hAnsiTheme="minorHAnsi" w:cstheme="minorBidi"/>
+                <w:rFonts w:asciiTheme="minorHAnsi" w:eastAsiaTheme="minorEastAsia" w:hAnsiTheme="minorHAnsi" w:cstheme="minorBidi" w:ascii="Calibri" w:hAnsi="Calibri" w:eastAsia="Calibri" w:cs="Calibri"/>
                 <w:b/>
                 <w:bCs/>
                 <w:sz w:val="24"/>
@@ -11739,7 +11821,7 @@
             </w:pPr>
             <w:r>
               <w:rPr>
-                <w:rFonts w:asciiTheme="minorHAnsi" w:eastAsiaTheme="minorEastAsia" w:hAnsiTheme="minorHAnsi" w:cstheme="minorBidi"/>
+                <w:rFonts w:asciiTheme="minorHAnsi" w:eastAsiaTheme="minorEastAsia" w:hAnsiTheme="minorHAnsi" w:cstheme="minorBidi" w:ascii="Calibri" w:hAnsi="Calibri" w:eastAsia="Calibri" w:cs="Calibri"/>
                 <w:sz w:val="24"/>
                 <w:szCs w:val="24"/>
                 <w:lang w:val="es-CL" w:eastAsia="es-CL"/>
@@ -11759,7 +11841,7 @@
             </w:pPr>
             <w:r>
               <w:rPr>
-                <w:rFonts w:asciiTheme="minorHAnsi" w:eastAsiaTheme="minorEastAsia" w:hAnsiTheme="minorHAnsi" w:cstheme="minorBidi"/>
+                <w:rFonts w:asciiTheme="minorHAnsi" w:eastAsiaTheme="minorEastAsia" w:hAnsiTheme="minorHAnsi" w:cstheme="minorBidi" w:ascii="Calibri" w:hAnsi="Calibri" w:eastAsia="Calibri" w:cs="Calibri"/>
                 <w:sz w:val="24"/>
                 <w:szCs w:val="24"/>
                 <w:lang w:val="es-CL" w:eastAsia="es-CL"/>
@@ -11778,7 +11860,7 @@
             </w:pPr>
             <w:r>
               <w:rPr>
-                <w:rFonts w:asciiTheme="minorHAnsi" w:eastAsiaTheme="minorEastAsia" w:hAnsiTheme="minorHAnsi" w:cstheme="minorBidi"/>
+                <w:rFonts w:asciiTheme="minorHAnsi" w:eastAsiaTheme="minorEastAsia" w:hAnsiTheme="minorHAnsi" w:cstheme="minorBidi" w:ascii="Calibri" w:hAnsi="Calibri" w:eastAsia="Calibri" w:cs="Calibri"/>
                 <w:sz w:val="24"/>
                 <w:szCs w:val="24"/>
                 <w:lang w:val="es-CL" w:eastAsia="es-CL"/>
@@ -11797,7 +11879,7 @@
             </w:pPr>
             <w:r>
               <w:rPr>
-                <w:rFonts w:asciiTheme="minorHAnsi" w:eastAsiaTheme="minorEastAsia" w:hAnsiTheme="minorHAnsi" w:cstheme="minorBidi"/>
+                <w:rFonts w:asciiTheme="minorHAnsi" w:eastAsiaTheme="minorEastAsia" w:hAnsiTheme="minorHAnsi" w:cstheme="minorBidi" w:ascii="Calibri" w:hAnsi="Calibri" w:eastAsia="Calibri" w:cs="Calibri"/>
                 <w:b/>
                 <w:bCs/>
                 <w:sz w:val="24"/>
@@ -11818,7 +11900,7 @@
             </w:pPr>
             <w:r>
               <w:rPr>
-                <w:rFonts w:asciiTheme="minorHAnsi" w:eastAsiaTheme="minorEastAsia" w:hAnsiTheme="minorHAnsi" w:cstheme="minorBidi"/>
+                <w:rFonts w:asciiTheme="minorHAnsi" w:eastAsiaTheme="minorEastAsia" w:hAnsiTheme="minorHAnsi" w:cstheme="minorBidi" w:ascii="Calibri" w:hAnsi="Calibri" w:eastAsia="Calibri" w:cs="Calibri"/>
                 <w:sz w:val="24"/>
                 <w:szCs w:val="24"/>
                 <w:lang w:val="es-CL" w:eastAsia="es-CL"/>
@@ -11837,7 +11919,7 @@
             </w:pPr>
             <w:r>
               <w:rPr>
-                <w:rFonts w:asciiTheme="minorHAnsi" w:eastAsiaTheme="minorEastAsia" w:hAnsiTheme="minorHAnsi" w:cstheme="minorBidi"/>
+                <w:rFonts w:asciiTheme="minorHAnsi" w:eastAsiaTheme="minorEastAsia" w:hAnsiTheme="minorHAnsi" w:cstheme="minorBidi" w:ascii="Calibri" w:hAnsi="Calibri" w:eastAsia="Calibri" w:cs="Calibri"/>
                 <w:sz w:val="24"/>
                 <w:szCs w:val="24"/>
                 <w:lang w:val="es-CL" w:eastAsia="es-CL"/>
@@ -11856,7 +11938,7 @@
             </w:pPr>
             <w:r>
               <w:rPr>
-                <w:rFonts w:asciiTheme="minorHAnsi" w:eastAsiaTheme="minorEastAsia" w:hAnsiTheme="minorHAnsi" w:cstheme="minorBidi"/>
+                <w:rFonts w:asciiTheme="minorHAnsi" w:eastAsiaTheme="minorEastAsia" w:hAnsiTheme="minorHAnsi" w:cstheme="minorBidi" w:ascii="Calibri" w:hAnsi="Calibri" w:eastAsia="Calibri" w:cs="Calibri"/>
                 <w:sz w:val="24"/>
                 <w:szCs w:val="24"/>
                 <w:lang w:val="es-CL" w:eastAsia="es-CL"/>
@@ -11902,7 +11984,7 @@
             </w:pPr>
             <w:r>
               <w:rPr>
-                <w:rFonts w:eastAsiaTheme="minorEastAsia"/>
+                <w:rFonts w:eastAsiaTheme="minorEastAsia" w:ascii="Calibri" w:hAnsi="Calibri" w:eastAsia="Calibri" w:cs="Calibri"/>
                 <w:lang w:val="es-CL" w:eastAsia="es-CL"/>
               </w:rPr>
               <w:t>9. Referencias</w:t>
@@ -11919,7 +12001,7 @@
             </w:pPr>
             <w:r>
               <w:rPr>
-                <w:rFonts w:asciiTheme="minorHAnsi" w:eastAsiaTheme="minorEastAsia" w:hAnsiTheme="minorHAnsi" w:cstheme="minorBidi"/>
+                <w:rFonts w:asciiTheme="minorHAnsi" w:eastAsiaTheme="minorEastAsia" w:hAnsiTheme="minorHAnsi" w:cstheme="minorBidi" w:ascii="Calibri" w:hAnsi="Calibri" w:eastAsia="Calibri" w:cs="Calibri"/>
                 <w:sz w:val="24"/>
                 <w:szCs w:val="24"/>
                 <w:lang w:val="es-CL" w:eastAsia="es-CL"/>

</xml_diff>